<commit_message>
fix: tugas 2 stsi4303 revisi
</commit_message>
<xml_diff>
--- a/pemrograman-mobile-stsi4303/Laporan Tugas 2 Pemrograman Berbasis Perangkat Bergerak (STSI4303).docx
+++ b/pemrograman-mobile-stsi4303/Laporan Tugas 2 Pemrograman Berbasis Perangkat Bergerak (STSI4303).docx
@@ -659,44 +659,7 @@
         <w:rPr>
           <w:rFonts w:ascii="Times New Roman" w:hAnsi="Times New Roman" w:cs="Times New Roman" w:eastAsia="Times New Roman"/>
         </w:rPr>
-        <w:t xml:space="preserve">Aplikasi dibuat sebagai satu file </w:t>
-      </w:r>
-      <w:r>
-        <w:rPr>
-          <w:rFonts w:ascii="Courier New" w:hAnsi="Courier New" w:cs="Courier New" w:eastAsia="Courier New"/>
-        </w:rPr>
-        <w:t xml:space="preserve">index.html</w:t>
-      </w:r>
-      <w:r>
-        <w:rPr>
-          <w:rFonts w:ascii="Times New Roman" w:hAnsi="Times New Roman" w:cs="Times New Roman" w:eastAsia="Times New Roman"/>
-        </w:rPr>
-        <w:t xml:space="preserve"> memakai </w:t>
-      </w:r>
-      <w:r>
-        <w:rPr>
-          <w:rFonts w:ascii="Times New Roman" w:hAnsi="Times New Roman" w:cs="Times New Roman" w:eastAsia="Times New Roman"/>
-          <w:b/>
-        </w:rPr>
-        <w:t xml:space="preserve">Vue 3 via CDN</w:t>
-      </w:r>
-      <w:r>
-        <w:rPr>
-          <w:rFonts w:ascii="Times New Roman" w:hAnsi="Times New Roman" w:cs="Times New Roman" w:eastAsia="Times New Roman"/>
-        </w:rPr>
-        <w:t xml:space="preserve"> (Composition API dengan </w:t>
-      </w:r>
-      <w:r>
-        <w:rPr>
-          <w:rFonts w:ascii="Courier New" w:hAnsi="Courier New" w:cs="Courier New" w:eastAsia="Courier New"/>
-        </w:rPr>
-        <w:t xml:space="preserve">setup()</w:t>
-      </w:r>
-      <w:r>
-        <w:rPr>
-          <w:rFonts w:ascii="Times New Roman" w:hAnsi="Times New Roman" w:cs="Times New Roman" w:eastAsia="Times New Roman"/>
-        </w:rPr>
-        <w:t xml:space="preserve">), ditulis di VS Code. Tidak perlu install atau build tool: file cukup dibuka di browser (double-click atau Live Server di VS Code). Supaya tampil seperti aplikasi HP, halaman dibuka dengan DevTools &gt; Toggle device toolbar, lalu dipilih ukuran layar HP. Lebar tampilan dibatasi 480px sehingga nyaman di layar mobile.</w:t>
+        <w:t>Aplikasi dibuat sebagai project Ionic Framework dengan Vue 3 (Composition API, &lt;script setup&gt;, TypeScript), ditulis di VS Code, di folder tugas-2/cuaca-ionic. Ionic menyediakan komponen UI bergaya aplikasi native (header, segment/tab, list, card, badge, pull-to-refresh) sehingga tampilan terasa seperti aplikasi HP. Project dibuat dengan Ionic CLI, yang otomatis menyiapkan Vue 3, Vite, TypeScript, dan Capacitor untuk build ke Android.</w:t>
       </w:r>
     </w:p>
     <w:tbl>
@@ -764,22 +727,22 @@
               <w:rPr>
                 <w:rFonts w:ascii="Times New Roman" w:hAnsi="Times New Roman" w:cs="Times New Roman" w:eastAsia="Times New Roman"/>
               </w:rPr>
-              <w:t xml:space="preserve">Bahasa</w:t>
-            </w:r>
-          </w:p>
-        </w:tc>
-        <w:tc>
-          <w:tcPr/>
-          <w:p>
-            <w:pPr>
-              <w:keepNext/>
-              <w:spacing w:after="0"/>
-            </w:pPr>
-            <w:r>
-              <w:rPr>
-                <w:rFonts w:ascii="Times New Roman" w:hAnsi="Times New Roman" w:cs="Times New Roman" w:eastAsia="Times New Roman"/>
-              </w:rPr>
-              <w:t xml:space="preserve">HTML, CSS, JavaScript</w:t>
+              <w:t>Bahasa</w:t>
+            </w:r>
+          </w:p>
+        </w:tc>
+        <w:tc>
+          <w:tcPr/>
+          <w:p>
+            <w:pPr>
+              <w:keepNext/>
+              <w:spacing w:after="0"/>
+            </w:pPr>
+            <w:r>
+              <w:rPr>
+                <w:rFonts w:ascii="Times New Roman" w:hAnsi="Times New Roman" w:cs="Times New Roman" w:eastAsia="Times New Roman"/>
+              </w:rPr>
+              <w:t>TypeScript, HTML (template Vue), CSS</w:t>
             </w:r>
           </w:p>
         </w:tc>
@@ -796,34 +759,22 @@
               <w:rPr>
                 <w:rFonts w:ascii="Times New Roman" w:hAnsi="Times New Roman" w:cs="Times New Roman" w:eastAsia="Times New Roman"/>
               </w:rPr>
-              <w:t xml:space="preserve">Framework</w:t>
-            </w:r>
-          </w:p>
-        </w:tc>
-        <w:tc>
-          <w:tcPr/>
-          <w:p>
-            <w:pPr>
-              <w:keepNext/>
-              <w:spacing w:after="0"/>
-            </w:pPr>
-            <w:r>
-              <w:rPr>
-                <w:rFonts w:ascii="Times New Roman" w:hAnsi="Times New Roman" w:cs="Times New Roman" w:eastAsia="Times New Roman"/>
-              </w:rPr>
-              <w:t xml:space="preserve">Vue 3 (</w:t>
-            </w:r>
-            <w:r>
-              <w:rPr>
-                <w:rFonts w:ascii="Courier New" w:hAnsi="Courier New" w:cs="Courier New" w:eastAsia="Courier New"/>
-              </w:rPr>
-              <w:t xml:space="preserve">vue.global.prod.js</w:t>
-            </w:r>
-            <w:r>
-              <w:rPr>
-                <w:rFonts w:ascii="Times New Roman" w:hAnsi="Times New Roman" w:cs="Times New Roman" w:eastAsia="Times New Roman"/>
-              </w:rPr>
-              <w:t xml:space="preserve"> dari unpkg CDN)</w:t>
+              <w:t>Framework</w:t>
+            </w:r>
+          </w:p>
+        </w:tc>
+        <w:tc>
+          <w:tcPr/>
+          <w:p>
+            <w:pPr>
+              <w:keepNext/>
+              <w:spacing w:after="0"/>
+            </w:pPr>
+            <w:r>
+              <w:rPr>
+                <w:rFonts w:ascii="Times New Roman" w:hAnsi="Times New Roman" w:cs="Times New Roman" w:eastAsia="Times New Roman"/>
+              </w:rPr>
+              <w:t>Ionic Framework + Vue 3 (@ionic/vue), build tool Vite, Capacitor untuk Android</w:t>
             </w:r>
           </w:p>
         </w:tc>
@@ -840,28 +791,22 @@
               <w:rPr>
                 <w:rFonts w:ascii="Times New Roman" w:hAnsi="Times New Roman" w:cs="Times New Roman" w:eastAsia="Times New Roman"/>
               </w:rPr>
-              <w:t xml:space="preserve">Sumber data</w:t>
-            </w:r>
-          </w:p>
-        </w:tc>
-        <w:tc>
-          <w:tcPr/>
-          <w:p>
-            <w:pPr>
-              <w:keepNext/>
-              <w:spacing w:after="0"/>
-            </w:pPr>
-            <w:r>
-              <w:rPr>
-                <w:rFonts w:ascii="Times New Roman" w:hAnsi="Times New Roman" w:cs="Times New Roman" w:eastAsia="Times New Roman"/>
-              </w:rPr>
-              <w:t xml:space="preserve">Open-Meteo Forecast API (JSON), ditambah parameter </w:t>
-            </w:r>
-            <w:r>
-              <w:rPr>
-                <w:rFonts w:ascii="Courier New" w:hAnsi="Courier New" w:cs="Courier New" w:eastAsia="Courier New"/>
-              </w:rPr>
-              <w:t xml:space="preserve">timezone=Asia/Jakarta</w:t>
+              <w:t>Sumber data</w:t>
+            </w:r>
+          </w:p>
+        </w:tc>
+        <w:tc>
+          <w:tcPr/>
+          <w:p>
+            <w:pPr>
+              <w:keepNext/>
+              <w:spacing w:after="0"/>
+            </w:pPr>
+            <w:r>
+              <w:rPr>
+                <w:rFonts w:ascii="Times New Roman" w:hAnsi="Times New Roman" w:cs="Times New Roman" w:eastAsia="Times New Roman"/>
+              </w:rPr>
+              <w:t>Open-Meteo Forecast API (JSON), ditambah parameter timezone=Asia/Jakarta</w:t>
             </w:r>
           </w:p>
         </w:tc>
@@ -877,7 +822,7 @@
               <w:rPr>
                 <w:rFonts w:ascii="Times New Roman" w:hAnsi="Times New Roman" w:cs="Times New Roman" w:eastAsia="Times New Roman"/>
               </w:rPr>
-              <w:t xml:space="preserve">File</w:t>
+              <w:t>File utama</w:t>
             </w:r>
           </w:p>
         </w:tc>
@@ -891,13 +836,7 @@
               <w:rPr>
                 <w:rFonts w:ascii="Courier New" w:hAnsi="Courier New" w:cs="Courier New" w:eastAsia="Courier New"/>
               </w:rPr>
-              <w:t xml:space="preserve">tugas-2/index.html</w:t>
-            </w:r>
-            <w:r>
-              <w:rPr>
-                <w:rFonts w:ascii="Times New Roman" w:hAnsi="Times New Roman" w:cs="Times New Roman" w:eastAsia="Times New Roman"/>
-              </w:rPr>
-              <w:t xml:space="preserve"> (136 baris: template, CSS, dan script dalam satu file)</w:t>
+              <w:t>src/services/cuaca.ts (ambil data API) dan src/views/HomePage.vue (tampilan halaman)</w:t>
             </w:r>
           </w:p>
         </w:tc>
@@ -917,1787 +856,73 @@
         <w:rPr>
           <w:rFonts w:ascii="Times New Roman" w:hAnsi="Times New Roman" w:cs="Times New Roman" w:eastAsia="Times New Roman"/>
         </w:rPr>
-        <w:t xml:space="preserve">Kode lengkap </w:t>
-      </w:r>
-      <w:r>
-        <w:rPr>
-          <w:rFonts w:ascii="Courier New" w:hAnsi="Courier New" w:cs="Courier New" w:eastAsia="Courier New"/>
-        </w:rPr>
-        <w:t xml:space="preserve">index.html</w:t>
-      </w:r>
-      <w:r>
-        <w:rPr>
-          <w:rFonts w:ascii="Times New Roman" w:hAnsi="Times New Roman" w:cs="Times New Roman" w:eastAsia="Times New Roman"/>
-        </w:rPr>
-        <w:t xml:space="preserve">:</w:t>
-      </w:r>
-    </w:p>
-    <w:p>
-      <w:pPr>
-        <w:spacing w:after="0"/>
-        <w:shd w:val="clear" w:color="auto" w:fill="F2F2F2"/>
-      </w:pPr>
-      <w:r>
-        <w:rPr>
-          <w:rFonts w:ascii="Courier New" w:hAnsi="Courier New" w:cs="Courier New" w:eastAsia="Courier New"/>
-          <w:sz w:val="16"/>
-        </w:rPr>
-        <w:t xml:space="preserve">&lt;!DOCTYPE html&gt;</w:t>
-      </w:r>
-    </w:p>
-    <w:p>
-      <w:pPr>
-        <w:spacing w:after="0"/>
-        <w:shd w:val="clear" w:color="auto" w:fill="F2F2F2"/>
-      </w:pPr>
-      <w:r>
-        <w:rPr>
-          <w:rFonts w:ascii="Courier New" w:hAnsi="Courier New" w:cs="Courier New" w:eastAsia="Courier New"/>
-          <w:sz w:val="16"/>
-        </w:rPr>
-        <w:t xml:space="preserve">&lt;html lang="id"&gt;</w:t>
-      </w:r>
-    </w:p>
-    <w:p>
-      <w:pPr>
-        <w:spacing w:after="0"/>
-        <w:shd w:val="clear" w:color="auto" w:fill="F2F2F2"/>
-      </w:pPr>
-      <w:r>
-        <w:rPr>
-          <w:rFonts w:ascii="Courier New" w:hAnsi="Courier New" w:cs="Courier New" w:eastAsia="Courier New"/>
-          <w:sz w:val="16"/>
-        </w:rPr>
-        <w:t xml:space="preserve">&lt;head&gt;</w:t>
-      </w:r>
-    </w:p>
-    <w:p>
-      <w:pPr>
-        <w:spacing w:after="0"/>
-        <w:shd w:val="clear" w:color="auto" w:fill="F2F2F2"/>
-      </w:pPr>
-      <w:r>
-        <w:rPr>
-          <w:rFonts w:ascii="Courier New" w:hAnsi="Courier New" w:cs="Courier New" w:eastAsia="Courier New"/>
-          <w:sz w:val="16"/>
-        </w:rPr>
-        <w:t xml:space="preserve">  &lt;meta charset="UTF-8" /&gt;</w:t>
-      </w:r>
-    </w:p>
-    <w:p>
-      <w:pPr>
-        <w:spacing w:after="0"/>
-        <w:shd w:val="clear" w:color="auto" w:fill="F2F2F2"/>
-      </w:pPr>
-      <w:r>
-        <w:rPr>
-          <w:rFonts w:ascii="Courier New" w:hAnsi="Courier New" w:cs="Courier New" w:eastAsia="Courier New"/>
-          <w:sz w:val="16"/>
-        </w:rPr>
-        <w:t xml:space="preserve">  &lt;meta name="viewport" content="width=device-width, initial-scale=1.0" /&gt;</w:t>
-      </w:r>
-    </w:p>
-    <w:p>
-      <w:pPr>
-        <w:spacing w:after="0"/>
-        <w:shd w:val="clear" w:color="auto" w:fill="F2F2F2"/>
-      </w:pPr>
-      <w:r>
-        <w:rPr>
-          <w:rFonts w:ascii="Courier New" w:hAnsi="Courier New" w:cs="Courier New" w:eastAsia="Courier New"/>
-          <w:sz w:val="16"/>
-        </w:rPr>
-        <w:t xml:space="preserve">  &lt;title&gt;Cuaca Jakarta - Tugas 2 STSI4303&lt;/title&gt;</w:t>
-      </w:r>
-    </w:p>
-    <w:p>
-      <w:pPr>
-        <w:spacing w:after="0"/>
-        <w:shd w:val="clear" w:color="auto" w:fill="F2F2F2"/>
-      </w:pPr>
-      <w:r>
-        <w:rPr>
-          <w:rFonts w:ascii="Courier New" w:hAnsi="Courier New" w:cs="Courier New" w:eastAsia="Courier New"/>
-          <w:sz w:val="16"/>
-        </w:rPr>
-        <w:t xml:space="preserve">  &lt;!-- Vue 3 via CDN (embed) --&gt;</w:t>
-      </w:r>
-    </w:p>
-    <w:p>
-      <w:pPr>
-        <w:spacing w:after="0"/>
-        <w:shd w:val="clear" w:color="auto" w:fill="F2F2F2"/>
-      </w:pPr>
-      <w:r>
-        <w:rPr>
-          <w:rFonts w:ascii="Courier New" w:hAnsi="Courier New" w:cs="Courier New" w:eastAsia="Courier New"/>
-          <w:sz w:val="16"/>
-        </w:rPr>
-        <w:t xml:space="preserve">  &lt;script src="https://unpkg.com/vue@3/dist/vue.global.prod.js"&gt;&lt;/script&gt;</w:t>
-      </w:r>
-    </w:p>
-    <w:p>
-      <w:pPr>
-        <w:spacing w:after="0"/>
-        <w:shd w:val="clear" w:color="auto" w:fill="F2F2F2"/>
-      </w:pPr>
-      <w:r>
-        <w:rPr>
-          <w:rFonts w:ascii="Courier New" w:hAnsi="Courier New" w:cs="Courier New" w:eastAsia="Courier New"/>
-          <w:sz w:val="16"/>
-        </w:rPr>
-        <w:t xml:space="preserve">  &lt;style&gt;</w:t>
-      </w:r>
-    </w:p>
-    <w:p>
-      <w:pPr>
-        <w:spacing w:after="0"/>
-        <w:shd w:val="clear" w:color="auto" w:fill="F2F2F2"/>
-      </w:pPr>
-      <w:r>
-        <w:rPr>
-          <w:rFonts w:ascii="Courier New" w:hAnsi="Courier New" w:cs="Courier New" w:eastAsia="Courier New"/>
-          <w:sz w:val="16"/>
-        </w:rPr>
-        <w:t xml:space="preserve">    * { box-sizing: border-box; margin: 0; padding: 0; }</w:t>
-      </w:r>
-    </w:p>
-    <w:p>
-      <w:pPr>
-        <w:spacing w:after="0"/>
-        <w:shd w:val="clear" w:color="auto" w:fill="F2F2F2"/>
-      </w:pPr>
-      <w:r>
-        <w:rPr>
-          <w:rFonts w:ascii="Courier New" w:hAnsi="Courier New" w:cs="Courier New" w:eastAsia="Courier New"/>
-          <w:sz w:val="16"/>
-        </w:rPr>
-        <w:t xml:space="preserve">    body { font-family: system-ui, -apple-system, sans-serif; background: #eef3f8; color: #1f2937; }</w:t>
-      </w:r>
-    </w:p>
-    <w:p>
-      <w:pPr>
-        <w:spacing w:after="0"/>
-        <w:shd w:val="clear" w:color="auto" w:fill="F2F2F2"/>
-      </w:pPr>
-      <w:r>
-        <w:rPr>
-          <w:rFonts w:ascii="Courier New" w:hAnsi="Courier New" w:cs="Courier New" w:eastAsia="Courier New"/>
-          <w:sz w:val="16"/>
-        </w:rPr>
-        <w:t xml:space="preserve">    .app { max-width: 480px; margin: 0 auto; min-height: 100vh; background: #fff; }</w:t>
-      </w:r>
-    </w:p>
-    <w:p>
-      <w:pPr>
-        <w:spacing w:after="0"/>
-        <w:shd w:val="clear" w:color="auto" w:fill="F2F2F2"/>
-      </w:pPr>
-      <w:r>
-        <w:rPr>
-          <w:rFonts w:ascii="Courier New" w:hAnsi="Courier New" w:cs="Courier New" w:eastAsia="Courier New"/>
-          <w:sz w:val="16"/>
-        </w:rPr>
-        <w:t xml:space="preserve">    header { background: linear-gradient(135deg, #2563eb, #0ea5e9); color: #fff; padding: 20px 16px; }</w:t>
-      </w:r>
-    </w:p>
-    <w:p>
-      <w:pPr>
-        <w:spacing w:after="0"/>
-        <w:shd w:val="clear" w:color="auto" w:fill="F2F2F2"/>
-      </w:pPr>
-      <w:r>
-        <w:rPr>
-          <w:rFonts w:ascii="Courier New" w:hAnsi="Courier New" w:cs="Courier New" w:eastAsia="Courier New"/>
-          <w:sz w:val="16"/>
-        </w:rPr>
-        <w:t xml:space="preserve">    header h1 { font-size: 20px; }</w:t>
-      </w:r>
-    </w:p>
-    <w:p>
-      <w:pPr>
-        <w:spacing w:after="0"/>
-        <w:shd w:val="clear" w:color="auto" w:fill="F2F2F2"/>
-      </w:pPr>
-      <w:r>
-        <w:rPr>
-          <w:rFonts w:ascii="Courier New" w:hAnsi="Courier New" w:cs="Courier New" w:eastAsia="Courier New"/>
-          <w:sz w:val="16"/>
-        </w:rPr>
-        <w:t xml:space="preserve">    header p { font-size: 13px; opacity: .9; margin-top: 4px; }</w:t>
-      </w:r>
-    </w:p>
-    <w:p>
-      <w:pPr>
-        <w:spacing w:after="0"/>
-        <w:shd w:val="clear" w:color="auto" w:fill="F2F2F2"/>
-      </w:pPr>
-      <w:r>
-        <w:rPr>
-          <w:rFonts w:ascii="Courier New" w:hAnsi="Courier New" w:cs="Courier New" w:eastAsia="Courier New"/>
-          <w:sz w:val="16"/>
-        </w:rPr>
-        <w:t xml:space="preserve">    .summary { display: flex; gap: 8px; margin-top: 14px; }</w:t>
-      </w:r>
-    </w:p>
-    <w:p>
-      <w:pPr>
-        <w:spacing w:after="0"/>
-        <w:shd w:val="clear" w:color="auto" w:fill="F2F2F2"/>
-      </w:pPr>
-      <w:r>
-        <w:rPr>
-          <w:rFonts w:ascii="Courier New" w:hAnsi="Courier New" w:cs="Courier New" w:eastAsia="Courier New"/>
-          <w:sz w:val="16"/>
-        </w:rPr>
-        <w:t xml:space="preserve">    .card { flex: 1; background: rgba(255,255,255,.18); border-radius: 10px; padding: 8px; text-align: center; }</w:t>
-      </w:r>
-    </w:p>
-    <w:p>
-      <w:pPr>
-        <w:spacing w:after="0"/>
-        <w:shd w:val="clear" w:color="auto" w:fill="F2F2F2"/>
-      </w:pPr>
-      <w:r>
-        <w:rPr>
-          <w:rFonts w:ascii="Courier New" w:hAnsi="Courier New" w:cs="Courier New" w:eastAsia="Courier New"/>
-          <w:sz w:val="16"/>
-        </w:rPr>
-        <w:t xml:space="preserve">    .card small { font-size: 11px; display: block; opacity: .9; }</w:t>
-      </w:r>
-    </w:p>
-    <w:p>
-      <w:pPr>
-        <w:spacing w:after="0"/>
-        <w:shd w:val="clear" w:color="auto" w:fill="F2F2F2"/>
-      </w:pPr>
-      <w:r>
-        <w:rPr>
-          <w:rFonts w:ascii="Courier New" w:hAnsi="Courier New" w:cs="Courier New" w:eastAsia="Courier New"/>
-          <w:sz w:val="16"/>
-        </w:rPr>
-        <w:t xml:space="preserve">    .card b { font-size: 18px; }</w:t>
-      </w:r>
-    </w:p>
-    <w:p>
-      <w:pPr>
-        <w:spacing w:after="0"/>
-        <w:shd w:val="clear" w:color="auto" w:fill="F2F2F2"/>
-      </w:pPr>
-      <w:r>
-        <w:rPr>
-          <w:rFonts w:ascii="Courier New" w:hAnsi="Courier New" w:cs="Courier New" w:eastAsia="Courier New"/>
-          <w:sz w:val="16"/>
-        </w:rPr>
-        <w:t xml:space="preserve">    .days { display: flex; gap: 6px; overflow-x: auto; padding: 12px 16px; border-bottom: 1px solid #e5e7eb; scrollbar-width: none; }</w:t>
-      </w:r>
-    </w:p>
-    <w:p>
-      <w:pPr>
-        <w:spacing w:after="0"/>
-        <w:shd w:val="clear" w:color="auto" w:fill="F2F2F2"/>
-      </w:pPr>
-      <w:r>
-        <w:rPr>
-          <w:rFonts w:ascii="Courier New" w:hAnsi="Courier New" w:cs="Courier New" w:eastAsia="Courier New"/>
-          <w:sz w:val="16"/>
-        </w:rPr>
-        <w:t xml:space="preserve">    .days button { border: 1px solid #cbd5e1; background: #fff; border-radius: 999px; padding: 6px 12px; font-size: 13px; white-space: nowrap; cursor: pointer; }</w:t>
-      </w:r>
-    </w:p>
-    <w:p>
-      <w:pPr>
-        <w:spacing w:after="0"/>
-        <w:shd w:val="clear" w:color="auto" w:fill="F2F2F2"/>
-      </w:pPr>
-      <w:r>
-        <w:rPr>
-          <w:rFonts w:ascii="Courier New" w:hAnsi="Courier New" w:cs="Courier New" w:eastAsia="Courier New"/>
-          <w:sz w:val="16"/>
-        </w:rPr>
-        <w:t xml:space="preserve">    .days button.active { background: #2563eb; border-color: #2563eb; color: #fff; }</w:t>
-      </w:r>
-    </w:p>
-    <w:p>
-      <w:pPr>
-        <w:spacing w:after="0"/>
-        <w:shd w:val="clear" w:color="auto" w:fill="F2F2F2"/>
-      </w:pPr>
-      <w:r>
-        <w:rPr>
-          <w:rFonts w:ascii="Courier New" w:hAnsi="Courier New" w:cs="Courier New" w:eastAsia="Courier New"/>
-          <w:sz w:val="16"/>
-        </w:rPr>
-        <w:t xml:space="preserve">    table { width: 100%; border-collapse: collapse; }</w:t>
-      </w:r>
-    </w:p>
-    <w:p>
-      <w:pPr>
-        <w:spacing w:after="0"/>
-        <w:shd w:val="clear" w:color="auto" w:fill="F2F2F2"/>
-      </w:pPr>
-      <w:r>
-        <w:rPr>
-          <w:rFonts w:ascii="Courier New" w:hAnsi="Courier New" w:cs="Courier New" w:eastAsia="Courier New"/>
-          <w:sz w:val="16"/>
-        </w:rPr>
-        <w:t xml:space="preserve">    th { position: sticky; top: 0; background: #f1f5f9; text-align: left; font-size: 12px; text-transform: uppercase; color: #64748b; padding: 10px 16px; }</w:t>
-      </w:r>
-    </w:p>
-    <w:p>
-      <w:pPr>
-        <w:spacing w:after="0"/>
-        <w:shd w:val="clear" w:color="auto" w:fill="F2F2F2"/>
-      </w:pPr>
-      <w:r>
-        <w:rPr>
-          <w:rFonts w:ascii="Courier New" w:hAnsi="Courier New" w:cs="Courier New" w:eastAsia="Courier New"/>
-          <w:sz w:val="16"/>
-        </w:rPr>
-        <w:t xml:space="preserve">    td { padding: 12px 16px; border-bottom: 1px solid #f1f5f9; font-size: 15px; }</w:t>
-      </w:r>
-    </w:p>
-    <w:p>
-      <w:pPr>
-        <w:spacing w:after="0"/>
-        <w:shd w:val="clear" w:color="auto" w:fill="F2F2F2"/>
-      </w:pPr>
-      <w:r>
-        <w:rPr>
-          <w:rFonts w:ascii="Courier New" w:hAnsi="Courier New" w:cs="Courier New" w:eastAsia="Courier New"/>
-          <w:sz w:val="16"/>
-        </w:rPr>
-        <w:t xml:space="preserve">    td.temp { text-align: right; font-weight: 600; }</w:t>
-      </w:r>
-    </w:p>
-    <w:p>
-      <w:pPr>
-        <w:spacing w:after="0"/>
-        <w:shd w:val="clear" w:color="auto" w:fill="F2F2F2"/>
-      </w:pPr>
-      <w:r>
-        <w:rPr>
-          <w:rFonts w:ascii="Courier New" w:hAnsi="Courier New" w:cs="Courier New" w:eastAsia="Courier New"/>
-          <w:sz w:val="16"/>
-        </w:rPr>
-        <w:t xml:space="preserve">    th:last-child { text-align: right; }</w:t>
-      </w:r>
-    </w:p>
-    <w:p>
-      <w:pPr>
-        <w:spacing w:after="0"/>
-        <w:shd w:val="clear" w:color="auto" w:fill="F2F2F2"/>
-      </w:pPr>
-      <w:r>
-        <w:rPr>
-          <w:rFonts w:ascii="Courier New" w:hAnsi="Courier New" w:cs="Courier New" w:eastAsia="Courier New"/>
-          <w:sz w:val="16"/>
-        </w:rPr>
-        <w:t xml:space="preserve">    tr.now { background: #eff6ff; }</w:t>
-      </w:r>
-    </w:p>
-    <w:p>
-      <w:pPr>
-        <w:spacing w:after="0"/>
-        <w:shd w:val="clear" w:color="auto" w:fill="F2F2F2"/>
-      </w:pPr>
-      <w:r>
-        <w:rPr>
-          <w:rFonts w:ascii="Courier New" w:hAnsi="Courier New" w:cs="Courier New" w:eastAsia="Courier New"/>
-          <w:sz w:val="16"/>
-        </w:rPr>
-        <w:t xml:space="preserve">    .hot { color: #dc2626; } .warm { color: #ea580c; } .cool { color: #2563eb; }</w:t>
-      </w:r>
-    </w:p>
-    <w:p>
-      <w:pPr>
-        <w:spacing w:after="0"/>
-        <w:shd w:val="clear" w:color="auto" w:fill="F2F2F2"/>
-      </w:pPr>
-      <w:r>
-        <w:rPr>
-          <w:rFonts w:ascii="Courier New" w:hAnsi="Courier New" w:cs="Courier New" w:eastAsia="Courier New"/>
-          <w:sz w:val="16"/>
-        </w:rPr>
-        <w:t xml:space="preserve">    .state { padding: 40px 16px; text-align: center; color: #64748b; }</w:t>
-      </w:r>
-    </w:p>
-    <w:p>
-      <w:pPr>
-        <w:spacing w:after="0"/>
-        <w:shd w:val="clear" w:color="auto" w:fill="F2F2F2"/>
-      </w:pPr>
-      <w:r>
-        <w:rPr>
-          <w:rFonts w:ascii="Courier New" w:hAnsi="Courier New" w:cs="Courier New" w:eastAsia="Courier New"/>
-          <w:sz w:val="16"/>
-        </w:rPr>
-        <w:t xml:space="preserve">    .state button { margin-top: 12px; padding: 8px 16px; border: 0; border-radius: 8px; background: #2563eb; color: #fff; }</w:t>
-      </w:r>
-    </w:p>
-    <w:p>
-      <w:pPr>
-        <w:spacing w:after="0"/>
-        <w:shd w:val="clear" w:color="auto" w:fill="F2F2F2"/>
-      </w:pPr>
-      <w:r>
-        <w:rPr>
-          <w:rFonts w:ascii="Courier New" w:hAnsi="Courier New" w:cs="Courier New" w:eastAsia="Courier New"/>
-          <w:sz w:val="16"/>
-        </w:rPr>
-        <w:t xml:space="preserve">    footer { text-align: center; font-size: 12px; color: #94a3b8; padding: 16px; }</w:t>
-      </w:r>
-    </w:p>
-    <w:p>
-      <w:pPr>
-        <w:spacing w:after="0"/>
-        <w:shd w:val="clear" w:color="auto" w:fill="F2F2F2"/>
-      </w:pPr>
-      <w:r>
-        <w:rPr>
-          <w:rFonts w:ascii="Courier New" w:hAnsi="Courier New" w:cs="Courier New" w:eastAsia="Courier New"/>
-          <w:sz w:val="16"/>
-        </w:rPr>
-        <w:t xml:space="preserve">  &lt;/style&gt;</w:t>
-      </w:r>
-    </w:p>
-    <w:p>
-      <w:pPr>
-        <w:spacing w:after="0"/>
-        <w:shd w:val="clear" w:color="auto" w:fill="F2F2F2"/>
-      </w:pPr>
-      <w:r>
-        <w:rPr>
-          <w:rFonts w:ascii="Courier New" w:hAnsi="Courier New" w:cs="Courier New" w:eastAsia="Courier New"/>
-          <w:sz w:val="16"/>
-        </w:rPr>
-        <w:t xml:space="preserve">&lt;/head&gt;</w:t>
-      </w:r>
-    </w:p>
-    <w:p>
-      <w:pPr>
-        <w:spacing w:after="0"/>
-        <w:shd w:val="clear" w:color="auto" w:fill="F2F2F2"/>
-      </w:pPr>
-      <w:r>
-        <w:rPr>
-          <w:rFonts w:ascii="Courier New" w:hAnsi="Courier New" w:cs="Courier New" w:eastAsia="Courier New"/>
-          <w:sz w:val="16"/>
-        </w:rPr>
-        <w:t xml:space="preserve">&lt;body&gt;</w:t>
-      </w:r>
-    </w:p>
-    <w:p>
-      <w:pPr>
-        <w:spacing w:after="0"/>
-        <w:shd w:val="clear" w:color="auto" w:fill="F2F2F2"/>
-      </w:pPr>
-      <w:r>
-        <w:rPr>
-          <w:rFonts w:ascii="Courier New" w:hAnsi="Courier New" w:cs="Courier New" w:eastAsia="Courier New"/>
-          <w:sz w:val="16"/>
-        </w:rPr>
-        <w:t xml:space="preserve">  &lt;div id="app" class="app"&gt;</w:t>
-      </w:r>
-    </w:p>
-    <w:p>
-      <w:pPr>
-        <w:spacing w:after="0"/>
-        <w:shd w:val="clear" w:color="auto" w:fill="F2F2F2"/>
-      </w:pPr>
-      <w:r>
-        <w:rPr>
-          <w:rFonts w:ascii="Courier New" w:hAnsi="Courier New" w:cs="Courier New" w:eastAsia="Courier New"/>
-          <w:sz w:val="16"/>
-        </w:rPr>
-        <w:t xml:space="preserve">    &lt;header&gt;</w:t>
-      </w:r>
-    </w:p>
-    <w:p>
-      <w:pPr>
-        <w:spacing w:after="0"/>
-        <w:shd w:val="clear" w:color="auto" w:fill="F2F2F2"/>
-      </w:pPr>
-      <w:r>
-        <w:rPr>
-          <w:rFonts w:ascii="Courier New" w:hAnsi="Courier New" w:cs="Courier New" w:eastAsia="Courier New"/>
-          <w:sz w:val="16"/>
-        </w:rPr>
-        <w:t xml:space="preserve">      &lt;h1&gt;🌤️ Prakiraan Cuaca Jakarta&lt;/h1&gt;</w:t>
-      </w:r>
-    </w:p>
-    <w:p>
-      <w:pPr>
-        <w:spacing w:after="0"/>
-        <w:shd w:val="clear" w:color="auto" w:fill="F2F2F2"/>
-      </w:pPr>
-      <w:r>
-        <w:rPr>
-          <w:rFonts w:ascii="Courier New" w:hAnsi="Courier New" w:cs="Courier New" w:eastAsia="Courier New"/>
-          <w:sz w:val="16"/>
-        </w:rPr>
-        <w:t xml:space="preserve">      &lt;p&gt;Suhu per jam (°C) dari Open-Meteo API&lt;/p&gt;</w:t>
-      </w:r>
-    </w:p>
-    <w:p>
-      <w:pPr>
-        <w:spacing w:after="0"/>
-        <w:shd w:val="clear" w:color="auto" w:fill="F2F2F2"/>
-      </w:pPr>
-      <w:r>
-        <w:rPr>
-          <w:rFonts w:ascii="Courier New" w:hAnsi="Courier New" w:cs="Courier New" w:eastAsia="Courier New"/>
-          <w:sz w:val="16"/>
-        </w:rPr>
-        <w:t xml:space="preserve">      &lt;div class="summary" v-if="filtered.length"&gt;</w:t>
-      </w:r>
-    </w:p>
-    <w:p>
-      <w:pPr>
-        <w:spacing w:after="0"/>
-        <w:shd w:val="clear" w:color="auto" w:fill="F2F2F2"/>
-      </w:pPr>
-      <w:r>
-        <w:rPr>
-          <w:rFonts w:ascii="Courier New" w:hAnsi="Courier New" w:cs="Courier New" w:eastAsia="Courier New"/>
-          <w:sz w:val="16"/>
-        </w:rPr>
-        <w:t xml:space="preserve">        &lt;div class="card"&gt;&lt;small&gt;Min&lt;/small&gt;&lt;b&gt;{{ minTemp }}°&lt;/b&gt;&lt;/div&gt;</w:t>
-      </w:r>
-    </w:p>
-    <w:p>
-      <w:pPr>
-        <w:spacing w:after="0"/>
-        <w:shd w:val="clear" w:color="auto" w:fill="F2F2F2"/>
-      </w:pPr>
-      <w:r>
-        <w:rPr>
-          <w:rFonts w:ascii="Courier New" w:hAnsi="Courier New" w:cs="Courier New" w:eastAsia="Courier New"/>
-          <w:sz w:val="16"/>
-        </w:rPr>
-        <w:t xml:space="preserve">        &lt;div class="card"&gt;&lt;small&gt;Rata-rata&lt;/small&gt;&lt;b&gt;{{ avgTemp }}°&lt;/b&gt;&lt;/div&gt;</w:t>
-      </w:r>
-    </w:p>
-    <w:p>
-      <w:pPr>
-        <w:spacing w:after="0"/>
-        <w:shd w:val="clear" w:color="auto" w:fill="F2F2F2"/>
-      </w:pPr>
-      <w:r>
-        <w:rPr>
-          <w:rFonts w:ascii="Courier New" w:hAnsi="Courier New" w:cs="Courier New" w:eastAsia="Courier New"/>
-          <w:sz w:val="16"/>
-        </w:rPr>
-        <w:t xml:space="preserve">        &lt;div class="card"&gt;&lt;small&gt;Max&lt;/small&gt;&lt;b&gt;{{ maxTemp }}°&lt;/b&gt;&lt;/div&gt;</w:t>
-      </w:r>
-    </w:p>
-    <w:p>
-      <w:pPr>
-        <w:spacing w:after="0"/>
-        <w:shd w:val="clear" w:color="auto" w:fill="F2F2F2"/>
-      </w:pPr>
-      <w:r>
-        <w:rPr>
-          <w:rFonts w:ascii="Courier New" w:hAnsi="Courier New" w:cs="Courier New" w:eastAsia="Courier New"/>
-          <w:sz w:val="16"/>
-        </w:rPr>
-        <w:t xml:space="preserve">      &lt;/div&gt;</w:t>
-      </w:r>
-    </w:p>
-    <w:p>
-      <w:pPr>
-        <w:spacing w:after="0"/>
-        <w:shd w:val="clear" w:color="auto" w:fill="F2F2F2"/>
-      </w:pPr>
-      <w:r>
-        <w:rPr>
-          <w:rFonts w:ascii="Courier New" w:hAnsi="Courier New" w:cs="Courier New" w:eastAsia="Courier New"/>
-          <w:sz w:val="16"/>
-        </w:rPr>
-        <w:t xml:space="preserve">    &lt;/header&gt;</w:t>
-      </w:r>
-    </w:p>
-    <w:p>
-      <w:pPr>
-        <w:spacing w:after="0"/>
-        <w:shd w:val="clear" w:color="auto" w:fill="F2F2F2"/>
-      </w:pPr>
-      <w:r>
-        <w:rPr>
-          <w:rFonts w:ascii="Courier New" w:hAnsi="Courier New" w:cs="Courier New" w:eastAsia="Courier New"/>
-          <w:sz w:val="16"/>
-        </w:rPr>
-        <w:t xml:space="preserve"/>
-      </w:r>
-    </w:p>
-    <w:p>
-      <w:pPr>
-        <w:spacing w:after="0"/>
-        <w:shd w:val="clear" w:color="auto" w:fill="F2F2F2"/>
-      </w:pPr>
-      <w:r>
-        <w:rPr>
-          <w:rFonts w:ascii="Courier New" w:hAnsi="Courier New" w:cs="Courier New" w:eastAsia="Courier New"/>
-          <w:sz w:val="16"/>
-        </w:rPr>
-        <w:t xml:space="preserve">    &lt;div v-if="loading" class="state"&gt;Memuat data cuaca...&lt;/div&gt;</w:t>
-      </w:r>
-    </w:p>
-    <w:p>
-      <w:pPr>
-        <w:spacing w:after="0"/>
-        <w:shd w:val="clear" w:color="auto" w:fill="F2F2F2"/>
-      </w:pPr>
-      <w:r>
-        <w:rPr>
-          <w:rFonts w:ascii="Courier New" w:hAnsi="Courier New" w:cs="Courier New" w:eastAsia="Courier New"/>
-          <w:sz w:val="16"/>
-        </w:rPr>
-        <w:t xml:space="preserve">    &lt;div v-else-if="error" class="state"&gt;</w:t>
-      </w:r>
-    </w:p>
-    <w:p>
-      <w:pPr>
-        <w:spacing w:after="0"/>
-        <w:shd w:val="clear" w:color="auto" w:fill="F2F2F2"/>
-      </w:pPr>
-      <w:r>
-        <w:rPr>
-          <w:rFonts w:ascii="Courier New" w:hAnsi="Courier New" w:cs="Courier New" w:eastAsia="Courier New"/>
-          <w:sz w:val="16"/>
-        </w:rPr>
-        <w:t xml:space="preserve">      Gagal mengambil data: {{ error }}&lt;br /&gt;</w:t>
-      </w:r>
-    </w:p>
-    <w:p>
-      <w:pPr>
-        <w:spacing w:after="0"/>
-        <w:shd w:val="clear" w:color="auto" w:fill="F2F2F2"/>
-      </w:pPr>
-      <w:r>
-        <w:rPr>
-          <w:rFonts w:ascii="Courier New" w:hAnsi="Courier New" w:cs="Courier New" w:eastAsia="Courier New"/>
-          <w:sz w:val="16"/>
-        </w:rPr>
-        <w:t xml:space="preserve">      &lt;button @click="fetchCuaca"&gt;Coba lagi&lt;/button&gt;</w:t>
-      </w:r>
-    </w:p>
-    <w:p>
-      <w:pPr>
-        <w:spacing w:after="0"/>
-        <w:shd w:val="clear" w:color="auto" w:fill="F2F2F2"/>
-      </w:pPr>
-      <w:r>
-        <w:rPr>
-          <w:rFonts w:ascii="Courier New" w:hAnsi="Courier New" w:cs="Courier New" w:eastAsia="Courier New"/>
-          <w:sz w:val="16"/>
-        </w:rPr>
-        <w:t xml:space="preserve">    &lt;/div&gt;</w:t>
-      </w:r>
-    </w:p>
-    <w:p>
-      <w:pPr>
-        <w:spacing w:after="0"/>
-        <w:shd w:val="clear" w:color="auto" w:fill="F2F2F2"/>
-      </w:pPr>
-      <w:r>
-        <w:rPr>
-          <w:rFonts w:ascii="Courier New" w:hAnsi="Courier New" w:cs="Courier New" w:eastAsia="Courier New"/>
-          <w:sz w:val="16"/>
-        </w:rPr>
-        <w:t xml:space="preserve"/>
-      </w:r>
-    </w:p>
-    <w:p>
-      <w:pPr>
-        <w:spacing w:after="0"/>
-        <w:shd w:val="clear" w:color="auto" w:fill="F2F2F2"/>
-      </w:pPr>
-      <w:r>
-        <w:rPr>
-          <w:rFonts w:ascii="Courier New" w:hAnsi="Courier New" w:cs="Courier New" w:eastAsia="Courier New"/>
-          <w:sz w:val="16"/>
-        </w:rPr>
-        <w:t xml:space="preserve">    &lt;template v-else&gt;</w:t>
-      </w:r>
-    </w:p>
-    <w:p>
-      <w:pPr>
-        <w:spacing w:after="0"/>
-        <w:shd w:val="clear" w:color="auto" w:fill="F2F2F2"/>
-      </w:pPr>
-      <w:r>
-        <w:rPr>
-          <w:rFonts w:ascii="Courier New" w:hAnsi="Courier New" w:cs="Courier New" w:eastAsia="Courier New"/>
-          <w:sz w:val="16"/>
-        </w:rPr>
-        <w:t xml:space="preserve">      &lt;nav class="days"&gt;</w:t>
-      </w:r>
-    </w:p>
-    <w:p>
-      <w:pPr>
-        <w:spacing w:after="0"/>
-        <w:shd w:val="clear" w:color="auto" w:fill="F2F2F2"/>
-      </w:pPr>
-      <w:r>
-        <w:rPr>
-          <w:rFonts w:ascii="Courier New" w:hAnsi="Courier New" w:cs="Courier New" w:eastAsia="Courier New"/>
-          <w:sz w:val="16"/>
-        </w:rPr>
-        <w:t xml:space="preserve">        &lt;button v-for="d in days" :key="d" :class="{ active: d === selectedDay }" @click="selectedDay = d"&gt;</w:t>
-      </w:r>
-    </w:p>
-    <w:p>
-      <w:pPr>
-        <w:spacing w:after="0"/>
-        <w:shd w:val="clear" w:color="auto" w:fill="F2F2F2"/>
-      </w:pPr>
-      <w:r>
-        <w:rPr>
-          <w:rFonts w:ascii="Courier New" w:hAnsi="Courier New" w:cs="Courier New" w:eastAsia="Courier New"/>
-          <w:sz w:val="16"/>
-        </w:rPr>
-        <w:t xml:space="preserve">          {{ formatDay(d) }}</w:t>
-      </w:r>
-    </w:p>
-    <w:p>
-      <w:pPr>
-        <w:spacing w:after="0"/>
-        <w:shd w:val="clear" w:color="auto" w:fill="F2F2F2"/>
-      </w:pPr>
-      <w:r>
-        <w:rPr>
-          <w:rFonts w:ascii="Courier New" w:hAnsi="Courier New" w:cs="Courier New" w:eastAsia="Courier New"/>
-          <w:sz w:val="16"/>
-        </w:rPr>
-        <w:t xml:space="preserve">        &lt;/button&gt;</w:t>
-      </w:r>
-    </w:p>
-    <w:p>
-      <w:pPr>
-        <w:spacing w:after="0"/>
-        <w:shd w:val="clear" w:color="auto" w:fill="F2F2F2"/>
-      </w:pPr>
-      <w:r>
-        <w:rPr>
-          <w:rFonts w:ascii="Courier New" w:hAnsi="Courier New" w:cs="Courier New" w:eastAsia="Courier New"/>
-          <w:sz w:val="16"/>
-        </w:rPr>
-        <w:t xml:space="preserve">      &lt;/nav&gt;</w:t>
-      </w:r>
-    </w:p>
-    <w:p>
-      <w:pPr>
-        <w:spacing w:after="0"/>
-        <w:shd w:val="clear" w:color="auto" w:fill="F2F2F2"/>
-      </w:pPr>
-      <w:r>
-        <w:rPr>
-          <w:rFonts w:ascii="Courier New" w:hAnsi="Courier New" w:cs="Courier New" w:eastAsia="Courier New"/>
-          <w:sz w:val="16"/>
-        </w:rPr>
-        <w:t xml:space="preserve">      &lt;table&gt;</w:t>
-      </w:r>
-    </w:p>
-    <w:p>
-      <w:pPr>
-        <w:spacing w:after="0"/>
-        <w:shd w:val="clear" w:color="auto" w:fill="F2F2F2"/>
-      </w:pPr>
-      <w:r>
-        <w:rPr>
-          <w:rFonts w:ascii="Courier New" w:hAnsi="Courier New" w:cs="Courier New" w:eastAsia="Courier New"/>
-          <w:sz w:val="16"/>
-        </w:rPr>
-        <w:t xml:space="preserve">        &lt;thead&gt;</w:t>
-      </w:r>
-    </w:p>
-    <w:p>
-      <w:pPr>
-        <w:spacing w:after="0"/>
-        <w:shd w:val="clear" w:color="auto" w:fill="F2F2F2"/>
-      </w:pPr>
-      <w:r>
-        <w:rPr>
-          <w:rFonts w:ascii="Courier New" w:hAnsi="Courier New" w:cs="Courier New" w:eastAsia="Courier New"/>
-          <w:sz w:val="16"/>
-        </w:rPr>
-        <w:t xml:space="preserve">          &lt;tr&gt;&lt;th&gt;Waktu (time)&lt;/th&gt;&lt;th&gt;Suhu (temperature_2m)&lt;/th&gt;&lt;/tr&gt;</w:t>
-      </w:r>
-    </w:p>
-    <w:p>
-      <w:pPr>
-        <w:spacing w:after="0"/>
-        <w:shd w:val="clear" w:color="auto" w:fill="F2F2F2"/>
-      </w:pPr>
-      <w:r>
-        <w:rPr>
-          <w:rFonts w:ascii="Courier New" w:hAnsi="Courier New" w:cs="Courier New" w:eastAsia="Courier New"/>
-          <w:sz w:val="16"/>
-        </w:rPr>
-        <w:t xml:space="preserve">        &lt;/thead&gt;</w:t>
-      </w:r>
-    </w:p>
-    <w:p>
-      <w:pPr>
-        <w:spacing w:after="0"/>
-        <w:shd w:val="clear" w:color="auto" w:fill="F2F2F2"/>
-      </w:pPr>
-      <w:r>
-        <w:rPr>
-          <w:rFonts w:ascii="Courier New" w:hAnsi="Courier New" w:cs="Courier New" w:eastAsia="Courier New"/>
-          <w:sz w:val="16"/>
-        </w:rPr>
-        <w:t xml:space="preserve">        &lt;tbody&gt;</w:t>
-      </w:r>
-    </w:p>
-    <w:p>
-      <w:pPr>
-        <w:spacing w:after="0"/>
-        <w:shd w:val="clear" w:color="auto" w:fill="F2F2F2"/>
-      </w:pPr>
-      <w:r>
-        <w:rPr>
-          <w:rFonts w:ascii="Courier New" w:hAnsi="Courier New" w:cs="Courier New" w:eastAsia="Courier New"/>
-          <w:sz w:val="16"/>
-        </w:rPr>
-        <w:t xml:space="preserve">          &lt;tr v-for="item in filtered" :key="item.time" :class="{ now: item.time === currentHour }"&gt;</w:t>
-      </w:r>
-    </w:p>
-    <w:p>
-      <w:pPr>
-        <w:spacing w:after="0"/>
-        <w:shd w:val="clear" w:color="auto" w:fill="F2F2F2"/>
-      </w:pPr>
-      <w:r>
-        <w:rPr>
-          <w:rFonts w:ascii="Courier New" w:hAnsi="Courier New" w:cs="Courier New" w:eastAsia="Courier New"/>
-          <w:sz w:val="16"/>
-        </w:rPr>
-        <w:t xml:space="preserve">            &lt;td&gt;{{ formatJam(item.time) }}&lt;/td&gt;</w:t>
-      </w:r>
-    </w:p>
-    <w:p>
-      <w:pPr>
-        <w:spacing w:after="0"/>
-        <w:shd w:val="clear" w:color="auto" w:fill="F2F2F2"/>
-      </w:pPr>
-      <w:r>
-        <w:rPr>
-          <w:rFonts w:ascii="Courier New" w:hAnsi="Courier New" w:cs="Courier New" w:eastAsia="Courier New"/>
-          <w:sz w:val="16"/>
-        </w:rPr>
-        <w:t xml:space="preserve">            &lt;td class="temp" :class="tempClass(item.temp)"&gt;{{ item.temp }} {{ unit }}&lt;/td&gt;</w:t>
-      </w:r>
-    </w:p>
-    <w:p>
-      <w:pPr>
-        <w:spacing w:after="0"/>
-        <w:shd w:val="clear" w:color="auto" w:fill="F2F2F2"/>
-      </w:pPr>
-      <w:r>
-        <w:rPr>
-          <w:rFonts w:ascii="Courier New" w:hAnsi="Courier New" w:cs="Courier New" w:eastAsia="Courier New"/>
-          <w:sz w:val="16"/>
-        </w:rPr>
-        <w:t xml:space="preserve">          &lt;/tr&gt;</w:t>
-      </w:r>
-    </w:p>
-    <w:p>
-      <w:pPr>
-        <w:spacing w:after="0"/>
-        <w:shd w:val="clear" w:color="auto" w:fill="F2F2F2"/>
-      </w:pPr>
-      <w:r>
-        <w:rPr>
-          <w:rFonts w:ascii="Courier New" w:hAnsi="Courier New" w:cs="Courier New" w:eastAsia="Courier New"/>
-          <w:sz w:val="16"/>
-        </w:rPr>
-        <w:t xml:space="preserve">        &lt;/tbody&gt;</w:t>
-      </w:r>
-    </w:p>
-    <w:p>
-      <w:pPr>
-        <w:spacing w:after="0"/>
-        <w:shd w:val="clear" w:color="auto" w:fill="F2F2F2"/>
-      </w:pPr>
-      <w:r>
-        <w:rPr>
-          <w:rFonts w:ascii="Courier New" w:hAnsi="Courier New" w:cs="Courier New" w:eastAsia="Courier New"/>
-          <w:sz w:val="16"/>
-        </w:rPr>
-        <w:t xml:space="preserve">      &lt;/table&gt;</w:t>
-      </w:r>
-    </w:p>
-    <w:p>
-      <w:pPr>
-        <w:spacing w:after="0"/>
-        <w:shd w:val="clear" w:color="auto" w:fill="F2F2F2"/>
-      </w:pPr>
-      <w:r>
-        <w:rPr>
-          <w:rFonts w:ascii="Courier New" w:hAnsi="Courier New" w:cs="Courier New" w:eastAsia="Courier New"/>
-          <w:sz w:val="16"/>
-        </w:rPr>
-        <w:t xml:space="preserve">    &lt;/template&gt;</w:t>
-      </w:r>
-    </w:p>
-    <w:p>
-      <w:pPr>
-        <w:spacing w:after="0"/>
-        <w:shd w:val="clear" w:color="auto" w:fill="F2F2F2"/>
-      </w:pPr>
-      <w:r>
-        <w:rPr>
-          <w:rFonts w:ascii="Courier New" w:hAnsi="Courier New" w:cs="Courier New" w:eastAsia="Courier New"/>
-          <w:sz w:val="16"/>
-        </w:rPr>
-        <w:t xml:space="preserve"/>
-      </w:r>
-    </w:p>
-    <w:p>
-      <w:pPr>
-        <w:spacing w:after="0"/>
-        <w:shd w:val="clear" w:color="auto" w:fill="F2F2F2"/>
-      </w:pPr>
-      <w:r>
-        <w:rPr>
-          <w:rFonts w:ascii="Courier New" w:hAnsi="Courier New" w:cs="Courier New" w:eastAsia="Courier New"/>
-          <w:sz w:val="16"/>
-        </w:rPr>
-        <w:t xml:space="preserve">    &lt;footer&gt;I KD WIJAYA SASHMITHA ADHI C · 048068753 · Tugas 2 STSI4303&lt;/footer&gt;</w:t>
-      </w:r>
-    </w:p>
-    <w:p>
-      <w:pPr>
-        <w:spacing w:after="0"/>
-        <w:shd w:val="clear" w:color="auto" w:fill="F2F2F2"/>
-      </w:pPr>
-      <w:r>
-        <w:rPr>
-          <w:rFonts w:ascii="Courier New" w:hAnsi="Courier New" w:cs="Courier New" w:eastAsia="Courier New"/>
-          <w:sz w:val="16"/>
-        </w:rPr>
-        <w:t xml:space="preserve">  &lt;/div&gt;</w:t>
-      </w:r>
-    </w:p>
-    <w:p>
-      <w:pPr>
-        <w:spacing w:after="0"/>
-        <w:shd w:val="clear" w:color="auto" w:fill="F2F2F2"/>
-      </w:pPr>
-      <w:r>
-        <w:rPr>
-          <w:rFonts w:ascii="Courier New" w:hAnsi="Courier New" w:cs="Courier New" w:eastAsia="Courier New"/>
-          <w:sz w:val="16"/>
-        </w:rPr>
-        <w:t xml:space="preserve"/>
-      </w:r>
-    </w:p>
-    <w:p>
-      <w:pPr>
-        <w:spacing w:after="0"/>
-        <w:shd w:val="clear" w:color="auto" w:fill="F2F2F2"/>
-      </w:pPr>
-      <w:r>
-        <w:rPr>
-          <w:rFonts w:ascii="Courier New" w:hAnsi="Courier New" w:cs="Courier New" w:eastAsia="Courier New"/>
-          <w:sz w:val="16"/>
-        </w:rPr>
-        <w:t xml:space="preserve">  &lt;script&gt;</w:t>
-      </w:r>
-    </w:p>
-    <w:p>
-      <w:pPr>
-        <w:spacing w:after="0"/>
-        <w:shd w:val="clear" w:color="auto" w:fill="F2F2F2"/>
-      </w:pPr>
-      <w:r>
-        <w:rPr>
-          <w:rFonts w:ascii="Courier New" w:hAnsi="Courier New" w:cs="Courier New" w:eastAsia="Courier New"/>
-          <w:sz w:val="16"/>
-        </w:rPr>
-        <w:t xml:space="preserve">    const { createApp, ref, computed, onMounted } = Vue;</w:t>
-      </w:r>
-    </w:p>
-    <w:p>
-      <w:pPr>
-        <w:spacing w:after="0"/>
-        <w:shd w:val="clear" w:color="auto" w:fill="F2F2F2"/>
-      </w:pPr>
-      <w:r>
-        <w:rPr>
-          <w:rFonts w:ascii="Courier New" w:hAnsi="Courier New" w:cs="Courier New" w:eastAsia="Courier New"/>
-          <w:sz w:val="16"/>
-        </w:rPr>
-        <w:t xml:space="preserve"/>
-      </w:r>
-    </w:p>
-    <w:p>
-      <w:pPr>
-        <w:spacing w:after="0"/>
-        <w:shd w:val="clear" w:color="auto" w:fill="F2F2F2"/>
-      </w:pPr>
-      <w:r>
-        <w:rPr>
-          <w:rFonts w:ascii="Courier New" w:hAnsi="Courier New" w:cs="Courier New" w:eastAsia="Courier New"/>
-          <w:sz w:val="16"/>
-        </w:rPr>
-        <w:t xml:space="preserve">    const API_URL = 'https://api.open-meteo.com/v1/forecast?latitude=-6.2&amp;longitude=106.8&amp;hourly=temperature_2m&amp;timezone=Asia%2FJakarta';</w:t>
-      </w:r>
-    </w:p>
-    <w:p>
-      <w:pPr>
-        <w:spacing w:after="0"/>
-        <w:shd w:val="clear" w:color="auto" w:fill="F2F2F2"/>
-      </w:pPr>
-      <w:r>
-        <w:rPr>
-          <w:rFonts w:ascii="Courier New" w:hAnsi="Courier New" w:cs="Courier New" w:eastAsia="Courier New"/>
-          <w:sz w:val="16"/>
-        </w:rPr>
-        <w:t xml:space="preserve"/>
-      </w:r>
-    </w:p>
-    <w:p>
-      <w:pPr>
-        <w:spacing w:after="0"/>
-        <w:shd w:val="clear" w:color="auto" w:fill="F2F2F2"/>
-      </w:pPr>
-      <w:r>
-        <w:rPr>
-          <w:rFonts w:ascii="Courier New" w:hAnsi="Courier New" w:cs="Courier New" w:eastAsia="Courier New"/>
-          <w:sz w:val="16"/>
-        </w:rPr>
-        <w:t xml:space="preserve">    createApp({</w:t>
-      </w:r>
-    </w:p>
-    <w:p>
-      <w:pPr>
-        <w:spacing w:after="0"/>
-        <w:shd w:val="clear" w:color="auto" w:fill="F2F2F2"/>
-      </w:pPr>
-      <w:r>
-        <w:rPr>
-          <w:rFonts w:ascii="Courier New" w:hAnsi="Courier New" w:cs="Courier New" w:eastAsia="Courier New"/>
-          <w:sz w:val="16"/>
-        </w:rPr>
-        <w:t xml:space="preserve">      setup() {</w:t>
-      </w:r>
-    </w:p>
-    <w:p>
-      <w:pPr>
-        <w:spacing w:after="0"/>
-        <w:shd w:val="clear" w:color="auto" w:fill="F2F2F2"/>
-      </w:pPr>
-      <w:r>
-        <w:rPr>
-          <w:rFonts w:ascii="Courier New" w:hAnsi="Courier New" w:cs="Courier New" w:eastAsia="Courier New"/>
-          <w:sz w:val="16"/>
-        </w:rPr>
-        <w:t xml:space="preserve">        const data = ref([]);          // [{ time, temp }]</w:t>
-      </w:r>
-    </w:p>
-    <w:p>
-      <w:pPr>
-        <w:spacing w:after="0"/>
-        <w:shd w:val="clear" w:color="auto" w:fill="F2F2F2"/>
-      </w:pPr>
-      <w:r>
-        <w:rPr>
-          <w:rFonts w:ascii="Courier New" w:hAnsi="Courier New" w:cs="Courier New" w:eastAsia="Courier New"/>
-          <w:sz w:val="16"/>
-        </w:rPr>
-        <w:t xml:space="preserve">        const unit = ref('°C');</w:t>
-      </w:r>
-    </w:p>
-    <w:p>
-      <w:pPr>
-        <w:spacing w:after="0"/>
-        <w:shd w:val="clear" w:color="auto" w:fill="F2F2F2"/>
-      </w:pPr>
-      <w:r>
-        <w:rPr>
-          <w:rFonts w:ascii="Courier New" w:hAnsi="Courier New" w:cs="Courier New" w:eastAsia="Courier New"/>
-          <w:sz w:val="16"/>
-        </w:rPr>
-        <w:t xml:space="preserve">        const loading = ref(true);</w:t>
-      </w:r>
-    </w:p>
-    <w:p>
-      <w:pPr>
-        <w:spacing w:after="0"/>
-        <w:shd w:val="clear" w:color="auto" w:fill="F2F2F2"/>
-      </w:pPr>
-      <w:r>
-        <w:rPr>
-          <w:rFonts w:ascii="Courier New" w:hAnsi="Courier New" w:cs="Courier New" w:eastAsia="Courier New"/>
-          <w:sz w:val="16"/>
-        </w:rPr>
-        <w:t xml:space="preserve">        const error = ref('');</w:t>
-      </w:r>
-    </w:p>
-    <w:p>
-      <w:pPr>
-        <w:spacing w:after="0"/>
-        <w:shd w:val="clear" w:color="auto" w:fill="F2F2F2"/>
-      </w:pPr>
-      <w:r>
-        <w:rPr>
-          <w:rFonts w:ascii="Courier New" w:hAnsi="Courier New" w:cs="Courier New" w:eastAsia="Courier New"/>
-          <w:sz w:val="16"/>
-        </w:rPr>
-        <w:t xml:space="preserve">        const selectedDay = ref('');</w:t>
-      </w:r>
-    </w:p>
-    <w:p>
-      <w:pPr>
-        <w:spacing w:after="0"/>
-        <w:shd w:val="clear" w:color="auto" w:fill="F2F2F2"/>
-      </w:pPr>
-      <w:r>
-        <w:rPr>
-          <w:rFonts w:ascii="Courier New" w:hAnsi="Courier New" w:cs="Courier New" w:eastAsia="Courier New"/>
-          <w:sz w:val="16"/>
-        </w:rPr>
-        <w:t xml:space="preserve"/>
-      </w:r>
-    </w:p>
-    <w:p>
-      <w:pPr>
-        <w:spacing w:after="0"/>
-        <w:shd w:val="clear" w:color="auto" w:fill="F2F2F2"/>
-      </w:pPr>
-      <w:r>
-        <w:rPr>
-          <w:rFonts w:ascii="Courier New" w:hAnsi="Courier New" w:cs="Courier New" w:eastAsia="Courier New"/>
-          <w:sz w:val="16"/>
-        </w:rPr>
-        <w:t xml:space="preserve">        // Ambil data dari API</w:t>
-      </w:r>
-    </w:p>
-    <w:p>
-      <w:pPr>
-        <w:spacing w:after="0"/>
-        <w:shd w:val="clear" w:color="auto" w:fill="F2F2F2"/>
-      </w:pPr>
-      <w:r>
-        <w:rPr>
-          <w:rFonts w:ascii="Courier New" w:hAnsi="Courier New" w:cs="Courier New" w:eastAsia="Courier New"/>
-          <w:sz w:val="16"/>
-        </w:rPr>
-        <w:t xml:space="preserve">        async function fetchCuaca() {</w:t>
-      </w:r>
-    </w:p>
-    <w:p>
-      <w:pPr>
-        <w:spacing w:after="0"/>
-        <w:shd w:val="clear" w:color="auto" w:fill="F2F2F2"/>
-      </w:pPr>
-      <w:r>
-        <w:rPr>
-          <w:rFonts w:ascii="Courier New" w:hAnsi="Courier New" w:cs="Courier New" w:eastAsia="Courier New"/>
-          <w:sz w:val="16"/>
-        </w:rPr>
-        <w:t xml:space="preserve">          loading.value = true;</w:t>
-      </w:r>
-    </w:p>
-    <w:p>
-      <w:pPr>
-        <w:spacing w:after="0"/>
-        <w:shd w:val="clear" w:color="auto" w:fill="F2F2F2"/>
-      </w:pPr>
-      <w:r>
-        <w:rPr>
-          <w:rFonts w:ascii="Courier New" w:hAnsi="Courier New" w:cs="Courier New" w:eastAsia="Courier New"/>
-          <w:sz w:val="16"/>
-        </w:rPr>
-        <w:t xml:space="preserve">          error.value = '';</w:t>
-      </w:r>
-    </w:p>
-    <w:p>
-      <w:pPr>
-        <w:spacing w:after="0"/>
-        <w:shd w:val="clear" w:color="auto" w:fill="F2F2F2"/>
-      </w:pPr>
-      <w:r>
-        <w:rPr>
-          <w:rFonts w:ascii="Courier New" w:hAnsi="Courier New" w:cs="Courier New" w:eastAsia="Courier New"/>
-          <w:sz w:val="16"/>
-        </w:rPr>
-        <w:t xml:space="preserve">          try {</w:t>
-      </w:r>
-    </w:p>
-    <w:p>
-      <w:pPr>
-        <w:spacing w:after="0"/>
-        <w:shd w:val="clear" w:color="auto" w:fill="F2F2F2"/>
-      </w:pPr>
-      <w:r>
-        <w:rPr>
-          <w:rFonts w:ascii="Courier New" w:hAnsi="Courier New" w:cs="Courier New" w:eastAsia="Courier New"/>
-          <w:sz w:val="16"/>
-        </w:rPr>
-        <w:t xml:space="preserve">            const res = await fetch(API_URL);</w:t>
-      </w:r>
-    </w:p>
-    <w:p>
-      <w:pPr>
-        <w:spacing w:after="0"/>
-        <w:shd w:val="clear" w:color="auto" w:fill="F2F2F2"/>
-      </w:pPr>
-      <w:r>
-        <w:rPr>
-          <w:rFonts w:ascii="Courier New" w:hAnsi="Courier New" w:cs="Courier New" w:eastAsia="Courier New"/>
-          <w:sz w:val="16"/>
-        </w:rPr>
-        <w:t xml:space="preserve">            if (!res.ok) throw new Error('HTTP ' + res.status);</w:t>
-      </w:r>
-    </w:p>
-    <w:p>
-      <w:pPr>
-        <w:spacing w:after="0"/>
-        <w:shd w:val="clear" w:color="auto" w:fill="F2F2F2"/>
-      </w:pPr>
-      <w:r>
-        <w:rPr>
-          <w:rFonts w:ascii="Courier New" w:hAnsi="Courier New" w:cs="Courier New" w:eastAsia="Courier New"/>
-          <w:sz w:val="16"/>
-        </w:rPr>
-        <w:t xml:space="preserve">            const json = await res.json();</w:t>
-      </w:r>
-    </w:p>
-    <w:p>
-      <w:pPr>
-        <w:spacing w:after="0"/>
-        <w:shd w:val="clear" w:color="auto" w:fill="F2F2F2"/>
-      </w:pPr>
-      <w:r>
-        <w:rPr>
-          <w:rFonts w:ascii="Courier New" w:hAnsi="Courier New" w:cs="Courier New" w:eastAsia="Courier New"/>
-          <w:sz w:val="16"/>
-        </w:rPr>
-        <w:t xml:space="preserve">            unit.value = json.hourly_units.temperature_2m;</w:t>
-      </w:r>
-    </w:p>
-    <w:p>
-      <w:pPr>
-        <w:spacing w:after="0"/>
-        <w:shd w:val="clear" w:color="auto" w:fill="F2F2F2"/>
-      </w:pPr>
-      <w:r>
-        <w:rPr>
-          <w:rFonts w:ascii="Courier New" w:hAnsi="Courier New" w:cs="Courier New" w:eastAsia="Courier New"/>
-          <w:sz w:val="16"/>
-        </w:rPr>
-        <w:t xml:space="preserve">            // gabungkan array time &amp; temperature_2m jadi list objek</w:t>
-      </w:r>
-    </w:p>
-    <w:p>
-      <w:pPr>
-        <w:spacing w:after="0"/>
-        <w:shd w:val="clear" w:color="auto" w:fill="F2F2F2"/>
-      </w:pPr>
-      <w:r>
-        <w:rPr>
-          <w:rFonts w:ascii="Courier New" w:hAnsi="Courier New" w:cs="Courier New" w:eastAsia="Courier New"/>
-          <w:sz w:val="16"/>
-        </w:rPr>
-        <w:t xml:space="preserve">            data.value = json.hourly.time.map((t, i) =&gt; ({</w:t>
-      </w:r>
-    </w:p>
-    <w:p>
-      <w:pPr>
-        <w:spacing w:after="0"/>
-        <w:shd w:val="clear" w:color="auto" w:fill="F2F2F2"/>
-      </w:pPr>
-      <w:r>
-        <w:rPr>
-          <w:rFonts w:ascii="Courier New" w:hAnsi="Courier New" w:cs="Courier New" w:eastAsia="Courier New"/>
-          <w:sz w:val="16"/>
-        </w:rPr>
-        <w:t xml:space="preserve">              time: t,</w:t>
-      </w:r>
-    </w:p>
-    <w:p>
-      <w:pPr>
-        <w:spacing w:after="0"/>
-        <w:shd w:val="clear" w:color="auto" w:fill="F2F2F2"/>
-      </w:pPr>
-      <w:r>
-        <w:rPr>
-          <w:rFonts w:ascii="Courier New" w:hAnsi="Courier New" w:cs="Courier New" w:eastAsia="Courier New"/>
-          <w:sz w:val="16"/>
-        </w:rPr>
-        <w:t xml:space="preserve">              temp: json.hourly.temperature_2m[i],</w:t>
-      </w:r>
-    </w:p>
-    <w:p>
-      <w:pPr>
-        <w:spacing w:after="0"/>
-        <w:shd w:val="clear" w:color="auto" w:fill="F2F2F2"/>
-      </w:pPr>
-      <w:r>
-        <w:rPr>
-          <w:rFonts w:ascii="Courier New" w:hAnsi="Courier New" w:cs="Courier New" w:eastAsia="Courier New"/>
-          <w:sz w:val="16"/>
-        </w:rPr>
-        <w:t xml:space="preserve">            }));</w:t>
-      </w:r>
-    </w:p>
-    <w:p>
-      <w:pPr>
-        <w:spacing w:after="0"/>
-        <w:shd w:val="clear" w:color="auto" w:fill="F2F2F2"/>
-      </w:pPr>
-      <w:r>
-        <w:rPr>
-          <w:rFonts w:ascii="Courier New" w:hAnsi="Courier New" w:cs="Courier New" w:eastAsia="Courier New"/>
-          <w:sz w:val="16"/>
-        </w:rPr>
-        <w:t xml:space="preserve">            selectedDay.value = data.value[0].time.slice(0, 10);</w:t>
-      </w:r>
-    </w:p>
-    <w:p>
-      <w:pPr>
-        <w:spacing w:after="0"/>
-        <w:shd w:val="clear" w:color="auto" w:fill="F2F2F2"/>
-      </w:pPr>
-      <w:r>
-        <w:rPr>
-          <w:rFonts w:ascii="Courier New" w:hAnsi="Courier New" w:cs="Courier New" w:eastAsia="Courier New"/>
-          <w:sz w:val="16"/>
-        </w:rPr>
-        <w:t xml:space="preserve">          } catch (e) {</w:t>
-      </w:r>
-    </w:p>
-    <w:p>
-      <w:pPr>
-        <w:spacing w:after="0"/>
-        <w:shd w:val="clear" w:color="auto" w:fill="F2F2F2"/>
-      </w:pPr>
-      <w:r>
-        <w:rPr>
-          <w:rFonts w:ascii="Courier New" w:hAnsi="Courier New" w:cs="Courier New" w:eastAsia="Courier New"/>
-          <w:sz w:val="16"/>
-        </w:rPr>
-        <w:t xml:space="preserve">            error.value = e.message;</w:t>
-      </w:r>
-    </w:p>
-    <w:p>
-      <w:pPr>
-        <w:spacing w:after="0"/>
-        <w:shd w:val="clear" w:color="auto" w:fill="F2F2F2"/>
-      </w:pPr>
-      <w:r>
-        <w:rPr>
-          <w:rFonts w:ascii="Courier New" w:hAnsi="Courier New" w:cs="Courier New" w:eastAsia="Courier New"/>
-          <w:sz w:val="16"/>
-        </w:rPr>
-        <w:t xml:space="preserve">          } finally {</w:t>
-      </w:r>
-    </w:p>
-    <w:p>
-      <w:pPr>
-        <w:spacing w:after="0"/>
-        <w:shd w:val="clear" w:color="auto" w:fill="F2F2F2"/>
-      </w:pPr>
-      <w:r>
-        <w:rPr>
-          <w:rFonts w:ascii="Courier New" w:hAnsi="Courier New" w:cs="Courier New" w:eastAsia="Courier New"/>
-          <w:sz w:val="16"/>
-        </w:rPr>
-        <w:t xml:space="preserve">            loading.value = false;</w:t>
-      </w:r>
-    </w:p>
-    <w:p>
-      <w:pPr>
-        <w:spacing w:after="0"/>
-        <w:shd w:val="clear" w:color="auto" w:fill="F2F2F2"/>
-      </w:pPr>
-      <w:r>
-        <w:rPr>
-          <w:rFonts w:ascii="Courier New" w:hAnsi="Courier New" w:cs="Courier New" w:eastAsia="Courier New"/>
-          <w:sz w:val="16"/>
-        </w:rPr>
-        <w:t xml:space="preserve">          }</w:t>
-      </w:r>
-    </w:p>
-    <w:p>
-      <w:pPr>
-        <w:spacing w:after="0"/>
-        <w:shd w:val="clear" w:color="auto" w:fill="F2F2F2"/>
-      </w:pPr>
-      <w:r>
-        <w:rPr>
-          <w:rFonts w:ascii="Courier New" w:hAnsi="Courier New" w:cs="Courier New" w:eastAsia="Courier New"/>
-          <w:sz w:val="16"/>
-        </w:rPr>
-        <w:t xml:space="preserve">        }</w:t>
-      </w:r>
-    </w:p>
-    <w:p>
-      <w:pPr>
-        <w:spacing w:after="0"/>
-        <w:shd w:val="clear" w:color="auto" w:fill="F2F2F2"/>
-      </w:pPr>
-      <w:r>
-        <w:rPr>
-          <w:rFonts w:ascii="Courier New" w:hAnsi="Courier New" w:cs="Courier New" w:eastAsia="Courier New"/>
-          <w:sz w:val="16"/>
-        </w:rPr>
-        <w:t xml:space="preserve"/>
-      </w:r>
-    </w:p>
-    <w:p>
-      <w:pPr>
-        <w:spacing w:after="0"/>
-        <w:shd w:val="clear" w:color="auto" w:fill="F2F2F2"/>
-      </w:pPr>
-      <w:r>
-        <w:rPr>
-          <w:rFonts w:ascii="Courier New" w:hAnsi="Courier New" w:cs="Courier New" w:eastAsia="Courier New"/>
-          <w:sz w:val="16"/>
-        </w:rPr>
-        <w:t xml:space="preserve">        // Daftar tanggal unik (7 hari)</w:t>
-      </w:r>
-    </w:p>
-    <w:p>
-      <w:pPr>
-        <w:spacing w:after="0"/>
-        <w:shd w:val="clear" w:color="auto" w:fill="F2F2F2"/>
-      </w:pPr>
-      <w:r>
-        <w:rPr>
-          <w:rFonts w:ascii="Courier New" w:hAnsi="Courier New" w:cs="Courier New" w:eastAsia="Courier New"/>
-          <w:sz w:val="16"/>
-        </w:rPr>
-        <w:t xml:space="preserve">        const days = computed(() =&gt; [...new Set(data.value.map(d =&gt; d.time.slice(0, 10)))]);</w:t>
-      </w:r>
-    </w:p>
-    <w:p>
-      <w:pPr>
-        <w:spacing w:after="0"/>
-        <w:shd w:val="clear" w:color="auto" w:fill="F2F2F2"/>
-      </w:pPr>
-      <w:r>
-        <w:rPr>
-          <w:rFonts w:ascii="Courier New" w:hAnsi="Courier New" w:cs="Courier New" w:eastAsia="Courier New"/>
-          <w:sz w:val="16"/>
-        </w:rPr>
-        <w:t xml:space="preserve">        // Data untuk tanggal yang dipilih (24 jam)</w:t>
-      </w:r>
-    </w:p>
-    <w:p>
-      <w:pPr>
-        <w:spacing w:after="0"/>
-        <w:shd w:val="clear" w:color="auto" w:fill="F2F2F2"/>
-      </w:pPr>
-      <w:r>
-        <w:rPr>
-          <w:rFonts w:ascii="Courier New" w:hAnsi="Courier New" w:cs="Courier New" w:eastAsia="Courier New"/>
-          <w:sz w:val="16"/>
-        </w:rPr>
-        <w:t xml:space="preserve">        const filtered = computed(() =&gt; data.value.filter(d =&gt; d.time.startsWith(selectedDay.value)));</w:t>
-      </w:r>
-    </w:p>
-    <w:p>
-      <w:pPr>
-        <w:spacing w:after="0"/>
-        <w:shd w:val="clear" w:color="auto" w:fill="F2F2F2"/>
-      </w:pPr>
-      <w:r>
-        <w:rPr>
-          <w:rFonts w:ascii="Courier New" w:hAnsi="Courier New" w:cs="Courier New" w:eastAsia="Courier New"/>
-          <w:sz w:val="16"/>
-        </w:rPr>
-        <w:t xml:space="preserve"/>
-      </w:r>
-    </w:p>
-    <w:p>
-      <w:pPr>
-        <w:spacing w:after="0"/>
-        <w:shd w:val="clear" w:color="auto" w:fill="F2F2F2"/>
-      </w:pPr>
-      <w:r>
-        <w:rPr>
-          <w:rFonts w:ascii="Courier New" w:hAnsi="Courier New" w:cs="Courier New" w:eastAsia="Courier New"/>
-          <w:sz w:val="16"/>
-        </w:rPr>
-        <w:t xml:space="preserve">        const temps = computed(() =&gt; filtered.value.map(d =&gt; d.temp));</w:t>
-      </w:r>
-    </w:p>
-    <w:p>
-      <w:pPr>
-        <w:spacing w:after="0"/>
-        <w:shd w:val="clear" w:color="auto" w:fill="F2F2F2"/>
-      </w:pPr>
-      <w:r>
-        <w:rPr>
-          <w:rFonts w:ascii="Courier New" w:hAnsi="Courier New" w:cs="Courier New" w:eastAsia="Courier New"/>
-          <w:sz w:val="16"/>
-        </w:rPr>
-        <w:t xml:space="preserve">        const minTemp = computed(() =&gt; Math.min(...temps.value).toFixed(1));</w:t>
-      </w:r>
-    </w:p>
-    <w:p>
-      <w:pPr>
-        <w:spacing w:after="0"/>
-        <w:shd w:val="clear" w:color="auto" w:fill="F2F2F2"/>
-      </w:pPr>
-      <w:r>
-        <w:rPr>
-          <w:rFonts w:ascii="Courier New" w:hAnsi="Courier New" w:cs="Courier New" w:eastAsia="Courier New"/>
-          <w:sz w:val="16"/>
-        </w:rPr>
-        <w:t xml:space="preserve">        const maxTemp = computed(() =&gt; Math.max(...temps.value).toFixed(1));</w:t>
-      </w:r>
-    </w:p>
-    <w:p>
-      <w:pPr>
-        <w:spacing w:after="0"/>
-        <w:shd w:val="clear" w:color="auto" w:fill="F2F2F2"/>
-      </w:pPr>
-      <w:r>
-        <w:rPr>
-          <w:rFonts w:ascii="Courier New" w:hAnsi="Courier New" w:cs="Courier New" w:eastAsia="Courier New"/>
-          <w:sz w:val="16"/>
-        </w:rPr>
-        <w:t xml:space="preserve">        const avgTemp = computed(() =&gt; (temps.value.reduce((a, b) =&gt; a + b, 0) / temps.value.length).toFixed(1));</w:t>
-      </w:r>
-    </w:p>
-    <w:p>
-      <w:pPr>
-        <w:spacing w:after="0"/>
-        <w:shd w:val="clear" w:color="auto" w:fill="F2F2F2"/>
-      </w:pPr>
-      <w:r>
-        <w:rPr>
-          <w:rFonts w:ascii="Courier New" w:hAnsi="Courier New" w:cs="Courier New" w:eastAsia="Courier New"/>
-          <w:sz w:val="16"/>
-        </w:rPr>
-        <w:t xml:space="preserve"/>
-      </w:r>
-    </w:p>
-    <w:p>
-      <w:pPr>
-        <w:spacing w:after="0"/>
-        <w:shd w:val="clear" w:color="auto" w:fill="F2F2F2"/>
-      </w:pPr>
-      <w:r>
-        <w:rPr>
-          <w:rFonts w:ascii="Courier New" w:hAnsi="Courier New" w:cs="Courier New" w:eastAsia="Courier New"/>
-          <w:sz w:val="16"/>
-        </w:rPr>
-        <w:t xml:space="preserve">        // Jam sekarang (WIB) untuk highlight baris</w:t>
-      </w:r>
-    </w:p>
-    <w:p>
-      <w:pPr>
-        <w:spacing w:after="0"/>
-        <w:shd w:val="clear" w:color="auto" w:fill="F2F2F2"/>
-      </w:pPr>
-      <w:r>
-        <w:rPr>
-          <w:rFonts w:ascii="Courier New" w:hAnsi="Courier New" w:cs="Courier New" w:eastAsia="Courier New"/>
-          <w:sz w:val="16"/>
-        </w:rPr>
-        <w:t xml:space="preserve">        const now = new Date(Date.now() + 7 * 3600 * 1000).toISOString();</w:t>
-      </w:r>
-    </w:p>
-    <w:p>
-      <w:pPr>
-        <w:spacing w:after="0"/>
-        <w:shd w:val="clear" w:color="auto" w:fill="F2F2F2"/>
-      </w:pPr>
-      <w:r>
-        <w:rPr>
-          <w:rFonts w:ascii="Courier New" w:hAnsi="Courier New" w:cs="Courier New" w:eastAsia="Courier New"/>
-          <w:sz w:val="16"/>
-        </w:rPr>
-        <w:t xml:space="preserve">        const currentHour = now.slice(0, 13) + ':00';</w:t>
-      </w:r>
-    </w:p>
-    <w:p>
-      <w:pPr>
-        <w:spacing w:after="0"/>
-        <w:shd w:val="clear" w:color="auto" w:fill="F2F2F2"/>
-      </w:pPr>
-      <w:r>
-        <w:rPr>
-          <w:rFonts w:ascii="Courier New" w:hAnsi="Courier New" w:cs="Courier New" w:eastAsia="Courier New"/>
-          <w:sz w:val="16"/>
-        </w:rPr>
-        <w:t xml:space="preserve"/>
-      </w:r>
-    </w:p>
-    <w:p>
-      <w:pPr>
-        <w:spacing w:after="0"/>
-        <w:shd w:val="clear" w:color="auto" w:fill="F2F2F2"/>
-      </w:pPr>
-      <w:r>
-        <w:rPr>
-          <w:rFonts w:ascii="Courier New" w:hAnsi="Courier New" w:cs="Courier New" w:eastAsia="Courier New"/>
-          <w:sz w:val="16"/>
-        </w:rPr>
-        <w:t xml:space="preserve">        const formatDay = d =&gt; new Date(d + 'T00:00').toLocaleDateString('id-ID', { weekday: 'short', day: 'numeric', month: 'short' });</w:t>
-      </w:r>
-    </w:p>
-    <w:p>
-      <w:pPr>
-        <w:spacing w:after="0"/>
-        <w:shd w:val="clear" w:color="auto" w:fill="F2F2F2"/>
-      </w:pPr>
-      <w:r>
-        <w:rPr>
-          <w:rFonts w:ascii="Courier New" w:hAnsi="Courier New" w:cs="Courier New" w:eastAsia="Courier New"/>
-          <w:sz w:val="16"/>
-        </w:rPr>
-        <w:t xml:space="preserve">        const formatJam = t =&gt; t.slice(11, 16) + ' WIB';</w:t>
-      </w:r>
-    </w:p>
-    <w:p>
-      <w:pPr>
-        <w:spacing w:after="0"/>
-        <w:shd w:val="clear" w:color="auto" w:fill="F2F2F2"/>
-      </w:pPr>
-      <w:r>
-        <w:rPr>
-          <w:rFonts w:ascii="Courier New" w:hAnsi="Courier New" w:cs="Courier New" w:eastAsia="Courier New"/>
-          <w:sz w:val="16"/>
-        </w:rPr>
-        <w:t xml:space="preserve">        const tempClass = t =&gt; (t &gt;= 31 ? 'hot' : t &gt;= 27 ? 'warm' : 'cool');</w:t>
-      </w:r>
-    </w:p>
-    <w:p>
-      <w:pPr>
-        <w:spacing w:after="0"/>
-        <w:shd w:val="clear" w:color="auto" w:fill="F2F2F2"/>
-      </w:pPr>
-      <w:r>
-        <w:rPr>
-          <w:rFonts w:ascii="Courier New" w:hAnsi="Courier New" w:cs="Courier New" w:eastAsia="Courier New"/>
-          <w:sz w:val="16"/>
-        </w:rPr>
-        <w:t xml:space="preserve"/>
-      </w:r>
-    </w:p>
-    <w:p>
-      <w:pPr>
-        <w:spacing w:after="0"/>
-        <w:shd w:val="clear" w:color="auto" w:fill="F2F2F2"/>
-      </w:pPr>
-      <w:r>
-        <w:rPr>
-          <w:rFonts w:ascii="Courier New" w:hAnsi="Courier New" w:cs="Courier New" w:eastAsia="Courier New"/>
-          <w:sz w:val="16"/>
-        </w:rPr>
-        <w:t xml:space="preserve">        onMounted(fetchCuaca);</w:t>
-      </w:r>
-    </w:p>
-    <w:p>
-      <w:pPr>
-        <w:spacing w:after="0"/>
-        <w:shd w:val="clear" w:color="auto" w:fill="F2F2F2"/>
-      </w:pPr>
-      <w:r>
-        <w:rPr>
-          <w:rFonts w:ascii="Courier New" w:hAnsi="Courier New" w:cs="Courier New" w:eastAsia="Courier New"/>
-          <w:sz w:val="16"/>
-        </w:rPr>
-        <w:t xml:space="preserve"/>
-      </w:r>
-    </w:p>
-    <w:p>
-      <w:pPr>
-        <w:spacing w:after="0"/>
-        <w:shd w:val="clear" w:color="auto" w:fill="F2F2F2"/>
-      </w:pPr>
-      <w:r>
-        <w:rPr>
-          <w:rFonts w:ascii="Courier New" w:hAnsi="Courier New" w:cs="Courier New" w:eastAsia="Courier New"/>
-          <w:sz w:val="16"/>
-        </w:rPr>
-        <w:t xml:space="preserve">        return { data, unit, loading, error, selectedDay, days, filtered, minTemp, maxTemp, avgTemp,</w:t>
-      </w:r>
-    </w:p>
-    <w:p>
-      <w:pPr>
-        <w:spacing w:after="0"/>
-        <w:shd w:val="clear" w:color="auto" w:fill="F2F2F2"/>
-      </w:pPr>
-      <w:r>
-        <w:rPr>
-          <w:rFonts w:ascii="Courier New" w:hAnsi="Courier New" w:cs="Courier New" w:eastAsia="Courier New"/>
-          <w:sz w:val="16"/>
-        </w:rPr>
-        <w:t xml:space="preserve">                 currentHour, fetchCuaca, formatDay, formatJam, tempClass };</w:t>
-      </w:r>
-    </w:p>
-    <w:p>
-      <w:pPr>
-        <w:spacing w:after="0"/>
-        <w:shd w:val="clear" w:color="auto" w:fill="F2F2F2"/>
-      </w:pPr>
-      <w:r>
-        <w:rPr>
-          <w:rFonts w:ascii="Courier New" w:hAnsi="Courier New" w:cs="Courier New" w:eastAsia="Courier New"/>
-          <w:sz w:val="16"/>
-        </w:rPr>
-        <w:t xml:space="preserve">      },</w:t>
-      </w:r>
-    </w:p>
-    <w:p>
-      <w:pPr>
-        <w:spacing w:after="0"/>
-        <w:shd w:val="clear" w:color="auto" w:fill="F2F2F2"/>
-      </w:pPr>
-      <w:r>
-        <w:rPr>
-          <w:rFonts w:ascii="Courier New" w:hAnsi="Courier New" w:cs="Courier New" w:eastAsia="Courier New"/>
-          <w:sz w:val="16"/>
-        </w:rPr>
-        <w:t xml:space="preserve">    }).mount('#app');</w:t>
-      </w:r>
-    </w:p>
-    <w:p>
-      <w:pPr>
-        <w:spacing w:after="0"/>
-        <w:shd w:val="clear" w:color="auto" w:fill="F2F2F2"/>
-      </w:pPr>
-      <w:r>
-        <w:rPr>
-          <w:rFonts w:ascii="Courier New" w:hAnsi="Courier New" w:cs="Courier New" w:eastAsia="Courier New"/>
-          <w:sz w:val="16"/>
-        </w:rPr>
-        <w:t xml:space="preserve">  &lt;/script&gt;</w:t>
-      </w:r>
-    </w:p>
-    <w:p>
-      <w:pPr>
-        <w:spacing w:after="0"/>
-        <w:shd w:val="clear" w:color="auto" w:fill="F2F2F2"/>
-      </w:pPr>
-      <w:r>
-        <w:rPr>
-          <w:rFonts w:ascii="Courier New" w:hAnsi="Courier New" w:cs="Courier New" w:eastAsia="Courier New"/>
-          <w:sz w:val="16"/>
-        </w:rPr>
-        <w:t xml:space="preserve">&lt;/body&gt;</w:t>
-      </w:r>
-    </w:p>
-    <w:p>
-      <w:pPr>
-        <w:spacing w:after="0"/>
-        <w:shd w:val="clear" w:color="auto" w:fill="F2F2F2"/>
-      </w:pPr>
-      <w:r>
-        <w:rPr>
-          <w:rFonts w:ascii="Courier New" w:hAnsi="Courier New" w:cs="Courier New" w:eastAsia="Courier New"/>
-          <w:sz w:val="16"/>
-        </w:rPr>
-        <w:t xml:space="preserve">&lt;/html&gt;</w:t>
+        <w:t>Langkah instalasi dan menjalankan aplikasi (ringkas, detail ada di file INSTALL.md):</w:t>
+      </w:r>
+    </w:p>
+    <w:p>
+      <w:pPr>
+        <w:spacing w:after="120"/>
+      </w:pPr>
+      <w:r>
+        <w:rPr>
+          <w:rFonts w:ascii="Times New Roman" w:hAnsi="Times New Roman" w:cs="Times New Roman" w:eastAsia="Times New Roman"/>
+        </w:rPr>
+        <w:t>• Install Node.js LTS (v20+) dari nodejs.org, cek dengan node -v dan npm -v.</w:t>
+      </w:r>
+    </w:p>
+    <w:p>
+      <w:pPr>
+        <w:spacing w:after="120"/>
+      </w:pPr>
+      <w:r>
+        <w:rPr>
+          <w:rFonts w:ascii="Times New Roman" w:hAnsi="Times New Roman" w:cs="Times New Roman" w:eastAsia="Times New Roman"/>
+        </w:rPr>
+        <w:t>• Install Ionic CLI secara global: npm i -g @ionic/cli</w:t>
+      </w:r>
+    </w:p>
+    <w:p>
+      <w:pPr>
+        <w:spacing w:after="120"/>
+      </w:pPr>
+      <w:r>
+        <w:rPr>
+          <w:rFonts w:ascii="Times New Roman" w:hAnsi="Times New Roman" w:cs="Times New Roman" w:eastAsia="Times New Roman"/>
+        </w:rPr>
+        <w:t>• Buat project: ionic start cuaca-ionic blank --type=vue, lalu masuk folder dengan cd cuaca-ionic (npm install jika dependency belum terpasang).</w:t>
+      </w:r>
+    </w:p>
+    <w:p>
+      <w:pPr>
+        <w:spacing w:after="120"/>
+      </w:pPr>
+      <w:r>
+        <w:rPr>
+          <w:rFonts w:ascii="Times New Roman" w:hAnsi="Times New Roman" w:cs="Times New Roman" w:eastAsia="Times New Roman"/>
+        </w:rPr>
+        <w:t>• Jalankan di browser: ionic serve, aplikasi terbuka di http://localhost:8100. Agar tampil seperti HP, buka DevTools Chrome lalu Toggle device toolbar.</w:t>
+      </w:r>
+    </w:p>
+    <w:p>
+      <w:pPr>
+        <w:spacing w:after="120"/>
+      </w:pPr>
+      <w:r>
+        <w:rPr>
+          <w:rFonts w:ascii="Times New Roman" w:hAnsi="Times New Roman" w:cs="Times New Roman" w:eastAsia="Times New Roman"/>
+        </w:rPr>
+        <w:t>• Coba di HP Android: hubungkan laptop dan HP ke Wi-Fi yang sama, jalankan ionic serve --external, lalu buka alamat IP yang tampil (misalnya http://192.168.1.10:8100) di Chrome HP.</w:t>
+      </w:r>
+    </w:p>
+    <w:p>
+      <w:pPr>
+        <w:spacing w:after="120"/>
+      </w:pPr>
+      <w:r>
+        <w:rPr>
+          <w:rFonts w:ascii="Times New Roman" w:hAnsi="Times New Roman" w:cs="Times New Roman" w:eastAsia="Times New Roman"/>
+        </w:rPr>
+        <w:t>• (Opsional) Membuat APK lewat Capacitor dan Android Studio: ionic build, npx cap add android, npx cap sync, npx cap open android, lalu Run ke HP dengan USB Debugging aktif.</w:t>
       </w:r>
     </w:p>
     <w:p>
@@ -3210,37 +1435,37 @@
               <w:rPr>
                 <w:rFonts w:ascii="Courier New" w:hAnsi="Courier New" w:cs="Courier New" w:eastAsia="Courier New"/>
               </w:rPr>
-              <w:t xml:space="preserve">&lt;head&gt;</w:t>
-            </w:r>
-          </w:p>
-        </w:tc>
-        <w:tc>
-          <w:tcPr/>
-          <w:p>
-            <w:pPr>
-              <w:keepNext/>
-              <w:spacing w:after="0"/>
-            </w:pPr>
-            <w:r>
-              <w:rPr>
-                <w:rFonts w:ascii="Times New Roman" w:hAnsi="Times New Roman" w:cs="Times New Roman" w:eastAsia="Times New Roman"/>
-              </w:rPr>
-              <w:t xml:space="preserve">1–34</w:t>
-            </w:r>
-          </w:p>
-        </w:tc>
-        <w:tc>
-          <w:tcPr/>
-          <w:p>
-            <w:pPr>
-              <w:keepNext/>
-              <w:spacing w:after="0"/>
-            </w:pPr>
-            <w:r>
-              <w:rPr>
-                <w:rFonts w:ascii="Times New Roman" w:hAnsi="Times New Roman" w:cs="Times New Roman" w:eastAsia="Times New Roman"/>
-              </w:rPr>
-              <w:t xml:space="preserve">Meta viewport untuk mobile, memuat Vue 3 dari CDN, dan CSS</w:t>
+              <w:t>src/services/cuaca.ts</w:t>
+            </w:r>
+          </w:p>
+        </w:tc>
+        <w:tc>
+          <w:tcPr/>
+          <w:p>
+            <w:pPr>
+              <w:keepNext/>
+              <w:spacing w:after="0"/>
+            </w:pPr>
+            <w:r>
+              <w:rPr>
+                <w:rFonts w:ascii="Times New Roman" w:hAnsi="Times New Roman" w:cs="Times New Roman" w:eastAsia="Times New Roman"/>
+              </w:rPr>
+              <w:t>1–23</w:t>
+            </w:r>
+          </w:p>
+        </w:tc>
+        <w:tc>
+          <w:tcPr/>
+          <w:p>
+            <w:pPr>
+              <w:keepNext/>
+              <w:spacing w:after="0"/>
+            </w:pPr>
+            <w:r>
+              <w:rPr>
+                <w:rFonts w:ascii="Times New Roman" w:hAnsi="Times New Roman" w:cs="Times New Roman" w:eastAsia="Times New Roman"/>
+              </w:rPr>
+              <w:t>API_URL (soal + timezone=Asia/Jakarta), interface DataCuaca, fungsi async ambilCuaca()</w:t>
             </w:r>
           </w:p>
         </w:tc>
@@ -3257,43 +1482,37 @@
               <w:rPr>
                 <w:rFonts w:ascii="Times New Roman" w:hAnsi="Times New Roman" w:cs="Times New Roman" w:eastAsia="Times New Roman"/>
               </w:rPr>
-              <w:t xml:space="preserve">Template </w:t>
-            </w:r>
-            <w:r>
-              <w:rPr>
-                <w:rFonts w:ascii="Courier New" w:hAnsi="Courier New" w:cs="Courier New" w:eastAsia="Courier New"/>
-              </w:rPr>
-              <w:t xml:space="preserve">#app</w:t>
-            </w:r>
-          </w:p>
-        </w:tc>
-        <w:tc>
-          <w:tcPr/>
-          <w:p>
-            <w:pPr>
-              <w:keepNext/>
-              <w:spacing w:after="0"/>
-            </w:pPr>
-            <w:r>
-              <w:rPr>
-                <w:rFonts w:ascii="Times New Roman" w:hAnsi="Times New Roman" w:cs="Times New Roman" w:eastAsia="Times New Roman"/>
-              </w:rPr>
-              <w:t xml:space="preserve">36–73</w:t>
-            </w:r>
-          </w:p>
-        </w:tc>
-        <w:tc>
-          <w:tcPr/>
-          <w:p>
-            <w:pPr>
-              <w:keepNext/>
-              <w:spacing w:after="0"/>
-            </w:pPr>
-            <w:r>
-              <w:rPr>
-                <w:rFonts w:ascii="Times New Roman" w:hAnsi="Times New Roman" w:cs="Times New Roman" w:eastAsia="Times New Roman"/>
-              </w:rPr>
-              <w:t xml:space="preserve">Header + kartu ringkasan, status loading/error, tombol tanggal, tabel waktu dan suhu, footer identitas</w:t>
+              <w:t>HomePage.vue &lt;template&gt;</w:t>
+            </w:r>
+          </w:p>
+        </w:tc>
+        <w:tc>
+          <w:tcPr/>
+          <w:p>
+            <w:pPr>
+              <w:keepNext/>
+              <w:spacing w:after="0"/>
+            </w:pPr>
+            <w:r>
+              <w:rPr>
+                <w:rFonts w:ascii="Times New Roman" w:hAnsi="Times New Roman" w:cs="Times New Roman" w:eastAsia="Times New Roman"/>
+              </w:rPr>
+              <w:t>1–73</w:t>
+            </w:r>
+          </w:p>
+        </w:tc>
+        <w:tc>
+          <w:tcPr/>
+          <w:p>
+            <w:pPr>
+              <w:keepNext/>
+              <w:spacing w:after="0"/>
+            </w:pPr>
+            <w:r>
+              <w:rPr>
+                <w:rFonts w:ascii="Times New Roman" w:hAnsi="Times New Roman" w:cs="Times New Roman" w:eastAsia="Times New Roman"/>
+              </w:rPr>
+              <w:t>ion-header + ion-segment (tab hari), ion-refresher, ion-spinner/error, ion-card ringkasan, ion-list waktu dan suhu, ion-footer identitas</w:t>
             </w:r>
           </w:p>
         </w:tc>
@@ -3310,43 +1529,37 @@
               <w:rPr>
                 <w:rFonts w:ascii="Courier New" w:hAnsi="Courier New" w:cs="Courier New" w:eastAsia="Courier New"/>
               </w:rPr>
-              <w:t xml:space="preserve">API_URL</w:t>
-            </w:r>
-          </w:p>
-        </w:tc>
-        <w:tc>
-          <w:tcPr/>
-          <w:p>
-            <w:pPr>
-              <w:keepNext/>
-              <w:spacing w:after="0"/>
-            </w:pPr>
-            <w:r>
-              <w:rPr>
-                <w:rFonts w:ascii="Times New Roman" w:hAnsi="Times New Roman" w:cs="Times New Roman" w:eastAsia="Times New Roman"/>
-              </w:rPr>
-              <w:t xml:space="preserve">78</w:t>
-            </w:r>
-          </w:p>
-        </w:tc>
-        <w:tc>
-          <w:tcPr/>
-          <w:p>
-            <w:pPr>
-              <w:keepNext/>
-              <w:spacing w:after="0"/>
-            </w:pPr>
-            <w:r>
-              <w:rPr>
-                <w:rFonts w:ascii="Times New Roman" w:hAnsi="Times New Roman" w:cs="Times New Roman" w:eastAsia="Times New Roman"/>
-              </w:rPr>
-              <w:t xml:space="preserve">Alamat API dari soal + </w:t>
-            </w:r>
-            <w:r>
-              <w:rPr>
-                <w:rFonts w:ascii="Courier New" w:hAnsi="Courier New" w:cs="Courier New" w:eastAsia="Courier New"/>
-              </w:rPr>
-              <w:t xml:space="preserve">timezone=Asia/Jakarta</w:t>
+              <w:t>State (ref)</w:t>
+            </w:r>
+          </w:p>
+        </w:tc>
+        <w:tc>
+          <w:tcPr/>
+          <w:p>
+            <w:pPr>
+              <w:keepNext/>
+              <w:spacing w:after="0"/>
+            </w:pPr>
+            <w:r>
+              <w:rPr>
+                <w:rFonts w:ascii="Times New Roman" w:hAnsi="Times New Roman" w:cs="Times New Roman" w:eastAsia="Times New Roman"/>
+              </w:rPr>
+              <w:t>87–91</w:t>
+            </w:r>
+          </w:p>
+        </w:tc>
+        <w:tc>
+          <w:tcPr/>
+          <w:p>
+            <w:pPr>
+              <w:keepNext/>
+              <w:spacing w:after="0"/>
+            </w:pPr>
+            <w:r>
+              <w:rPr>
+                <w:rFonts w:ascii="Times New Roman" w:hAnsi="Times New Roman" w:cs="Times New Roman" w:eastAsia="Times New Roman"/>
+              </w:rPr>
+              <w:t>data, unit, loading, error, selectedDay</w:t>
             </w:r>
           </w:p>
         </w:tc>
@@ -3363,97 +1576,37 @@
               <w:rPr>
                 <w:rFonts w:ascii="Times New Roman" w:hAnsi="Times New Roman" w:cs="Times New Roman" w:eastAsia="Times New Roman"/>
               </w:rPr>
-              <w:t xml:space="preserve">State (</w:t>
-            </w:r>
+              <w:t>fetchCuaca()</w:t>
+            </w:r>
+          </w:p>
+        </w:tc>
+        <w:tc>
+          <w:tcPr/>
+          <w:p>
+            <w:pPr>
+              <w:keepNext/>
+              <w:spacing w:after="0"/>
+            </w:pPr>
+            <w:r>
+              <w:rPr>
+                <w:rFonts w:ascii="Times New Roman" w:hAnsi="Times New Roman" w:cs="Times New Roman" w:eastAsia="Times New Roman"/>
+              </w:rPr>
+              <w:t>94–113</w:t>
+            </w:r>
+          </w:p>
+        </w:tc>
+        <w:tc>
+          <w:tcPr/>
+          <w:p>
+            <w:pPr>
+              <w:keepNext/>
+              <w:spacing w:after="0"/>
+            </w:pPr>
             <w:r>
               <w:rPr>
                 <w:rFonts w:ascii="Courier New" w:hAnsi="Courier New" w:cs="Courier New" w:eastAsia="Courier New"/>
               </w:rPr>
-              <w:t xml:space="preserve">ref</w:t>
-            </w:r>
-            <w:r>
-              <w:rPr>
-                <w:rFonts w:ascii="Times New Roman" w:hAnsi="Times New Roman" w:cs="Times New Roman" w:eastAsia="Times New Roman"/>
-              </w:rPr>
-              <w:t xml:space="preserve">)</w:t>
-            </w:r>
-          </w:p>
-        </w:tc>
-        <w:tc>
-          <w:tcPr/>
-          <w:p>
-            <w:pPr>
-              <w:keepNext/>
-              <w:spacing w:after="0"/>
-            </w:pPr>
-            <w:r>
-              <w:rPr>
-                <w:rFonts w:ascii="Times New Roman" w:hAnsi="Times New Roman" w:cs="Times New Roman" w:eastAsia="Times New Roman"/>
-              </w:rPr>
-              <w:t xml:space="preserve">82–86</w:t>
-            </w:r>
-          </w:p>
-        </w:tc>
-        <w:tc>
-          <w:tcPr/>
-          <w:p>
-            <w:pPr>
-              <w:keepNext/>
-              <w:spacing w:after="0"/>
-            </w:pPr>
-            <w:r>
-              <w:rPr>
-                <w:rFonts w:ascii="Courier New" w:hAnsi="Courier New" w:cs="Courier New" w:eastAsia="Courier New"/>
-              </w:rPr>
-              <w:t xml:space="preserve">data</w:t>
-            </w:r>
-            <w:r>
-              <w:rPr>
-                <w:rFonts w:ascii="Times New Roman" w:hAnsi="Times New Roman" w:cs="Times New Roman" w:eastAsia="Times New Roman"/>
-              </w:rPr>
-              <w:t xml:space="preserve">, </w:t>
-            </w:r>
-            <w:r>
-              <w:rPr>
-                <w:rFonts w:ascii="Courier New" w:hAnsi="Courier New" w:cs="Courier New" w:eastAsia="Courier New"/>
-              </w:rPr>
-              <w:t xml:space="preserve">unit</w:t>
-            </w:r>
-            <w:r>
-              <w:rPr>
-                <w:rFonts w:ascii="Times New Roman" w:hAnsi="Times New Roman" w:cs="Times New Roman" w:eastAsia="Times New Roman"/>
-              </w:rPr>
-              <w:t xml:space="preserve">, </w:t>
-            </w:r>
-            <w:r>
-              <w:rPr>
-                <w:rFonts w:ascii="Courier New" w:hAnsi="Courier New" w:cs="Courier New" w:eastAsia="Courier New"/>
-              </w:rPr>
-              <w:t xml:space="preserve">loading</w:t>
-            </w:r>
-            <w:r>
-              <w:rPr>
-                <w:rFonts w:ascii="Times New Roman" w:hAnsi="Times New Roman" w:cs="Times New Roman" w:eastAsia="Times New Roman"/>
-              </w:rPr>
-              <w:t xml:space="preserve">, </w:t>
-            </w:r>
-            <w:r>
-              <w:rPr>
-                <w:rFonts w:ascii="Courier New" w:hAnsi="Courier New" w:cs="Courier New" w:eastAsia="Courier New"/>
-              </w:rPr>
-              <w:t xml:space="preserve">error</w:t>
-            </w:r>
-            <w:r>
-              <w:rPr>
-                <w:rFonts w:ascii="Times New Roman" w:hAnsi="Times New Roman" w:cs="Times New Roman" w:eastAsia="Times New Roman"/>
-              </w:rPr>
-              <w:t xml:space="preserve">, </w:t>
-            </w:r>
-            <w:r>
-              <w:rPr>
-                <w:rFonts w:ascii="Courier New" w:hAnsi="Courier New" w:cs="Courier New" w:eastAsia="Courier New"/>
-              </w:rPr>
-              <w:t xml:space="preserve">selectedDay</w:t>
+              <w:t>Memanggil ambilCuaca() dan mengisi state; dipakai juga oleh pull-to-refresh</w:t>
             </w:r>
           </w:p>
         </w:tc>
@@ -3470,49 +1623,37 @@
               <w:rPr>
                 <w:rFonts w:ascii="Courier New" w:hAnsi="Courier New" w:cs="Courier New" w:eastAsia="Courier New"/>
               </w:rPr>
-              <w:t xml:space="preserve">fetchCuaca()</w:t>
-            </w:r>
-          </w:p>
-        </w:tc>
-        <w:tc>
-          <w:tcPr/>
-          <w:p>
-            <w:pPr>
-              <w:keepNext/>
-              <w:spacing w:after="0"/>
-            </w:pPr>
-            <w:r>
-              <w:rPr>
-                <w:rFonts w:ascii="Times New Roman" w:hAnsi="Times New Roman" w:cs="Times New Roman" w:eastAsia="Times New Roman"/>
-              </w:rPr>
-              <w:t xml:space="preserve">89–108</w:t>
-            </w:r>
-          </w:p>
-        </w:tc>
-        <w:tc>
-          <w:tcPr/>
-          <w:p>
-            <w:pPr>
-              <w:keepNext/>
-              <w:spacing w:after="0"/>
-            </w:pPr>
-            <w:r>
-              <w:rPr>
-                <w:rFonts w:ascii="Times New Roman" w:hAnsi="Times New Roman" w:cs="Times New Roman" w:eastAsia="Times New Roman"/>
-              </w:rPr>
-              <w:t xml:space="preserve">Mengambil data dengan </w:t>
-            </w:r>
-            <w:r>
-              <w:rPr>
-                <w:rFonts w:ascii="Courier New" w:hAnsi="Courier New" w:cs="Courier New" w:eastAsia="Courier New"/>
-              </w:rPr>
-              <w:t xml:space="preserve">fetch</w:t>
-            </w:r>
-            <w:r>
-              <w:rPr>
-                <w:rFonts w:ascii="Times New Roman" w:hAnsi="Times New Roman" w:cs="Times New Roman" w:eastAsia="Times New Roman"/>
-              </w:rPr>
-              <w:t xml:space="preserve"> lalu menggabungkan dua array menjadi list objek</w:t>
+              <w:t>computed</w:t>
+            </w:r>
+          </w:p>
+        </w:tc>
+        <w:tc>
+          <w:tcPr/>
+          <w:p>
+            <w:pPr>
+              <w:keepNext/>
+              <w:spacing w:after="0"/>
+            </w:pPr>
+            <w:r>
+              <w:rPr>
+                <w:rFonts w:ascii="Times New Roman" w:hAnsi="Times New Roman" w:cs="Times New Roman" w:eastAsia="Times New Roman"/>
+              </w:rPr>
+              <w:t>116–124</w:t>
+            </w:r>
+          </w:p>
+        </w:tc>
+        <w:tc>
+          <w:tcPr/>
+          <w:p>
+            <w:pPr>
+              <w:keepNext/>
+              <w:spacing w:after="0"/>
+            </w:pPr>
+            <w:r>
+              <w:rPr>
+                <w:rFonts w:ascii="Times New Roman" w:hAnsi="Times New Roman" w:cs="Times New Roman" w:eastAsia="Times New Roman"/>
+              </w:rPr>
+              <w:t>days, filtered, temps, minTemp, maxTemp, avgTemp</w:t>
             </w:r>
           </w:p>
         </w:tc>
@@ -3529,22 +1670,22 @@
               <w:rPr>
                 <w:rFonts w:ascii="Courier New" w:hAnsi="Courier New" w:cs="Courier New" w:eastAsia="Courier New"/>
               </w:rPr>
-              <w:t xml:space="preserve">computed</w:t>
-            </w:r>
-          </w:p>
-        </w:tc>
-        <w:tc>
-          <w:tcPr/>
-          <w:p>
-            <w:pPr>
-              <w:keepNext/>
-              <w:spacing w:after="0"/>
-            </w:pPr>
-            <w:r>
-              <w:rPr>
-                <w:rFonts w:ascii="Times New Roman" w:hAnsi="Times New Roman" w:cs="Times New Roman" w:eastAsia="Times New Roman"/>
-              </w:rPr>
-              <w:t xml:space="preserve">111–118</w:t>
+              <w:t>Fungsi format</w:t>
+            </w:r>
+          </w:p>
+        </w:tc>
+        <w:tc>
+          <w:tcPr/>
+          <w:p>
+            <w:pPr>
+              <w:keepNext/>
+              <w:spacing w:after="0"/>
+            </w:pPr>
+            <w:r>
+              <w:rPr>
+                <w:rFonts w:ascii="Times New Roman" w:hAnsi="Times New Roman" w:cs="Times New Roman" w:eastAsia="Times New Roman"/>
+              </w:rPr>
+              <w:t>127–134</w:t>
             </w:r>
           </w:p>
         </w:tc>
@@ -3559,67 +1700,7 @@
               <w:rPr>
                 <w:rFonts w:ascii="Courier New" w:hAnsi="Courier New" w:cs="Courier New" w:eastAsia="Courier New"/>
               </w:rPr>
-              <w:t xml:space="preserve">days</w:t>
-            </w:r>
-            <w:r>
-              <w:rPr>
-                <w:rFonts w:ascii="Times New Roman" w:hAnsi="Times New Roman" w:cs="Times New Roman" w:eastAsia="Times New Roman"/>
-              </w:rPr>
-              <w:t xml:space="preserve">, </w:t>
-            </w:r>
-            <w:r>
-              <w:rPr>
-                <w:rFonts w:ascii="Courier New" w:hAnsi="Courier New" w:cs="Courier New" w:eastAsia="Courier New"/>
-              </w:rPr>
-              <w:t xml:space="preserve">filtered</w:t>
-            </w:r>
-            <w:r>
-              <w:rPr>
-                <w:rFonts w:ascii="Times New Roman" w:hAnsi="Times New Roman" w:cs="Times New Roman" w:eastAsia="Times New Roman"/>
-              </w:rPr>
-              <w:t xml:space="preserve">, </w:t>
-            </w:r>
-            <w:r>
-              <w:rPr>
-                <w:rFonts w:ascii="Courier New" w:hAnsi="Courier New" w:cs="Courier New" w:eastAsia="Courier New"/>
-              </w:rPr>
-              <w:t xml:space="preserve">temps</w:t>
-            </w:r>
-            <w:r>
-              <w:rPr>
-                <w:rFonts w:ascii="Times New Roman" w:hAnsi="Times New Roman" w:cs="Times New Roman" w:eastAsia="Times New Roman"/>
-              </w:rPr>
-              <w:t xml:space="preserve">, </w:t>
-            </w:r>
-            <w:r>
-              <w:rPr>
-                <w:rFonts w:ascii="Courier New" w:hAnsi="Courier New" w:cs="Courier New" w:eastAsia="Courier New"/>
-              </w:rPr>
-              <w:t xml:space="preserve">minTemp</w:t>
-            </w:r>
-            <w:r>
-              <w:rPr>
-                <w:rFonts w:ascii="Times New Roman" w:hAnsi="Times New Roman" w:cs="Times New Roman" w:eastAsia="Times New Roman"/>
-              </w:rPr>
-              <w:t xml:space="preserve">, </w:t>
-            </w:r>
-            <w:r>
-              <w:rPr>
-                <w:rFonts w:ascii="Courier New" w:hAnsi="Courier New" w:cs="Courier New" w:eastAsia="Courier New"/>
-              </w:rPr>
-              <w:t xml:space="preserve">maxTemp</w:t>
-            </w:r>
-            <w:r>
-              <w:rPr>
-                <w:rFonts w:ascii="Times New Roman" w:hAnsi="Times New Roman" w:cs="Times New Roman" w:eastAsia="Times New Roman"/>
-              </w:rPr>
-              <w:t xml:space="preserve">, </w:t>
-            </w:r>
-            <w:r>
-              <w:rPr>
-                <w:rFonts w:ascii="Courier New" w:hAnsi="Courier New" w:cs="Courier New" w:eastAsia="Courier New"/>
-              </w:rPr>
-              <w:t xml:space="preserve">avgTemp</w:t>
+              <w:t>currentHour, formatDay, formatJam, tempColor</w:t>
             </w:r>
           </w:p>
         </w:tc>
@@ -3636,22 +1717,22 @@
               <w:rPr>
                 <w:rFonts w:ascii="Times New Roman" w:hAnsi="Times New Roman" w:cs="Times New Roman" w:eastAsia="Times New Roman"/>
               </w:rPr>
-              <w:t xml:space="preserve">Fungsi format</w:t>
-            </w:r>
-          </w:p>
-        </w:tc>
-        <w:tc>
-          <w:tcPr/>
-          <w:p>
-            <w:pPr>
-              <w:keepNext/>
-              <w:spacing w:after="0"/>
-            </w:pPr>
-            <w:r>
-              <w:rPr>
-                <w:rFonts w:ascii="Times New Roman" w:hAnsi="Times New Roman" w:cs="Times New Roman" w:eastAsia="Times New Roman"/>
-              </w:rPr>
-              <w:t xml:space="preserve">121–126</w:t>
+              <w:t>onMounted</w:t>
+            </w:r>
+          </w:p>
+        </w:tc>
+        <w:tc>
+          <w:tcPr/>
+          <w:p>
+            <w:pPr>
+              <w:keepNext/>
+              <w:spacing w:after="0"/>
+            </w:pPr>
+            <w:r>
+              <w:rPr>
+                <w:rFonts w:ascii="Times New Roman" w:hAnsi="Times New Roman" w:cs="Times New Roman" w:eastAsia="Times New Roman"/>
+              </w:rPr>
+              <w:t>136</w:t>
             </w:r>
           </w:p>
         </w:tc>
@@ -3666,43 +1747,7 @@
               <w:rPr>
                 <w:rFonts w:ascii="Courier New" w:hAnsi="Courier New" w:cs="Courier New" w:eastAsia="Courier New"/>
               </w:rPr>
-              <w:t xml:space="preserve">currentHour</w:t>
-            </w:r>
-            <w:r>
-              <w:rPr>
-                <w:rFonts w:ascii="Times New Roman" w:hAnsi="Times New Roman" w:cs="Times New Roman" w:eastAsia="Times New Roman"/>
-              </w:rPr>
-              <w:t xml:space="preserve">, </w:t>
-            </w:r>
-            <w:r>
-              <w:rPr>
-                <w:rFonts w:ascii="Courier New" w:hAnsi="Courier New" w:cs="Courier New" w:eastAsia="Courier New"/>
-              </w:rPr>
-              <w:t xml:space="preserve">formatDay</w:t>
-            </w:r>
-            <w:r>
-              <w:rPr>
-                <w:rFonts w:ascii="Times New Roman" w:hAnsi="Times New Roman" w:cs="Times New Roman" w:eastAsia="Times New Roman"/>
-              </w:rPr>
-              <w:t xml:space="preserve">, </w:t>
-            </w:r>
-            <w:r>
-              <w:rPr>
-                <w:rFonts w:ascii="Courier New" w:hAnsi="Courier New" w:cs="Courier New" w:eastAsia="Courier New"/>
-              </w:rPr>
-              <w:t xml:space="preserve">formatJam</w:t>
-            </w:r>
-            <w:r>
-              <w:rPr>
-                <w:rFonts w:ascii="Times New Roman" w:hAnsi="Times New Roman" w:cs="Times New Roman" w:eastAsia="Times New Roman"/>
-              </w:rPr>
-              <w:t xml:space="preserve">, </w:t>
-            </w:r>
-            <w:r>
-              <w:rPr>
-                <w:rFonts w:ascii="Courier New" w:hAnsi="Courier New" w:cs="Courier New" w:eastAsia="Courier New"/>
-              </w:rPr>
-              <w:t xml:space="preserve">tempClass</w:t>
+              <w:t>Memanggil fetchCuaca saat halaman pertama kali tampil</w:t>
             </w:r>
           </w:p>
         </w:tc>
@@ -3718,47 +1763,35 @@
               <w:rPr>
                 <w:rFonts w:ascii="Courier New" w:hAnsi="Courier New" w:cs="Courier New" w:eastAsia="Courier New"/>
               </w:rPr>
-              <w:t xml:space="preserve">onMounted</w:t>
-            </w:r>
-          </w:p>
-        </w:tc>
-        <w:tc>
-          <w:tcPr/>
-          <w:p>
-            <w:pPr>
-              <w:spacing w:after="0"/>
-            </w:pPr>
-            <w:r>
-              <w:rPr>
-                <w:rFonts w:ascii="Times New Roman" w:hAnsi="Times New Roman" w:cs="Times New Roman" w:eastAsia="Times New Roman"/>
-              </w:rPr>
-              <w:t xml:space="preserve">128</w:t>
-            </w:r>
-          </w:p>
-        </w:tc>
-        <w:tc>
-          <w:tcPr/>
-          <w:p>
-            <w:pPr>
-              <w:spacing w:after="0"/>
-            </w:pPr>
-            <w:r>
-              <w:rPr>
-                <w:rFonts w:ascii="Times New Roman" w:hAnsi="Times New Roman" w:cs="Times New Roman" w:eastAsia="Times New Roman"/>
-              </w:rPr>
-              <w:t xml:space="preserve">Memanggil </w:t>
-            </w:r>
-            <w:r>
-              <w:rPr>
-                <w:rFonts w:ascii="Courier New" w:hAnsi="Courier New" w:cs="Courier New" w:eastAsia="Courier New"/>
-              </w:rPr>
-              <w:t xml:space="preserve">fetchCuaca</w:t>
-            </w:r>
-            <w:r>
-              <w:rPr>
-                <w:rFonts w:ascii="Times New Roman" w:hAnsi="Times New Roman" w:cs="Times New Roman" w:eastAsia="Times New Roman"/>
-              </w:rPr>
-              <w:t xml:space="preserve"> saat aplikasi pertama kali tampil</w:t>
+              <w:t>src/router, App.vue, main.ts</w:t>
+            </w:r>
+          </w:p>
+        </w:tc>
+        <w:tc>
+          <w:tcPr/>
+          <w:p>
+            <w:pPr>
+              <w:spacing w:after="0"/>
+            </w:pPr>
+            <w:r>
+              <w:rPr>
+                <w:rFonts w:ascii="Times New Roman" w:hAnsi="Times New Roman" w:cs="Times New Roman" w:eastAsia="Times New Roman"/>
+              </w:rPr>
+              <w:t>–</w:t>
+            </w:r>
+          </w:p>
+        </w:tc>
+        <w:tc>
+          <w:tcPr/>
+          <w:p>
+            <w:pPr>
+              <w:spacing w:after="0"/>
+            </w:pPr>
+            <w:r>
+              <w:rPr>
+                <w:rFonts w:ascii="Times New Roman" w:hAnsi="Times New Roman" w:cs="Times New Roman" w:eastAsia="Times New Roman"/>
+              </w:rPr>
+              <w:t>Bawaan template blank Ionic (tidak diubah banyak)</w:t>
             </w:r>
           </w:p>
         </w:tc>
@@ -3779,7 +1812,7 @@
           <w:rFonts w:ascii="Times New Roman" w:hAnsi="Times New Roman" w:cs="Times New Roman" w:eastAsia="Times New Roman"/>
           <w:b/>
         </w:rPr>
-        <w:t xml:space="preserve">3. Mengambil data dari API (fetch dan map)</w:t>
+        <w:t>3. Mengambil data dari API (fetch dan map) – src/services/cuaca.ts</w:t>
       </w:r>
     </w:p>
     <w:p>
@@ -3793,7 +1826,7 @@
           <w:rFonts w:ascii="Courier New" w:hAnsi="Courier New" w:cs="Courier New" w:eastAsia="Courier New"/>
           <w:sz w:val="18"/>
         </w:rPr>
-        <w:t xml:space="preserve">        // Ambil data dari API</w:t>
+        <w:t>export const API_URL =</w:t>
       </w:r>
     </w:p>
     <w:p>
@@ -3807,7 +1840,7 @@
           <w:rFonts w:ascii="Courier New" w:hAnsi="Courier New" w:cs="Courier New" w:eastAsia="Courier New"/>
           <w:sz w:val="18"/>
         </w:rPr>
-        <w:t xml:space="preserve">        async function fetchCuaca() {</w:t>
+        <w:t xml:space="preserve">  'https://api.open-meteo.com/v1/forecast?latitude=-6.2&amp;longitude=106.8&amp;hourly=temperature_2m&amp;timezone=Asia%2FJakarta';</w:t>
       </w:r>
     </w:p>
     <w:p>
@@ -3821,7 +1854,6 @@
           <w:rFonts w:ascii="Courier New" w:hAnsi="Courier New" w:cs="Courier New" w:eastAsia="Courier New"/>
           <w:sz w:val="18"/>
         </w:rPr>
-        <w:t xml:space="preserve">          loading.value = true;</w:t>
       </w:r>
     </w:p>
     <w:p>
@@ -3835,7 +1867,7 @@
           <w:rFonts w:ascii="Courier New" w:hAnsi="Courier New" w:cs="Courier New" w:eastAsia="Courier New"/>
           <w:sz w:val="18"/>
         </w:rPr>
-        <w:t xml:space="preserve">          error.value = '';</w:t>
+        <w:t>export async function ambilCuaca() {</w:t>
       </w:r>
     </w:p>
     <w:p>
@@ -3849,7 +1881,7 @@
           <w:rFonts w:ascii="Courier New" w:hAnsi="Courier New" w:cs="Courier New" w:eastAsia="Courier New"/>
           <w:sz w:val="18"/>
         </w:rPr>
-        <w:t xml:space="preserve">          try {</w:t>
+        <w:t xml:space="preserve">  const res = await fetch(API_URL);</w:t>
       </w:r>
     </w:p>
     <w:p>
@@ -3863,7 +1895,7 @@
           <w:rFonts w:ascii="Courier New" w:hAnsi="Courier New" w:cs="Courier New" w:eastAsia="Courier New"/>
           <w:sz w:val="18"/>
         </w:rPr>
-        <w:t xml:space="preserve">            const res = await fetch(API_URL);</w:t>
+        <w:t xml:space="preserve">  if (!res.ok) throw new Error('HTTP ' + res.status);</w:t>
       </w:r>
     </w:p>
     <w:p>
@@ -3877,7 +1909,7 @@
           <w:rFonts w:ascii="Courier New" w:hAnsi="Courier New" w:cs="Courier New" w:eastAsia="Courier New"/>
           <w:sz w:val="18"/>
         </w:rPr>
-        <w:t xml:space="preserve">            if (!res.ok) throw new Error('HTTP ' + res.status);</w:t>
+        <w:t xml:space="preserve">  const json = await res.json();</w:t>
       </w:r>
     </w:p>
     <w:p>
@@ -3891,7 +1923,7 @@
           <w:rFonts w:ascii="Courier New" w:hAnsi="Courier New" w:cs="Courier New" w:eastAsia="Courier New"/>
           <w:sz w:val="18"/>
         </w:rPr>
-        <w:t xml:space="preserve">            const json = await res.json();</w:t>
+        <w:t xml:space="preserve">  // Gabungkan array hourly.time &amp; hourly.temperature_2m menjadi list objek</w:t>
       </w:r>
     </w:p>
     <w:p>
@@ -3905,7 +1937,7 @@
           <w:rFonts w:ascii="Courier New" w:hAnsi="Courier New" w:cs="Courier New" w:eastAsia="Courier New"/>
           <w:sz w:val="18"/>
         </w:rPr>
-        <w:t xml:space="preserve">            unit.value = json.hourly_units.temperature_2m;</w:t>
+        <w:t xml:space="preserve">  const data = json.hourly.time.map((t: string, i: number) =&gt; ({</w:t>
       </w:r>
     </w:p>
     <w:p>
@@ -3919,7 +1951,7 @@
           <w:rFonts w:ascii="Courier New" w:hAnsi="Courier New" w:cs="Courier New" w:eastAsia="Courier New"/>
           <w:sz w:val="18"/>
         </w:rPr>
-        <w:t xml:space="preserve">            // gabungkan array time &amp; temperature_2m jadi list objek</w:t>
+        <w:t xml:space="preserve">    time: t,</w:t>
       </w:r>
     </w:p>
     <w:p>
@@ -3933,7 +1965,7 @@
           <w:rFonts w:ascii="Courier New" w:hAnsi="Courier New" w:cs="Courier New" w:eastAsia="Courier New"/>
           <w:sz w:val="18"/>
         </w:rPr>
-        <w:t xml:space="preserve">            data.value = json.hourly.time.map((t, i) =&gt; ({</w:t>
+        <w:t xml:space="preserve">    temp: json.hourly.temperature_2m[i],</w:t>
       </w:r>
     </w:p>
     <w:p>
@@ -3947,7 +1979,7 @@
           <w:rFonts w:ascii="Courier New" w:hAnsi="Courier New" w:cs="Courier New" w:eastAsia="Courier New"/>
           <w:sz w:val="18"/>
         </w:rPr>
-        <w:t xml:space="preserve">              time: t,</w:t>
+        <w:t xml:space="preserve">  }));</w:t>
       </w:r>
     </w:p>
     <w:p>
@@ -3961,7 +1993,7 @@
           <w:rFonts w:ascii="Courier New" w:hAnsi="Courier New" w:cs="Courier New" w:eastAsia="Courier New"/>
           <w:sz w:val="18"/>
         </w:rPr>
-        <w:t xml:space="preserve">              temp: json.hourly.temperature_2m[i],</w:t>
+        <w:t xml:space="preserve">  return { data, unit: json.hourly_units.temperature_2m };</w:t>
       </w:r>
     </w:p>
     <w:p>
@@ -3975,7 +2007,7 @@
           <w:rFonts w:ascii="Courier New" w:hAnsi="Courier New" w:cs="Courier New" w:eastAsia="Courier New"/>
           <w:sz w:val="18"/>
         </w:rPr>
-        <w:t xml:space="preserve">            }));</w:t>
+        <w:t>}</w:t>
       </w:r>
     </w:p>
     <w:p>
@@ -3989,7 +2021,63 @@
           <w:rFonts w:ascii="Courier New" w:hAnsi="Courier New" w:cs="Courier New" w:eastAsia="Courier New"/>
           <w:sz w:val="18"/>
         </w:rPr>
-        <w:t xml:space="preserve">            selectedDay.value = data.value[0].time.slice(0, 10);</w:t>
+      </w:r>
+    </w:p>
+    <w:p>
+      <w:pPr>
+        <w:spacing w:after="120"/>
+      </w:pPr>
+      <w:r>
+        <w:rPr>
+          <w:rFonts w:ascii="Times New Roman" w:hAnsi="Times New Roman" w:cs="Times New Roman" w:eastAsia="Times New Roman"/>
+        </w:rPr>
+        <w:t>• API_URL memakai alamat dari soal ditambah timezone=Asia%2FJakarta, sehingga jam yang dikembalikan sudah WIB (bukan GMT).</w:t>
+      </w:r>
+    </w:p>
+    <w:p>
+      <w:pPr>
+        <w:spacing w:after="120"/>
+      </w:pPr>
+      <w:r>
+        <w:rPr>
+          <w:rFonts w:ascii="Times New Roman" w:hAnsi="Times New Roman" w:cs="Times New Roman" w:eastAsia="Times New Roman"/>
+        </w:rPr>
+        <w:t>• Fungsi async dengan await fetch(API_URL) menunggu respons API tanpa membekukan tampilan. res.ok dicek dulu; jika status HTTP bukan 2xx dibuat error yang ditangkap try/catch di HomePage.vue dan ditampilkan bersama tombol "Coba lagi".</w:t>
+      </w:r>
+    </w:p>
+    <w:p>
+      <w:pPr>
+        <w:spacing w:after="120"/>
+      </w:pPr>
+      <w:r>
+        <w:rPr>
+          <w:rFonts w:ascii="Times New Roman" w:hAnsi="Times New Roman" w:cs="Times New Roman" w:eastAsia="Times New Roman"/>
+        </w:rPr>
+        <w:t>• res.json() mengubah respons menjadi objek, lalu json.hourly.time.map((t, i) =&gt; ({ time: t, temp: json.hourly.temperature_2m[i] })) menggabungkan dua array sejajar (berdasarkan indeks) menjadi satu list objek { time, temp } yang mudah di-loop.</w:t>
+      </w:r>
+    </w:p>
+    <w:p>
+      <w:pPr>
+        <w:spacing w:after="120"/>
+      </w:pPr>
+      <w:r>
+        <w:rPr>
+          <w:rFonts w:ascii="Times New Roman" w:hAnsi="Times New Roman" w:cs="Times New Roman" w:eastAsia="Times New Roman"/>
+        </w:rPr>
+        <w:t>• Satuan suhu diambil dari hourly_units.temperature_2m. Di HomePage.vue, fungsi ini dipanggil saat onMounted dan saat pull-to-refresh (ion-refresher).</w:t>
+      </w:r>
+    </w:p>
+    <w:p>
+      <w:pPr>
+        <w:keepNext/>
+        <w:spacing w:after="120"/>
+      </w:pPr>
+      <w:r>
+        <w:rPr>
+          <w:rFonts w:ascii="Times New Roman" w:hAnsi="Times New Roman" w:cs="Times New Roman" w:eastAsia="Times New Roman"/>
+          <w:b/>
+        </w:rPr>
+        <w:t>4. Filter data (computed) – src/views/HomePage.vue</w:t>
       </w:r>
     </w:p>
     <w:p>
@@ -4003,7 +2091,7 @@
           <w:rFonts w:ascii="Courier New" w:hAnsi="Courier New" w:cs="Courier New" w:eastAsia="Courier New"/>
           <w:sz w:val="18"/>
         </w:rPr>
-        <w:t xml:space="preserve">          } catch (e) {</w:t>
+        <w:t>// Daftar tanggal unik (7 hari)</w:t>
       </w:r>
     </w:p>
     <w:p>
@@ -4017,7 +2105,7 @@
           <w:rFonts w:ascii="Courier New" w:hAnsi="Courier New" w:cs="Courier New" w:eastAsia="Courier New"/>
           <w:sz w:val="18"/>
         </w:rPr>
-        <w:t xml:space="preserve">            error.value = e.message;</w:t>
+        <w:t>const days = computed(() =&gt; [...new Set(data.value.map((d) =&gt; d.time.slice(0, 10)))]);</w:t>
       </w:r>
     </w:p>
     <w:p>
@@ -4031,7 +2119,7 @@
           <w:rFonts w:ascii="Courier New" w:hAnsi="Courier New" w:cs="Courier New" w:eastAsia="Courier New"/>
           <w:sz w:val="18"/>
         </w:rPr>
-        <w:t xml:space="preserve">          } finally {</w:t>
+        <w:t>// Data untuk tanggal terpilih (24 jam)</w:t>
       </w:r>
     </w:p>
     <w:p>
@@ -4045,7 +2133,7 @@
           <w:rFonts w:ascii="Courier New" w:hAnsi="Courier New" w:cs="Courier New" w:eastAsia="Courier New"/>
           <w:sz w:val="18"/>
         </w:rPr>
-        <w:t xml:space="preserve">            loading.value = false;</w:t>
+        <w:t>const filtered = computed(() =&gt; data.value.filter((d) =&gt; d.time.startsWith(selectedDay.value)));</w:t>
       </w:r>
     </w:p>
     <w:p>
@@ -4059,11 +2147,12 @@
           <w:rFonts w:ascii="Courier New" w:hAnsi="Courier New" w:cs="Courier New" w:eastAsia="Courier New"/>
           <w:sz w:val="18"/>
         </w:rPr>
-        <w:t xml:space="preserve">          }</w:t>
-      </w:r>
-    </w:p>
-    <w:p>
-      <w:pPr>
+        <w:t>// Ringkasan min / rata-rata / max</w:t>
+      </w:r>
+    </w:p>
+    <w:p>
+      <w:pPr>
+        <w:keepNext/>
         <w:spacing w:after="0"/>
         <w:shd w:val="clear" w:color="auto" w:fill="F2F2F2"/>
       </w:pPr>
@@ -4072,223 +2161,7 @@
           <w:rFonts w:ascii="Courier New" w:hAnsi="Courier New" w:cs="Courier New" w:eastAsia="Courier New"/>
           <w:sz w:val="18"/>
         </w:rPr>
-        <w:t xml:space="preserve">        }</w:t>
-      </w:r>
-    </w:p>
-    <w:p>
-      <w:pPr>
-        <w:spacing w:after="120"/>
-      </w:pPr>
-    </w:p>
-    <w:p>
-      <w:pPr>
-        <w:spacing w:after="120"/>
-      </w:pPr>
-      <w:r>
-        <w:rPr>
-          <w:rFonts w:ascii="Times New Roman" w:hAnsi="Times New Roman" w:cs="Times New Roman" w:eastAsia="Times New Roman"/>
-        </w:rPr>
-        <w:t xml:space="preserve">• </w:t>
-      </w:r>
-      <w:r>
-        <w:rPr>
-          <w:rFonts w:ascii="Courier New" w:hAnsi="Courier New" w:cs="Courier New" w:eastAsia="Courier New"/>
-        </w:rPr>
-        <w:t xml:space="preserve">async/await</w:t>
-      </w:r>
-      <w:r>
-        <w:rPr>
-          <w:rFonts w:ascii="Times New Roman" w:hAnsi="Times New Roman" w:cs="Times New Roman" w:eastAsia="Times New Roman"/>
-        </w:rPr>
-        <w:t xml:space="preserve"> dipakai supaya kode menunggu respons API tanpa membekukan tampilan.</w:t>
-      </w:r>
-    </w:p>
-    <w:p>
-      <w:pPr>
-        <w:spacing w:after="120"/>
-      </w:pPr>
-      <w:r>
-        <w:rPr>
-          <w:rFonts w:ascii="Times New Roman" w:hAnsi="Times New Roman" w:cs="Times New Roman" w:eastAsia="Times New Roman"/>
-        </w:rPr>
-        <w:t xml:space="preserve">• </w:t>
-      </w:r>
-      <w:r>
-        <w:rPr>
-          <w:rFonts w:ascii="Courier New" w:hAnsi="Courier New" w:cs="Courier New" w:eastAsia="Courier New"/>
-        </w:rPr>
-        <w:t xml:space="preserve">res.ok</w:t>
-      </w:r>
-      <w:r>
-        <w:rPr>
-          <w:rFonts w:ascii="Times New Roman" w:hAnsi="Times New Roman" w:cs="Times New Roman" w:eastAsia="Times New Roman"/>
-        </w:rPr>
-        <w:t xml:space="preserve"> dicek dulu. Jika status HTTP bukan 2xx, dibuat error yang ditangkap </w:t>
-      </w:r>
-      <w:r>
-        <w:rPr>
-          <w:rFonts w:ascii="Courier New" w:hAnsi="Courier New" w:cs="Courier New" w:eastAsia="Courier New"/>
-        </w:rPr>
-        <w:t xml:space="preserve">catch</w:t>
-      </w:r>
-      <w:r>
-        <w:rPr>
-          <w:rFonts w:ascii="Times New Roman" w:hAnsi="Times New Roman" w:cs="Times New Roman" w:eastAsia="Times New Roman"/>
-        </w:rPr>
-        <w:t xml:space="preserve"> dan ditampilkan ke pengguna.</w:t>
-      </w:r>
-    </w:p>
-    <w:p>
-      <w:pPr>
-        <w:spacing w:after="120"/>
-      </w:pPr>
-      <w:r>
-        <w:rPr>
-          <w:rFonts w:ascii="Times New Roman" w:hAnsi="Times New Roman" w:cs="Times New Roman" w:eastAsia="Times New Roman"/>
-        </w:rPr>
-        <w:t xml:space="preserve">• </w:t>
-      </w:r>
-      <w:r>
-        <w:rPr>
-          <w:rFonts w:ascii="Courier New" w:hAnsi="Courier New" w:cs="Courier New" w:eastAsia="Courier New"/>
-        </w:rPr>
-        <w:t xml:space="preserve">json.hourly.time.map((t, i) =&gt; ({ time: t, temp: json.hourly.temperature_2m[i] }))</w:t>
-      </w:r>
-      <w:r>
-        <w:rPr>
-          <w:rFonts w:ascii="Times New Roman" w:hAnsi="Times New Roman" w:cs="Times New Roman" w:eastAsia="Times New Roman"/>
-        </w:rPr>
-        <w:t xml:space="preserve"> menggabungkan dua array yang terpisah menjadi satu list objek </w:t>
-      </w:r>
-      <w:r>
-        <w:rPr>
-          <w:rFonts w:ascii="Courier New" w:hAnsi="Courier New" w:cs="Courier New" w:eastAsia="Courier New"/>
-        </w:rPr>
-        <w:t xml:space="preserve">{ time, temp }</w:t>
-      </w:r>
-      <w:r>
-        <w:rPr>
-          <w:rFonts w:ascii="Times New Roman" w:hAnsi="Times New Roman" w:cs="Times New Roman" w:eastAsia="Times New Roman"/>
-        </w:rPr>
-        <w:t xml:space="preserve">, karena index ke-i pada </w:t>
-      </w:r>
-      <w:r>
-        <w:rPr>
-          <w:rFonts w:ascii="Courier New" w:hAnsi="Courier New" w:cs="Courier New" w:eastAsia="Courier New"/>
-        </w:rPr>
-        <w:t xml:space="preserve">time</w:t>
-      </w:r>
-      <w:r>
-        <w:rPr>
-          <w:rFonts w:ascii="Times New Roman" w:hAnsi="Times New Roman" w:cs="Times New Roman" w:eastAsia="Times New Roman"/>
-        </w:rPr>
-        <w:t xml:space="preserve"> berpasangan dengan index ke-i pada </w:t>
-      </w:r>
-      <w:r>
-        <w:rPr>
-          <w:rFonts w:ascii="Courier New" w:hAnsi="Courier New" w:cs="Courier New" w:eastAsia="Courier New"/>
-        </w:rPr>
-        <w:t xml:space="preserve">temperature_2m</w:t>
-      </w:r>
-      <w:r>
-        <w:rPr>
-          <w:rFonts w:ascii="Times New Roman" w:hAnsi="Times New Roman" w:cs="Times New Roman" w:eastAsia="Times New Roman"/>
-        </w:rPr>
-        <w:t xml:space="preserve">. Bentuk ini lebih mudah ditampilkan dengan </w:t>
-      </w:r>
-      <w:r>
-        <w:rPr>
-          <w:rFonts w:ascii="Courier New" w:hAnsi="Courier New" w:cs="Courier New" w:eastAsia="Courier New"/>
-        </w:rPr>
-        <w:t xml:space="preserve">v-for</w:t>
-      </w:r>
-      <w:r>
-        <w:rPr>
-          <w:rFonts w:ascii="Times New Roman" w:hAnsi="Times New Roman" w:cs="Times New Roman" w:eastAsia="Times New Roman"/>
-        </w:rPr>
-        <w:t xml:space="preserve">.</w:t>
-      </w:r>
-    </w:p>
-    <w:p>
-      <w:pPr>
-        <w:spacing w:after="120"/>
-      </w:pPr>
-      <w:r>
-        <w:rPr>
-          <w:rFonts w:ascii="Times New Roman" w:hAnsi="Times New Roman" w:cs="Times New Roman" w:eastAsia="Times New Roman"/>
-        </w:rPr>
-        <w:t xml:space="preserve">• </w:t>
-      </w:r>
-      <w:r>
-        <w:rPr>
-          <w:rFonts w:ascii="Times New Roman" w:hAnsi="Times New Roman" w:cs="Times New Roman" w:eastAsia="Times New Roman"/>
-        </w:rPr>
-        <w:t xml:space="preserve">Satuan suhu diambil dari </w:t>
-      </w:r>
-      <w:r>
-        <w:rPr>
-          <w:rFonts w:ascii="Courier New" w:hAnsi="Courier New" w:cs="Courier New" w:eastAsia="Courier New"/>
-        </w:rPr>
-        <w:t xml:space="preserve">hourly_units.temperature_2m</w:t>
-      </w:r>
-      <w:r>
-        <w:rPr>
-          <w:rFonts w:ascii="Times New Roman" w:hAnsi="Times New Roman" w:cs="Times New Roman" w:eastAsia="Times New Roman"/>
-        </w:rPr>
-        <w:t xml:space="preserve"> (bukan ditulis manual), dan tanggal pertama dipilih otomatis sebagai </w:t>
-      </w:r>
-      <w:r>
-        <w:rPr>
-          <w:rFonts w:ascii="Courier New" w:hAnsi="Courier New" w:cs="Courier New" w:eastAsia="Courier New"/>
-        </w:rPr>
-        <w:t xml:space="preserve">selectedDay</w:t>
-      </w:r>
-      <w:r>
-        <w:rPr>
-          <w:rFonts w:ascii="Times New Roman" w:hAnsi="Times New Roman" w:cs="Times New Roman" w:eastAsia="Times New Roman"/>
-        </w:rPr>
-        <w:t xml:space="preserve">.</w:t>
-      </w:r>
-    </w:p>
-    <w:p>
-      <w:pPr>
-        <w:spacing w:after="120"/>
-      </w:pPr>
-      <w:r>
-        <w:rPr>
-          <w:rFonts w:ascii="Times New Roman" w:hAnsi="Times New Roman" w:cs="Times New Roman" w:eastAsia="Times New Roman"/>
-        </w:rPr>
-        <w:t xml:space="preserve">• </w:t>
-      </w:r>
-      <w:r>
-        <w:rPr>
-          <w:rFonts w:ascii="Times New Roman" w:hAnsi="Times New Roman" w:cs="Times New Roman" w:eastAsia="Times New Roman"/>
-        </w:rPr>
-        <w:t xml:space="preserve">Blok </w:t>
-      </w:r>
-      <w:r>
-        <w:rPr>
-          <w:rFonts w:ascii="Courier New" w:hAnsi="Courier New" w:cs="Courier New" w:eastAsia="Courier New"/>
-        </w:rPr>
-        <w:t xml:space="preserve">finally</w:t>
-      </w:r>
-      <w:r>
-        <w:rPr>
-          <w:rFonts w:ascii="Times New Roman" w:hAnsi="Times New Roman" w:cs="Times New Roman" w:eastAsia="Times New Roman"/>
-        </w:rPr>
-        <w:t xml:space="preserve"> mematikan status loading, baik berhasil maupun gagal.</w:t>
-      </w:r>
-    </w:p>
-    <w:p>
-      <w:pPr>
-        <w:keepNext/>
-        <w:spacing w:after="120"/>
-      </w:pPr>
-      <w:r>
-        <w:rPr>
-          <w:rFonts w:ascii="Times New Roman" w:hAnsi="Times New Roman" w:cs="Times New Roman" w:eastAsia="Times New Roman"/>
-        </w:rPr>
-        <w:t xml:space="preserve">Status loading dan error ditampilkan dengan conditional rendering:</w:t>
+        <w:t>const temps = computed(() =&gt; filtered.value.map((d) =&gt; d.temp));</w:t>
       </w:r>
     </w:p>
     <w:p>
@@ -4302,7 +2175,7 @@
           <w:rFonts w:ascii="Courier New" w:hAnsi="Courier New" w:cs="Courier New" w:eastAsia="Courier New"/>
           <w:sz w:val="18"/>
         </w:rPr>
-        <w:t xml:space="preserve">    &lt;div v-if="loading" class="state"&gt;Memuat data cuaca...&lt;/div&gt;</w:t>
+        <w:t>const minTemp = computed(() =&gt; Math.min(...temps.value).toFixed(1));</w:t>
       </w:r>
     </w:p>
     <w:p>
@@ -4316,7 +2189,7 @@
           <w:rFonts w:ascii="Courier New" w:hAnsi="Courier New" w:cs="Courier New" w:eastAsia="Courier New"/>
           <w:sz w:val="18"/>
         </w:rPr>
-        <w:t xml:space="preserve">    &lt;div v-else-if="error" class="state"&gt;</w:t>
+        <w:t>const maxTemp = computed(() =&gt; Math.max(...temps.value).toFixed(1));</w:t>
       </w:r>
     </w:p>
     <w:p>
@@ -4330,7 +2203,7 @@
           <w:rFonts w:ascii="Courier New" w:hAnsi="Courier New" w:cs="Courier New" w:eastAsia="Courier New"/>
           <w:sz w:val="18"/>
         </w:rPr>
-        <w:t xml:space="preserve">      Gagal mengambil data: {{ error }}&lt;br /&gt;</w:t>
+        <w:t>const avgTemp = computed(() =&gt; (temps.value.reduce((a, b) =&gt; a + b, 0) / (temps.value.length || 1)).toFixed(1));</w:t>
       </w:r>
     </w:p>
     <w:p>
@@ -4344,7 +2217,63 @@
           <w:rFonts w:ascii="Courier New" w:hAnsi="Courier New" w:cs="Courier New" w:eastAsia="Courier New"/>
           <w:sz w:val="18"/>
         </w:rPr>
-        <w:t xml:space="preserve">      &lt;button @click="fetchCuaca"&gt;Coba lagi&lt;/button&gt;</w:t>
+      </w:r>
+    </w:p>
+    <w:p>
+      <w:pPr>
+        <w:spacing w:after="120"/>
+      </w:pPr>
+      <w:r>
+        <w:rPr>
+          <w:rFonts w:ascii="Times New Roman" w:hAnsi="Times New Roman" w:cs="Times New Roman" w:eastAsia="Times New Roman"/>
+        </w:rPr>
+        <w:t>• days: 10 karakter pertama time (tanggal) diambil dari 168 data, lalu new Set menghapus duplikat, hasilnya 7 tanggal untuk tab hari.</w:t>
+      </w:r>
+    </w:p>
+    <w:p>
+      <w:pPr>
+        <w:spacing w:after="120"/>
+      </w:pPr>
+      <w:r>
+        <w:rPr>
+          <w:rFonts w:ascii="Times New Roman" w:hAnsi="Times New Roman" w:cs="Times New Roman" w:eastAsia="Times New Roman"/>
+        </w:rPr>
+        <w:t>• filtered: hanya data yang time-nya diawali selectedDay, yaitu 24 baris per hari, sehingga daftar tidak terlalu panjang di layar HP.</w:t>
+      </w:r>
+    </w:p>
+    <w:p>
+      <w:pPr>
+        <w:spacing w:after="120"/>
+      </w:pPr>
+      <w:r>
+        <w:rPr>
+          <w:rFonts w:ascii="Times New Roman" w:hAnsi="Times New Roman" w:cs="Times New Roman" w:eastAsia="Times New Roman"/>
+        </w:rPr>
+        <w:t>• minTemp, maxTemp, avgTemp: suhu minimum, maksimum, dan rata-rata hari terpilih untuk ion-card ringkasan.</w:t>
+      </w:r>
+    </w:p>
+    <w:p>
+      <w:pPr>
+        <w:spacing w:after="120"/>
+      </w:pPr>
+      <w:r>
+        <w:rPr>
+          <w:rFonts w:ascii="Times New Roman" w:hAnsi="Times New Roman" w:cs="Times New Roman" w:eastAsia="Times New Roman"/>
+        </w:rPr>
+        <w:t>• Computed otomatis dihitung ulang hanya saat datanya berubah (misalnya tab hari diganti), dan hasilnya di-cache.</w:t>
+      </w:r>
+    </w:p>
+    <w:p>
+      <w:pPr>
+        <w:keepNext/>
+        <w:spacing w:after="120"/>
+      </w:pPr>
+      <w:r>
+        <w:rPr>
+          <w:rFonts w:ascii="Times New Roman" w:hAnsi="Times New Roman" w:cs="Times New Roman" w:eastAsia="Times New Roman"/>
+          <w:b/>
+        </w:rPr>
+        <w:t>5. Perulangan (v-for) di template Ionic</w:t>
       </w:r>
     </w:p>
     <w:p>
@@ -4358,7 +2287,7 @@
           <w:rFonts w:ascii="Courier New" w:hAnsi="Courier New" w:cs="Courier New" w:eastAsia="Courier New"/>
           <w:sz w:val="18"/>
         </w:rPr>
-        <w:t xml:space="preserve">    &lt;/div&gt;</w:t>
+        <w:t>&lt;ion-segment scrollable :value="selectedDay" @ionChange="selectedDay = String($event.detail.value)"&gt;</w:t>
       </w:r>
     </w:p>
     <w:p>
@@ -4372,11 +2301,12 @@
           <w:rFonts w:ascii="Courier New" w:hAnsi="Courier New" w:cs="Courier New" w:eastAsia="Courier New"/>
           <w:sz w:val="18"/>
         </w:rPr>
-        <w:t xml:space="preserve"/>
-      </w:r>
-    </w:p>
-    <w:p>
-      <w:pPr>
+        <w:t xml:space="preserve">  &lt;ion-segment-button v-for="d in days" :key="d" :value="d"&gt;</w:t>
+      </w:r>
+    </w:p>
+    <w:p>
+      <w:pPr>
+        <w:keepNext/>
         <w:spacing w:after="0"/>
         <w:shd w:val="clear" w:color="auto" w:fill="F2F2F2"/>
       </w:pPr>
@@ -4385,25 +2315,7 @@
           <w:rFonts w:ascii="Courier New" w:hAnsi="Courier New" w:cs="Courier New" w:eastAsia="Courier New"/>
           <w:sz w:val="18"/>
         </w:rPr>
-        <w:t xml:space="preserve">    &lt;template v-else&gt;</w:t>
-      </w:r>
-    </w:p>
-    <w:p>
-      <w:pPr>
-        <w:spacing w:after="120"/>
-      </w:pPr>
-    </w:p>
-    <w:p>
-      <w:pPr>
-        <w:keepNext/>
-        <w:spacing w:after="120"/>
-      </w:pPr>
-      <w:r>
-        <w:rPr>
-          <w:rFonts w:ascii="Times New Roman" w:hAnsi="Times New Roman" w:cs="Times New Roman" w:eastAsia="Times New Roman"/>
-          <w:b/>
-        </w:rPr>
-        <w:t xml:space="preserve">4. Computed property</w:t>
+        <w:t xml:space="preserve">    &lt;ion-label&gt;{{ formatDay(d) }}&lt;/ion-label&gt;</w:t>
       </w:r>
     </w:p>
     <w:p>
@@ -4415,9 +2327,9 @@
       <w:r>
         <w:rPr>
           <w:rFonts w:ascii="Courier New" w:hAnsi="Courier New" w:cs="Courier New" w:eastAsia="Courier New"/>
-          <w:sz w:val="17"/>
-        </w:rPr>
-        <w:t xml:space="preserve">        // Daftar tanggal unik (7 hari)</w:t>
+          <w:sz w:val="18"/>
+        </w:rPr>
+        <w:t xml:space="preserve">  &lt;/ion-segment-button&gt;</w:t>
       </w:r>
     </w:p>
     <w:p>
@@ -4429,9 +2341,9 @@
       <w:r>
         <w:rPr>
           <w:rFonts w:ascii="Courier New" w:hAnsi="Courier New" w:cs="Courier New" w:eastAsia="Courier New"/>
-          <w:sz w:val="17"/>
-        </w:rPr>
-        <w:t xml:space="preserve">        const days = computed(() =&gt; [...new Set(data.value.map(d =&gt; d.time.slice(0, 10)))]);</w:t>
+          <w:sz w:val="18"/>
+        </w:rPr>
+        <w:t>&lt;/ion-segment&gt;</w:t>
       </w:r>
     </w:p>
     <w:p>
@@ -4443,9 +2355,8 @@
       <w:r>
         <w:rPr>
           <w:rFonts w:ascii="Courier New" w:hAnsi="Courier New" w:cs="Courier New" w:eastAsia="Courier New"/>
-          <w:sz w:val="17"/>
-        </w:rPr>
-        <w:t xml:space="preserve">        // Data untuk tanggal yang dipilih (24 jam)</w:t>
+          <w:sz w:val="18"/>
+        </w:rPr>
       </w:r>
     </w:p>
     <w:p>
@@ -4457,9 +2368,9 @@
       <w:r>
         <w:rPr>
           <w:rFonts w:ascii="Courier New" w:hAnsi="Courier New" w:cs="Courier New" w:eastAsia="Courier New"/>
-          <w:sz w:val="17"/>
-        </w:rPr>
-        <w:t xml:space="preserve">        const filtered = computed(() =&gt; data.value.filter(d =&gt; d.time.startsWith(selectedDay.value)));</w:t>
+          <w:sz w:val="18"/>
+        </w:rPr>
+        <w:t>&lt;ion-list&gt;</w:t>
       </w:r>
     </w:p>
     <w:p>
@@ -4471,9 +2382,9 @@
       <w:r>
         <w:rPr>
           <w:rFonts w:ascii="Courier New" w:hAnsi="Courier New" w:cs="Courier New" w:eastAsia="Courier New"/>
-          <w:sz w:val="17"/>
-        </w:rPr>
-        <w:t xml:space="preserve"/>
+          <w:sz w:val="18"/>
+        </w:rPr>
+        <w:t xml:space="preserve">  &lt;ion-item v-for="item in filtered" :key="item.time" :class="{ now: item.time === currentHour }"&gt;</w:t>
       </w:r>
     </w:p>
     <w:p>
@@ -4485,9 +2396,9 @@
       <w:r>
         <w:rPr>
           <w:rFonts w:ascii="Courier New" w:hAnsi="Courier New" w:cs="Courier New" w:eastAsia="Courier New"/>
-          <w:sz w:val="17"/>
-        </w:rPr>
-        <w:t xml:space="preserve">        const temps = computed(() =&gt; filtered.value.map(d =&gt; d.temp));</w:t>
+          <w:sz w:val="18"/>
+        </w:rPr>
+        <w:t xml:space="preserve">    &lt;ion-label&gt;{{ formatJam(item.time) }}&lt;/ion-label&gt;</w:t>
       </w:r>
     </w:p>
     <w:p>
@@ -4499,9 +2410,9 @@
       <w:r>
         <w:rPr>
           <w:rFonts w:ascii="Courier New" w:hAnsi="Courier New" w:cs="Courier New" w:eastAsia="Courier New"/>
-          <w:sz w:val="17"/>
-        </w:rPr>
-        <w:t xml:space="preserve">        const minTemp = computed(() =&gt; Math.min(...temps.value).toFixed(1));</w:t>
+          <w:sz w:val="18"/>
+        </w:rPr>
+        <w:t xml:space="preserve">    &lt;ion-badge slot="end" :color="tempColor(item.temp)"&gt;{{ item.temp }} {{ unit }}&lt;/ion-badge&gt;</w:t>
       </w:r>
     </w:p>
     <w:p>
@@ -4513,186 +2424,23 @@
       <w:r>
         <w:rPr>
           <w:rFonts w:ascii="Courier New" w:hAnsi="Courier New" w:cs="Courier New" w:eastAsia="Courier New"/>
-          <w:sz w:val="17"/>
-        </w:rPr>
-        <w:t xml:space="preserve">        const maxTemp = computed(() =&gt; Math.max(...temps.value).toFixed(1));</w:t>
-      </w:r>
-    </w:p>
-    <w:p>
-      <w:pPr>
+          <w:sz w:val="18"/>
+        </w:rPr>
+        <w:t xml:space="preserve">  &lt;/ion-item&gt;</w:t>
+      </w:r>
+    </w:p>
+    <w:p>
+      <w:pPr>
+        <w:keepNext/>
         <w:spacing w:after="0"/>
         <w:shd w:val="clear" w:color="auto" w:fill="F2F2F2"/>
       </w:pPr>
       <w:r>
         <w:rPr>
           <w:rFonts w:ascii="Courier New" w:hAnsi="Courier New" w:cs="Courier New" w:eastAsia="Courier New"/>
-          <w:sz w:val="17"/>
-        </w:rPr>
-        <w:t xml:space="preserve">        const avgTemp = computed(() =&gt; (temps.value.reduce((a, b) =&gt; a + b, 0) / temps.value.length).toFixed(1));</w:t>
-      </w:r>
-    </w:p>
-    <w:p>
-      <w:pPr>
-        <w:spacing w:after="120"/>
-      </w:pPr>
-    </w:p>
-    <w:p>
-      <w:pPr>
-        <w:spacing w:after="120"/>
-      </w:pPr>
-      <w:r>
-        <w:rPr>
-          <w:rFonts w:ascii="Times New Roman" w:hAnsi="Times New Roman" w:cs="Times New Roman" w:eastAsia="Times New Roman"/>
-        </w:rPr>
-        <w:t xml:space="preserve">• </w:t>
-      </w:r>
-      <w:r>
-        <w:rPr>
-          <w:rFonts w:ascii="Courier New" w:hAnsi="Courier New" w:cs="Courier New" w:eastAsia="Courier New"/>
-        </w:rPr>
-        <w:t xml:space="preserve">days</w:t>
-      </w:r>
-      <w:r>
-        <w:rPr>
-          <w:rFonts w:ascii="Times New Roman" w:hAnsi="Times New Roman" w:cs="Times New Roman" w:eastAsia="Times New Roman"/>
-        </w:rPr>
-        <w:t xml:space="preserve">: daftar tanggal unik dari 168 data (diambil 10 karakter pertama </w:t>
-      </w:r>
-      <w:r>
-        <w:rPr>
-          <w:rFonts w:ascii="Courier New" w:hAnsi="Courier New" w:cs="Courier New" w:eastAsia="Courier New"/>
-        </w:rPr>
-        <w:t xml:space="preserve">time</w:t>
-      </w:r>
-      <w:r>
-        <w:rPr>
-          <w:rFonts w:ascii="Times New Roman" w:hAnsi="Times New Roman" w:cs="Times New Roman" w:eastAsia="Times New Roman"/>
-        </w:rPr>
-        <w:t xml:space="preserve">, lalu </w:t>
-      </w:r>
-      <w:r>
-        <w:rPr>
-          <w:rFonts w:ascii="Courier New" w:hAnsi="Courier New" w:cs="Courier New" w:eastAsia="Courier New"/>
-        </w:rPr>
-        <w:t xml:space="preserve">new Set</w:t>
-      </w:r>
-      <w:r>
-        <w:rPr>
-          <w:rFonts w:ascii="Times New Roman" w:hAnsi="Times New Roman" w:cs="Times New Roman" w:eastAsia="Times New Roman"/>
-        </w:rPr>
-        <w:t xml:space="preserve"> menghapus duplikat), hasilnya 7 tanggal untuk tombol pilihan hari.</w:t>
-      </w:r>
-    </w:p>
-    <w:p>
-      <w:pPr>
-        <w:spacing w:after="120"/>
-      </w:pPr>
-      <w:r>
-        <w:rPr>
-          <w:rFonts w:ascii="Times New Roman" w:hAnsi="Times New Roman" w:cs="Times New Roman" w:eastAsia="Times New Roman"/>
-        </w:rPr>
-        <w:t xml:space="preserve">• </w:t>
-      </w:r>
-      <w:r>
-        <w:rPr>
-          <w:rFonts w:ascii="Courier New" w:hAnsi="Courier New" w:cs="Courier New" w:eastAsia="Courier New"/>
-        </w:rPr>
-        <w:t xml:space="preserve">filtered</w:t>
-      </w:r>
-      <w:r>
-        <w:rPr>
-          <w:rFonts w:ascii="Times New Roman" w:hAnsi="Times New Roman" w:cs="Times New Roman" w:eastAsia="Times New Roman"/>
-        </w:rPr>
-        <w:t xml:space="preserve">: hanya data yang tanggalnya sama dengan </w:t>
-      </w:r>
-      <w:r>
-        <w:rPr>
-          <w:rFonts w:ascii="Courier New" w:hAnsi="Courier New" w:cs="Courier New" w:eastAsia="Courier New"/>
-        </w:rPr>
-        <w:t xml:space="preserve">selectedDay</w:t>
-      </w:r>
-      <w:r>
-        <w:rPr>
-          <w:rFonts w:ascii="Times New Roman" w:hAnsi="Times New Roman" w:cs="Times New Roman" w:eastAsia="Times New Roman"/>
-        </w:rPr>
-        <w:t xml:space="preserve">, yaitu 24 baris per hari. Jadi tabel tidak terlalu panjang di layar HP.</w:t>
-      </w:r>
-    </w:p>
-    <w:p>
-      <w:pPr>
-        <w:spacing w:after="120"/>
-      </w:pPr>
-      <w:r>
-        <w:rPr>
-          <w:rFonts w:ascii="Times New Roman" w:hAnsi="Times New Roman" w:cs="Times New Roman" w:eastAsia="Times New Roman"/>
-        </w:rPr>
-        <w:t xml:space="preserve">• </w:t>
-      </w:r>
-      <w:r>
-        <w:rPr>
-          <w:rFonts w:ascii="Courier New" w:hAnsi="Courier New" w:cs="Courier New" w:eastAsia="Courier New"/>
-        </w:rPr>
-        <w:t xml:space="preserve">minTemp</w:t>
-      </w:r>
-      <w:r>
-        <w:rPr>
-          <w:rFonts w:ascii="Times New Roman" w:hAnsi="Times New Roman" w:cs="Times New Roman" w:eastAsia="Times New Roman"/>
-        </w:rPr>
-        <w:t xml:space="preserve">, </w:t>
-      </w:r>
-      <w:r>
-        <w:rPr>
-          <w:rFonts w:ascii="Courier New" w:hAnsi="Courier New" w:cs="Courier New" w:eastAsia="Courier New"/>
-        </w:rPr>
-        <w:t xml:space="preserve">maxTemp</w:t>
-      </w:r>
-      <w:r>
-        <w:rPr>
-          <w:rFonts w:ascii="Times New Roman" w:hAnsi="Times New Roman" w:cs="Times New Roman" w:eastAsia="Times New Roman"/>
-        </w:rPr>
-        <w:t xml:space="preserve">, </w:t>
-      </w:r>
-      <w:r>
-        <w:rPr>
-          <w:rFonts w:ascii="Courier New" w:hAnsi="Courier New" w:cs="Courier New" w:eastAsia="Courier New"/>
-        </w:rPr>
-        <w:t xml:space="preserve">avgTemp</w:t>
-      </w:r>
-      <w:r>
-        <w:rPr>
-          <w:rFonts w:ascii="Times New Roman" w:hAnsi="Times New Roman" w:cs="Times New Roman" w:eastAsia="Times New Roman"/>
-        </w:rPr>
-        <w:t xml:space="preserve">: suhu minimum, maksimum, dan rata-rata hari terpilih untuk kartu ringkasan.</w:t>
-      </w:r>
-    </w:p>
-    <w:p>
-      <w:pPr>
-        <w:spacing w:after="120"/>
-      </w:pPr>
-      <w:r>
-        <w:rPr>
-          <w:rFonts w:ascii="Times New Roman" w:hAnsi="Times New Roman" w:cs="Times New Roman" w:eastAsia="Times New Roman"/>
-        </w:rPr>
-        <w:t xml:space="preserve">• </w:t>
-      </w:r>
-      <w:r>
-        <w:rPr>
-          <w:rFonts w:ascii="Times New Roman" w:hAnsi="Times New Roman" w:cs="Times New Roman" w:eastAsia="Times New Roman"/>
-        </w:rPr>
-        <w:t xml:space="preserve">Computed otomatis dihitung ulang hanya saat datanya berubah (misalnya tombol tanggal diklik), dan hasilnya di-cache.</w:t>
-      </w:r>
-    </w:p>
-    <w:p>
-      <w:pPr>
-        <w:keepNext/>
-        <w:spacing w:after="120"/>
-      </w:pPr>
-      <w:r>
-        <w:rPr>
-          <w:rFonts w:ascii="Times New Roman" w:hAnsi="Times New Roman" w:cs="Times New Roman" w:eastAsia="Times New Roman"/>
-          <w:b/>
-        </w:rPr>
-        <w:t xml:space="preserve">5. Template: v-for, binding, dan event</w:t>
+          <w:sz w:val="18"/>
+        </w:rPr>
+        <w:t>&lt;/ion-list&gt;</w:t>
       </w:r>
     </w:p>
     <w:p>
@@ -4704,441 +2452,52 @@
       <w:r>
         <w:rPr>
           <w:rFonts w:ascii="Courier New" w:hAnsi="Courier New" w:cs="Courier New" w:eastAsia="Courier New"/>
-          <w:sz w:val="17"/>
-        </w:rPr>
-        <w:t xml:space="preserve">      &lt;nav class="days"&gt;</w:t>
-      </w:r>
-    </w:p>
-    <w:p>
-      <w:pPr>
-        <w:keepNext/>
-        <w:spacing w:after="0"/>
-        <w:shd w:val="clear" w:color="auto" w:fill="F2F2F2"/>
-      </w:pPr>
-      <w:r>
-        <w:rPr>
-          <w:rFonts w:ascii="Courier New" w:hAnsi="Courier New" w:cs="Courier New" w:eastAsia="Courier New"/>
-          <w:sz w:val="17"/>
-        </w:rPr>
-        <w:t xml:space="preserve">        &lt;button v-for="d in days" :key="d" :class="{ active: d === selectedDay }" @click="selectedDay = d"&gt;</w:t>
-      </w:r>
-    </w:p>
-    <w:p>
-      <w:pPr>
-        <w:keepNext/>
-        <w:spacing w:after="0"/>
-        <w:shd w:val="clear" w:color="auto" w:fill="F2F2F2"/>
-      </w:pPr>
-      <w:r>
-        <w:rPr>
-          <w:rFonts w:ascii="Courier New" w:hAnsi="Courier New" w:cs="Courier New" w:eastAsia="Courier New"/>
-          <w:sz w:val="17"/>
-        </w:rPr>
-        <w:t xml:space="preserve">          {{ formatDay(d) }}</w:t>
-      </w:r>
-    </w:p>
-    <w:p>
-      <w:pPr>
-        <w:keepNext/>
-        <w:spacing w:after="0"/>
-        <w:shd w:val="clear" w:color="auto" w:fill="F2F2F2"/>
-      </w:pPr>
-      <w:r>
-        <w:rPr>
-          <w:rFonts w:ascii="Courier New" w:hAnsi="Courier New" w:cs="Courier New" w:eastAsia="Courier New"/>
-          <w:sz w:val="17"/>
-        </w:rPr>
-        <w:t xml:space="preserve">        &lt;/button&gt;</w:t>
-      </w:r>
-    </w:p>
-    <w:p>
-      <w:pPr>
-        <w:keepNext/>
-        <w:spacing w:after="0"/>
-        <w:shd w:val="clear" w:color="auto" w:fill="F2F2F2"/>
-      </w:pPr>
-      <w:r>
-        <w:rPr>
-          <w:rFonts w:ascii="Courier New" w:hAnsi="Courier New" w:cs="Courier New" w:eastAsia="Courier New"/>
-          <w:sz w:val="17"/>
-        </w:rPr>
-        <w:t xml:space="preserve">      &lt;/nav&gt;</w:t>
-      </w:r>
-    </w:p>
-    <w:p>
-      <w:pPr>
-        <w:keepNext/>
-        <w:spacing w:after="0"/>
-        <w:shd w:val="clear" w:color="auto" w:fill="F2F2F2"/>
-      </w:pPr>
-      <w:r>
-        <w:rPr>
-          <w:rFonts w:ascii="Courier New" w:hAnsi="Courier New" w:cs="Courier New" w:eastAsia="Courier New"/>
-          <w:sz w:val="17"/>
-        </w:rPr>
-        <w:t xml:space="preserve">      &lt;table&gt;</w:t>
-      </w:r>
-    </w:p>
-    <w:p>
-      <w:pPr>
-        <w:keepNext/>
-        <w:spacing w:after="0"/>
-        <w:shd w:val="clear" w:color="auto" w:fill="F2F2F2"/>
-      </w:pPr>
-      <w:r>
-        <w:rPr>
-          <w:rFonts w:ascii="Courier New" w:hAnsi="Courier New" w:cs="Courier New" w:eastAsia="Courier New"/>
-          <w:sz w:val="17"/>
-        </w:rPr>
-        <w:t xml:space="preserve">        &lt;thead&gt;</w:t>
-      </w:r>
-    </w:p>
-    <w:p>
-      <w:pPr>
-        <w:keepNext/>
-        <w:spacing w:after="0"/>
-        <w:shd w:val="clear" w:color="auto" w:fill="F2F2F2"/>
-      </w:pPr>
-      <w:r>
-        <w:rPr>
-          <w:rFonts w:ascii="Courier New" w:hAnsi="Courier New" w:cs="Courier New" w:eastAsia="Courier New"/>
-          <w:sz w:val="17"/>
-        </w:rPr>
-        <w:t xml:space="preserve">          &lt;tr&gt;&lt;th&gt;Waktu (time)&lt;/th&gt;&lt;th&gt;Suhu (temperature_2m)&lt;/th&gt;&lt;/tr&gt;</w:t>
-      </w:r>
-    </w:p>
-    <w:p>
-      <w:pPr>
-        <w:keepNext/>
-        <w:spacing w:after="0"/>
-        <w:shd w:val="clear" w:color="auto" w:fill="F2F2F2"/>
-      </w:pPr>
-      <w:r>
-        <w:rPr>
-          <w:rFonts w:ascii="Courier New" w:hAnsi="Courier New" w:cs="Courier New" w:eastAsia="Courier New"/>
-          <w:sz w:val="17"/>
-        </w:rPr>
-        <w:t xml:space="preserve">        &lt;/thead&gt;</w:t>
-      </w:r>
-    </w:p>
-    <w:p>
-      <w:pPr>
-        <w:keepNext/>
-        <w:spacing w:after="0"/>
-        <w:shd w:val="clear" w:color="auto" w:fill="F2F2F2"/>
-      </w:pPr>
-      <w:r>
-        <w:rPr>
-          <w:rFonts w:ascii="Courier New" w:hAnsi="Courier New" w:cs="Courier New" w:eastAsia="Courier New"/>
-          <w:sz w:val="17"/>
-        </w:rPr>
-        <w:t xml:space="preserve">        &lt;tbody&gt;</w:t>
-      </w:r>
-    </w:p>
-    <w:p>
-      <w:pPr>
-        <w:keepNext/>
-        <w:spacing w:after="0"/>
-        <w:shd w:val="clear" w:color="auto" w:fill="F2F2F2"/>
-      </w:pPr>
-      <w:r>
-        <w:rPr>
-          <w:rFonts w:ascii="Courier New" w:hAnsi="Courier New" w:cs="Courier New" w:eastAsia="Courier New"/>
-          <w:sz w:val="17"/>
-        </w:rPr>
-        <w:t xml:space="preserve">          &lt;tr v-for="item in filtered" :key="item.time" :class="{ now: item.time === currentHour }"&gt;</w:t>
-      </w:r>
-    </w:p>
-    <w:p>
-      <w:pPr>
-        <w:keepNext/>
-        <w:spacing w:after="0"/>
-        <w:shd w:val="clear" w:color="auto" w:fill="F2F2F2"/>
-      </w:pPr>
-      <w:r>
-        <w:rPr>
-          <w:rFonts w:ascii="Courier New" w:hAnsi="Courier New" w:cs="Courier New" w:eastAsia="Courier New"/>
-          <w:sz w:val="17"/>
-        </w:rPr>
-        <w:t xml:space="preserve">            &lt;td&gt;{{ formatJam(item.time) }}&lt;/td&gt;</w:t>
-      </w:r>
-    </w:p>
-    <w:p>
-      <w:pPr>
-        <w:keepNext/>
-        <w:spacing w:after="0"/>
-        <w:shd w:val="clear" w:color="auto" w:fill="F2F2F2"/>
-      </w:pPr>
-      <w:r>
-        <w:rPr>
-          <w:rFonts w:ascii="Courier New" w:hAnsi="Courier New" w:cs="Courier New" w:eastAsia="Courier New"/>
-          <w:sz w:val="17"/>
-        </w:rPr>
-        <w:t xml:space="preserve">            &lt;td class="temp" :class="tempClass(item.temp)"&gt;{{ item.temp }} {{ unit }}&lt;/td&gt;</w:t>
-      </w:r>
-    </w:p>
-    <w:p>
-      <w:pPr>
-        <w:keepNext/>
-        <w:spacing w:after="0"/>
-        <w:shd w:val="clear" w:color="auto" w:fill="F2F2F2"/>
-      </w:pPr>
-      <w:r>
-        <w:rPr>
-          <w:rFonts w:ascii="Courier New" w:hAnsi="Courier New" w:cs="Courier New" w:eastAsia="Courier New"/>
-          <w:sz w:val="17"/>
-        </w:rPr>
-        <w:t xml:space="preserve">          &lt;/tr&gt;</w:t>
-      </w:r>
-    </w:p>
-    <w:p>
-      <w:pPr>
-        <w:keepNext/>
-        <w:spacing w:after="0"/>
-        <w:shd w:val="clear" w:color="auto" w:fill="F2F2F2"/>
-      </w:pPr>
-      <w:r>
-        <w:rPr>
-          <w:rFonts w:ascii="Courier New" w:hAnsi="Courier New" w:cs="Courier New" w:eastAsia="Courier New"/>
-          <w:sz w:val="17"/>
-        </w:rPr>
-        <w:t xml:space="preserve">        &lt;/tbody&gt;</w:t>
-      </w:r>
-    </w:p>
-    <w:p>
-      <w:pPr>
-        <w:spacing w:after="0"/>
-        <w:shd w:val="clear" w:color="auto" w:fill="F2F2F2"/>
-      </w:pPr>
-      <w:r>
-        <w:rPr>
-          <w:rFonts w:ascii="Courier New" w:hAnsi="Courier New" w:cs="Courier New" w:eastAsia="Courier New"/>
-          <w:sz w:val="17"/>
-        </w:rPr>
-        <w:t xml:space="preserve">      &lt;/table&gt;</w:t>
-      </w:r>
-    </w:p>
-    <w:p>
-      <w:pPr>
-        <w:spacing w:after="120"/>
-      </w:pPr>
-    </w:p>
-    <w:p>
-      <w:pPr>
-        <w:spacing w:after="120"/>
-      </w:pPr>
-      <w:r>
-        <w:rPr>
-          <w:rFonts w:ascii="Times New Roman" w:hAnsi="Times New Roman" w:cs="Times New Roman" w:eastAsia="Times New Roman"/>
-        </w:rPr>
-        <w:t xml:space="preserve">• </w:t>
-      </w:r>
-      <w:r>
-        <w:rPr>
-          <w:rFonts w:ascii="Courier New" w:hAnsi="Courier New" w:cs="Courier New" w:eastAsia="Courier New"/>
-        </w:rPr>
-        <w:t xml:space="preserve">v-for="d in days"</w:t>
-      </w:r>
-      <w:r>
-        <w:rPr>
-          <w:rFonts w:ascii="Times New Roman" w:hAnsi="Times New Roman" w:cs="Times New Roman" w:eastAsia="Times New Roman"/>
-        </w:rPr>
-        <w:t xml:space="preserve"> membuat tombol untuk setiap tanggal. </w:t>
-      </w:r>
-      <w:r>
-        <w:rPr>
-          <w:rFonts w:ascii="Courier New" w:hAnsi="Courier New" w:cs="Courier New" w:eastAsia="Courier New"/>
-        </w:rPr>
-        <w:t xml:space="preserve">@click="selectedDay = d"</w:t>
-      </w:r>
-      <w:r>
-        <w:rPr>
-          <w:rFonts w:ascii="Times New Roman" w:hAnsi="Times New Roman" w:cs="Times New Roman" w:eastAsia="Times New Roman"/>
-        </w:rPr>
-        <w:t xml:space="preserve"> mengganti hari, dan </w:t>
-      </w:r>
-      <w:r>
-        <w:rPr>
-          <w:rFonts w:ascii="Courier New" w:hAnsi="Courier New" w:cs="Courier New" w:eastAsia="Courier New"/>
-        </w:rPr>
-        <w:t xml:space="preserve">:class="{ active: ... }"</w:t>
-      </w:r>
-      <w:r>
-        <w:rPr>
-          <w:rFonts w:ascii="Times New Roman" w:hAnsi="Times New Roman" w:cs="Times New Roman" w:eastAsia="Times New Roman"/>
-        </w:rPr>
-        <w:t xml:space="preserve"> mewarnai tombol yang sedang dipilih.</w:t>
-      </w:r>
-    </w:p>
-    <w:p>
-      <w:pPr>
-        <w:spacing w:after="120"/>
-      </w:pPr>
-      <w:r>
-        <w:rPr>
-          <w:rFonts w:ascii="Times New Roman" w:hAnsi="Times New Roman" w:cs="Times New Roman" w:eastAsia="Times New Roman"/>
-        </w:rPr>
-        <w:t xml:space="preserve">• </w:t>
-      </w:r>
-      <w:r>
-        <w:rPr>
-          <w:rFonts w:ascii="Courier New" w:hAnsi="Courier New" w:cs="Courier New" w:eastAsia="Courier New"/>
-        </w:rPr>
-        <w:t xml:space="preserve">v-for="item in filtered" :key="item.time"</w:t>
-      </w:r>
-      <w:r>
-        <w:rPr>
-          <w:rFonts w:ascii="Times New Roman" w:hAnsi="Times New Roman" w:cs="Times New Roman" w:eastAsia="Times New Roman"/>
-        </w:rPr>
-        <w:t xml:space="preserve"> membuat satu baris tabel per jam. </w:t>
-      </w:r>
-      <w:r>
-        <w:rPr>
-          <w:rFonts w:ascii="Courier New" w:hAnsi="Courier New" w:cs="Courier New" w:eastAsia="Courier New"/>
-        </w:rPr>
-        <w:t xml:space="preserve">:key</w:t>
-      </w:r>
-      <w:r>
-        <w:rPr>
-          <w:rFonts w:ascii="Times New Roman" w:hAnsi="Times New Roman" w:cs="Times New Roman" w:eastAsia="Times New Roman"/>
-        </w:rPr>
-        <w:t xml:space="preserve"> memakai </w:t>
-      </w:r>
-      <w:r>
-        <w:rPr>
-          <w:rFonts w:ascii="Courier New" w:hAnsi="Courier New" w:cs="Courier New" w:eastAsia="Courier New"/>
-        </w:rPr>
-        <w:t xml:space="preserve">time</w:t>
-      </w:r>
-      <w:r>
-        <w:rPr>
-          <w:rFonts w:ascii="Times New Roman" w:hAnsi="Times New Roman" w:cs="Times New Roman" w:eastAsia="Times New Roman"/>
-        </w:rPr>
-        <w:t xml:space="preserve"> karena nilainya unik.</w:t>
-      </w:r>
-    </w:p>
-    <w:p>
-      <w:pPr>
-        <w:spacing w:after="120"/>
-      </w:pPr>
-      <w:r>
-        <w:rPr>
-          <w:rFonts w:ascii="Times New Roman" w:hAnsi="Times New Roman" w:cs="Times New Roman" w:eastAsia="Times New Roman"/>
-        </w:rPr>
-        <w:t xml:space="preserve">• </w:t>
-      </w:r>
-      <w:r>
-        <w:rPr>
-          <w:rFonts w:ascii="Times New Roman" w:hAnsi="Times New Roman" w:cs="Times New Roman" w:eastAsia="Times New Roman"/>
-        </w:rPr>
-        <w:t xml:space="preserve">Kolom kiri menampilkan </w:t>
-      </w:r>
-      <w:r>
-        <w:rPr>
-          <w:rFonts w:ascii="Courier New" w:hAnsi="Courier New" w:cs="Courier New" w:eastAsia="Courier New"/>
-        </w:rPr>
-        <w:t xml:space="preserve">time</w:t>
-      </w:r>
-      <w:r>
-        <w:rPr>
-          <w:rFonts w:ascii="Times New Roman" w:hAnsi="Times New Roman" w:cs="Times New Roman" w:eastAsia="Times New Roman"/>
-        </w:rPr>
-        <w:t xml:space="preserve"> lewat </w:t>
-      </w:r>
-      <w:r>
-        <w:rPr>
-          <w:rFonts w:ascii="Courier New" w:hAnsi="Courier New" w:cs="Courier New" w:eastAsia="Courier New"/>
-        </w:rPr>
-        <w:t xml:space="preserve">formatJam()</w:t>
-      </w:r>
-      <w:r>
-        <w:rPr>
-          <w:rFonts w:ascii="Times New Roman" w:hAnsi="Times New Roman" w:cs="Times New Roman" w:eastAsia="Times New Roman"/>
-        </w:rPr>
-        <w:t xml:space="preserve"> (contoh </w:t>
-      </w:r>
-      <w:r>
-        <w:rPr>
-          <w:rFonts w:ascii="Courier New" w:hAnsi="Courier New" w:cs="Courier New" w:eastAsia="Courier New"/>
-        </w:rPr>
-        <w:t xml:space="preserve">2026-10-17T05:00</w:t>
-      </w:r>
-      <w:r>
-        <w:rPr>
-          <w:rFonts w:ascii="Times New Roman" w:hAnsi="Times New Roman" w:cs="Times New Roman" w:eastAsia="Times New Roman"/>
-        </w:rPr>
-        <w:t xml:space="preserve"> menjadi </w:t>
-      </w:r>
-      <w:r>
-        <w:rPr>
-          <w:rFonts w:ascii="Courier New" w:hAnsi="Courier New" w:cs="Courier New" w:eastAsia="Courier New"/>
-        </w:rPr>
-        <w:t xml:space="preserve">05:00 WIB</w:t>
-      </w:r>
-      <w:r>
-        <w:rPr>
-          <w:rFonts w:ascii="Times New Roman" w:hAnsi="Times New Roman" w:cs="Times New Roman" w:eastAsia="Times New Roman"/>
-        </w:rPr>
-        <w:t xml:space="preserve">). Kolom kanan menampilkan </w:t>
-      </w:r>
-      <w:r>
-        <w:rPr>
-          <w:rFonts w:ascii="Courier New" w:hAnsi="Courier New" w:cs="Courier New" w:eastAsia="Courier New"/>
-        </w:rPr>
-        <w:t xml:space="preserve">temperature_2m</w:t>
-      </w:r>
-      <w:r>
-        <w:rPr>
-          <w:rFonts w:ascii="Times New Roman" w:hAnsi="Times New Roman" w:cs="Times New Roman" w:eastAsia="Times New Roman"/>
-        </w:rPr>
-        <w:t xml:space="preserve"> beserta satuan </w:t>
-      </w:r>
-      <w:r>
-        <w:rPr>
-          <w:rFonts w:ascii="Courier New" w:hAnsi="Courier New" w:cs="Courier New" w:eastAsia="Courier New"/>
-        </w:rPr>
-        <w:t xml:space="preserve">°C</w:t>
-      </w:r>
-      <w:r>
-        <w:rPr>
-          <w:rFonts w:ascii="Times New Roman" w:hAnsi="Times New Roman" w:cs="Times New Roman" w:eastAsia="Times New Roman"/>
-        </w:rPr>
-        <w:t xml:space="preserve">.</w:t>
-      </w:r>
-    </w:p>
-    <w:p>
-      <w:pPr>
-        <w:spacing w:after="120"/>
-      </w:pPr>
-      <w:r>
-        <w:rPr>
-          <w:rFonts w:ascii="Times New Roman" w:hAnsi="Times New Roman" w:cs="Times New Roman" w:eastAsia="Times New Roman"/>
-        </w:rPr>
-        <w:t xml:space="preserve">• </w:t>
-      </w:r>
-      <w:r>
-        <w:rPr>
-          <w:rFonts w:ascii="Courier New" w:hAnsi="Courier New" w:cs="Courier New" w:eastAsia="Courier New"/>
-        </w:rPr>
-        <w:t xml:space="preserve">:class="tempClass(item.temp)"</w:t>
-      </w:r>
-      <w:r>
-        <w:rPr>
-          <w:rFonts w:ascii="Times New Roman" w:hAnsi="Times New Roman" w:cs="Times New Roman" w:eastAsia="Times New Roman"/>
-        </w:rPr>
-        <w:t xml:space="preserve"> memberi warna suhu: biru di bawah 27°C, oranye 27–31°C, merah 31°C ke atas. Baris jam sekarang (WIB) diberi latar biru muda lewat kelas </w:t>
-      </w:r>
-      <w:r>
-        <w:rPr>
-          <w:rFonts w:ascii="Courier New" w:hAnsi="Courier New" w:cs="Courier New" w:eastAsia="Courier New"/>
-        </w:rPr>
-        <w:t xml:space="preserve">now</w:t>
-      </w:r>
-      <w:r>
-        <w:rPr>
-          <w:rFonts w:ascii="Times New Roman" w:hAnsi="Times New Roman" w:cs="Times New Roman" w:eastAsia="Times New Roman"/>
-        </w:rPr>
-        <w:t xml:space="preserve">.</w:t>
+          <w:sz w:val="18"/>
+        </w:rPr>
+      </w:r>
+    </w:p>
+    <w:p>
+      <w:pPr>
+        <w:spacing w:after="120"/>
+      </w:pPr>
+      <w:r>
+        <w:rPr>
+          <w:rFonts w:ascii="Times New Roman" w:hAnsi="Times New Roman" w:cs="Times New Roman" w:eastAsia="Times New Roman"/>
+        </w:rPr>
+        <w:t>• v-for="d in days" membuat satu ion-segment-button (tab) untuk setiap tanggal. Event @ionChange mengganti selectedDay, sehingga computed filtered dan ringkasan ikut berubah otomatis.</w:t>
+      </w:r>
+    </w:p>
+    <w:p>
+      <w:pPr>
+        <w:spacing w:after="120"/>
+      </w:pPr>
+      <w:r>
+        <w:rPr>
+          <w:rFonts w:ascii="Times New Roman" w:hAnsi="Times New Roman" w:cs="Times New Roman" w:eastAsia="Times New Roman"/>
+        </w:rPr>
+        <w:t>• v-for="item in filtered" :key="item.time" membuat satu ion-item per jam. :key memakai time karena nilainya unik.</w:t>
+      </w:r>
+    </w:p>
+    <w:p>
+      <w:pPr>
+        <w:spacing w:after="120"/>
+      </w:pPr>
+      <w:r>
+        <w:rPr>
+          <w:rFonts w:ascii="Times New Roman" w:hAnsi="Times New Roman" w:cs="Times New Roman" w:eastAsia="Times New Roman"/>
+        </w:rPr>
+        <w:t>• Kiri menampilkan time lewat formatJam() (contoh 2026-10-24T05:00 menjadi 05:00 WIB); kanan menampilkan temperature_2m dalam ion-badge beserta satuan °C.</w:t>
+      </w:r>
+    </w:p>
+    <w:p>
+      <w:pPr>
+        <w:spacing w:after="120"/>
+      </w:pPr>
+      <w:r>
+        <w:rPr>
+          <w:rFonts w:ascii="Times New Roman" w:hAnsi="Times New Roman" w:cs="Times New Roman" w:eastAsia="Times New Roman"/>
+        </w:rPr>
+        <w:t>• :color="tempColor(item.temp)" memberi warna badge: biru di bawah 27 °C, oranye 27–31 °C, merah 31 °C ke atas. Baris jam sekarang (WIB) disorot dan diberi tanda "· sekarang".</w:t>
       </w:r>
     </w:p>
     <w:p>
@@ -5151,117 +2510,51 @@
           <w:rFonts w:ascii="Times New Roman" w:hAnsi="Times New Roman" w:cs="Times New Roman" w:eastAsia="Times New Roman"/>
           <w:b/>
         </w:rPr>
-        <w:t xml:space="preserve">6. Desain tampilan mobile</w:t>
-      </w:r>
-    </w:p>
-    <w:p>
-      <w:pPr>
-        <w:spacing w:after="120"/>
-      </w:pPr>
-      <w:r>
-        <w:rPr>
-          <w:rFonts w:ascii="Times New Roman" w:hAnsi="Times New Roman" w:cs="Times New Roman" w:eastAsia="Times New Roman"/>
-        </w:rPr>
-        <w:t xml:space="preserve">• </w:t>
-      </w:r>
-      <w:r>
-        <w:rPr>
-          <w:rFonts w:ascii="Courier New" w:hAnsi="Courier New" w:cs="Courier New" w:eastAsia="Courier New"/>
-        </w:rPr>
-        <w:t xml:space="preserve">&lt;meta name="viewport"&gt;</w:t>
-      </w:r>
-      <w:r>
-        <w:rPr>
-          <w:rFonts w:ascii="Times New Roman" w:hAnsi="Times New Roman" w:cs="Times New Roman" w:eastAsia="Times New Roman"/>
-        </w:rPr>
-        <w:t xml:space="preserve"> dan </w:t>
-      </w:r>
-      <w:r>
-        <w:rPr>
-          <w:rFonts w:ascii="Courier New" w:hAnsi="Courier New" w:cs="Courier New" w:eastAsia="Courier New"/>
-        </w:rPr>
-        <w:t xml:space="preserve">max-width: 480px</w:t>
-      </w:r>
-      <w:r>
-        <w:rPr>
-          <w:rFonts w:ascii="Times New Roman" w:hAnsi="Times New Roman" w:cs="Times New Roman" w:eastAsia="Times New Roman"/>
-        </w:rPr>
-        <w:t xml:space="preserve"> membuat tampilan pas di layar HP.</w:t>
-      </w:r>
-    </w:p>
-    <w:p>
-      <w:pPr>
-        <w:spacing w:after="120"/>
-      </w:pPr>
-      <w:r>
-        <w:rPr>
-          <w:rFonts w:ascii="Times New Roman" w:hAnsi="Times New Roman" w:cs="Times New Roman" w:eastAsia="Times New Roman"/>
-        </w:rPr>
-        <w:t xml:space="preserve">• </w:t>
-      </w:r>
-      <w:r>
-        <w:rPr>
-          <w:rFonts w:ascii="Times New Roman" w:hAnsi="Times New Roman" w:cs="Times New Roman" w:eastAsia="Times New Roman"/>
-        </w:rPr>
-        <w:t xml:space="preserve">Header gradasi biru berisi judul dan tiga kartu ringkasan (Min, Rata-rata, Max).</w:t>
-      </w:r>
-    </w:p>
-    <w:p>
-      <w:pPr>
-        <w:spacing w:after="120"/>
-      </w:pPr>
-      <w:r>
-        <w:rPr>
-          <w:rFonts w:ascii="Times New Roman" w:hAnsi="Times New Roman" w:cs="Times New Roman" w:eastAsia="Times New Roman"/>
-        </w:rPr>
-        <w:t xml:space="preserve">• </w:t>
-      </w:r>
-      <w:r>
-        <w:rPr>
-          <w:rFonts w:ascii="Times New Roman" w:hAnsi="Times New Roman" w:cs="Times New Roman" w:eastAsia="Times New Roman"/>
-        </w:rPr>
-        <w:t xml:space="preserve">Tombol tanggal berbentuk pill yang bisa digeser horizontal (</w:t>
-      </w:r>
-      <w:r>
-        <w:rPr>
-          <w:rFonts w:ascii="Courier New" w:hAnsi="Courier New" w:cs="Courier New" w:eastAsia="Courier New"/>
-        </w:rPr>
-        <w:t xml:space="preserve">overflow-x: auto</w:t>
-      </w:r>
-      <w:r>
-        <w:rPr>
-          <w:rFonts w:ascii="Times New Roman" w:hAnsi="Times New Roman" w:cs="Times New Roman" w:eastAsia="Times New Roman"/>
-        </w:rPr>
-        <w:t xml:space="preserve">).</w:t>
-      </w:r>
-    </w:p>
-    <w:p>
-      <w:pPr>
-        <w:spacing w:after="120"/>
-      </w:pPr>
-      <w:r>
-        <w:rPr>
-          <w:rFonts w:ascii="Times New Roman" w:hAnsi="Times New Roman" w:cs="Times New Roman" w:eastAsia="Times New Roman"/>
-        </w:rPr>
-        <w:t xml:space="preserve">• </w:t>
-      </w:r>
-      <w:r>
-        <w:rPr>
-          <w:rFonts w:ascii="Times New Roman" w:hAnsi="Times New Roman" w:cs="Times New Roman" w:eastAsia="Times New Roman"/>
-        </w:rPr>
-        <w:t xml:space="preserve">Header tabel </w:t>
-      </w:r>
-      <w:r>
-        <w:rPr>
-          <w:rFonts w:ascii="Courier New" w:hAnsi="Courier New" w:cs="Courier New" w:eastAsia="Courier New"/>
-        </w:rPr>
-        <w:t xml:space="preserve">position: sticky</w:t>
-      </w:r>
-      <w:r>
-        <w:rPr>
-          <w:rFonts w:ascii="Times New Roman" w:hAnsi="Times New Roman" w:cs="Times New Roman" w:eastAsia="Times New Roman"/>
-        </w:rPr>
-        <w:t xml:space="preserve"> sehingga judul kolom tetap terlihat saat tabel di-scroll.</w:t>
+        <w:t>6. Desain tampilan mobile (komponen Ionic)</w:t>
+      </w:r>
+    </w:p>
+    <w:p>
+      <w:pPr>
+        <w:spacing w:after="120"/>
+      </w:pPr>
+      <w:r>
+        <w:rPr>
+          <w:rFonts w:ascii="Times New Roman" w:hAnsi="Times New Roman" w:cs="Times New Roman" w:eastAsia="Times New Roman"/>
+        </w:rPr>
+        <w:t>• ion-header dan ion-toolbar berwarna primary sebagai judul aplikasi, ion-footer berisi identitas mahasiswa.</w:t>
+      </w:r>
+    </w:p>
+    <w:p>
+      <w:pPr>
+        <w:spacing w:after="120"/>
+      </w:pPr>
+      <w:r>
+        <w:rPr>
+          <w:rFonts w:ascii="Times New Roman" w:hAnsi="Times New Roman" w:cs="Times New Roman" w:eastAsia="Times New Roman"/>
+        </w:rPr>
+        <w:t>• ion-segment scrollable sebagai tab hari yang bisa digeser horizontal, ion-card untuk kartu ringkasan Min, Rata-rata, Max.</w:t>
+      </w:r>
+    </w:p>
+    <w:p>
+      <w:pPr>
+        <w:spacing w:after="120"/>
+      </w:pPr>
+      <w:r>
+        <w:rPr>
+          <w:rFonts w:ascii="Times New Roman" w:hAnsi="Times New Roman" w:cs="Times New Roman" w:eastAsia="Times New Roman"/>
+        </w:rPr>
+        <w:t>• ion-refresher untuk tarik ke bawah memuat ulang data, ion-spinner saat loading, dan pesan error dengan ion-button "Coba lagi".</w:t>
+      </w:r>
+    </w:p>
+    <w:p>
+      <w:pPr>
+        <w:spacing w:after="120"/>
+      </w:pPr>
+      <w:r>
+        <w:rPr>
+          <w:rFonts w:ascii="Times New Roman" w:hAnsi="Times New Roman" w:cs="Times New Roman" w:eastAsia="Times New Roman"/>
+        </w:rPr>
+        <w:t>• Komponen Ionic otomatis menyesuaikan gaya Android (Material Design) sehingga tampilan terasa seperti aplikasi native di HP.</w:t>
       </w:r>
     </w:p>
     <w:p>
@@ -5285,20 +2578,7 @@
         <w:rPr>
           <w:rFonts w:ascii="Times New Roman" w:hAnsi="Times New Roman" w:cs="Times New Roman" w:eastAsia="Times New Roman"/>
         </w:rPr>
-        <w:t xml:space="preserve">Aplikasi dijalankan di browser dengan ukuran layar 420 × 860 piksel (mode HP). Data diambil langsung dari API pada </w:t>
-      </w:r>
-      <w:r>
-        <w:rPr>
-          <w:rFonts w:ascii="Times New Roman" w:hAnsi="Times New Roman" w:cs="Times New Roman" w:eastAsia="Times New Roman"/>
-          <w:b/>
-        </w:rPr>
-        <w:t xml:space="preserve">Sabtu, 17 Oktober 2026 pukul 21.58 WIB</w:t>
-      </w:r>
-      <w:r>
-        <w:rPr>
-          <w:rFonts w:ascii="Times New Roman" w:hAnsi="Times New Roman" w:cs="Times New Roman" w:eastAsia="Times New Roman"/>
-        </w:rPr>
-        <w:t xml:space="preserve">.</w:t>
+        <w:t>Aplikasi dijalankan dengan ionic serve dan dibuka di browser dengan ukuran layar 412 × 860 piksel (mode HP); tampilan yang sama didapat di HP Android lewat ionic serve --external. Data diambil langsung dari API pada Sabtu, 24 Oktober 2026 pukul 09.47 WIB.</w:t>
       </w:r>
     </w:p>
     <w:p>
@@ -5309,7 +2589,7 @@
       <w:r>
         <w:drawing>
           <wp:inline>
-            <wp:extent cx="2700000" cy="5528571"/>
+            <wp:extent cx="2700000" cy="5635922"/>
             <wp:docPr id="654892931" name="Picture 654892931"/>
             <wp:cNvGraphicFramePr>
               <a:graphicFrameLocks noChangeAspect="1"/>
@@ -5322,7 +2602,7 @@
                     <pic:cNvPicPr/>
                   </pic:nvPicPr>
                   <pic:blipFill>
-                    <a:blip r:embed="rId11"/>
+                    <a:blip r:embed="rId13"/>
                     <a:stretch>
                       <a:fillRect/>
                     </a:stretch>
@@ -5330,7 +2610,7 @@
                   <pic:spPr>
                     <a:xfrm>
                       <a:off x="0" y="0"/>
-                      <a:ext cx="2700000" cy="5528571"/>
+                      <a:ext cx="2700000" cy="5635922"/>
                     </a:xfrm>
                     <a:prstGeom prst="rect"/>
                   </pic:spPr>
@@ -5350,7 +2630,7 @@
         <w:rPr>
           <w:rFonts w:ascii="Times New Roman" w:hAnsi="Times New Roman" w:cs="Times New Roman" w:eastAsia="Times New Roman"/>
         </w:rPr>
-        <w:t xml:space="preserve">Tampilan aplikasi di layar HP (420 × 860): ringkasan suhu dan daftar suhu per jam untuk Sab, 17 Okt.</w:t>
+        <w:t>Tampilan aplikasi Ionic di layar HP (412 × 860): tab hari, ringkasan suhu (Min 25,8°, Rata-rata 29,5°, Max 34,6°), dan daftar suhu per jam untuk Sab, 24 Okt. Baris 09:00 WIB disorot sebagai jam sekarang.</w:t>
       </w:r>
     </w:p>
     <w:p>
@@ -5361,7 +2641,7 @@
       <w:r>
         <w:drawing>
           <wp:inline>
-            <wp:extent cx="2300000" cy="6790476"/>
+            <wp:extent cx="2000000" cy="7572815"/>
             <wp:docPr id="654892932" name="Picture 654892932"/>
             <wp:cNvGraphicFramePr>
               <a:graphicFrameLocks noChangeAspect="1"/>
@@ -5374,7 +2654,7 @@
                     <pic:cNvPicPr/>
                   </pic:nvPicPr>
                   <pic:blipFill>
-                    <a:blip r:embed="rId12"/>
+                    <a:blip r:embed="rId14"/>
                     <a:stretch>
                       <a:fillRect/>
                     </a:stretch>
@@ -5382,7 +2662,7 @@
                   <pic:spPr>
                     <a:xfrm>
                       <a:off x="0" y="0"/>
-                      <a:ext cx="2300000" cy="6790476"/>
+                      <a:ext cx="2000000" cy="7572815"/>
                     </a:xfrm>
                     <a:prstGeom prst="rect"/>
                   </pic:spPr>
@@ -5402,7 +2682,7 @@
         <w:rPr>
           <w:rFonts w:ascii="Times New Roman" w:hAnsi="Times New Roman" w:cs="Times New Roman" w:eastAsia="Times New Roman"/>
         </w:rPr>
-        <w:t xml:space="preserve">Tampilan satu halaman penuh untuk 24 jam pada 17 Oktober 2026. Baris 21:00 WIB disorot sebagai jam saat aplikasi dibuka.</w:t>
+        <w:t>Tampilan satu halaman penuh untuk 24 jam pada 24 Oktober 2026 dengan warna badge suhu biru, oranye, dan merah.</w:t>
       </w:r>
     </w:p>
     <w:p>
@@ -5427,20 +2707,7 @@
         <w:rPr>
           <w:rFonts w:ascii="Times New Roman" w:hAnsi="Times New Roman" w:cs="Times New Roman" w:eastAsia="Times New Roman"/>
         </w:rPr>
-        <w:t xml:space="preserve">Data yang ditampilkan adalah </w:t>
-      </w:r>
-      <w:r>
-        <w:rPr>
-          <w:rFonts w:ascii="Times New Roman" w:hAnsi="Times New Roman" w:cs="Times New Roman" w:eastAsia="Times New Roman"/>
-          <w:b/>
-        </w:rPr>
-        <w:t xml:space="preserve">prakiraan</w:t>
-      </w:r>
-      <w:r>
-        <w:rPr>
-          <w:rFonts w:ascii="Times New Roman" w:hAnsi="Times New Roman" w:cs="Times New Roman" w:eastAsia="Times New Roman"/>
-        </w:rPr>
-        <w:t xml:space="preserve"> (forecast) Open-Meteo untuk Jakarta (titik -6,22; 106,78), sehingga angkanya bisa berubah jika aplikasi dibuka di waktu lain. Analisa di bawah memakai data yang diambil pada 17 Oktober 2026 pukul 21.58 WIB.</w:t>
+        <w:t>Data yang ditampilkan adalah prakiraan (forecast) Open-Meteo untuk Jakarta (titik -6,22; 106,78), sehingga angkanya berubah jika aplikasi dibuka di waktu lain (misalnya pada tangkapan layar di atas). Analisa di bawah memakai data yang diambil pada 17 Oktober 2026 pukul 21.58 WIB.</w:t>
       </w:r>
     </w:p>
     <w:tbl>
@@ -6945,167 +4212,29 @@
         <w:rPr>
           <w:rFonts w:ascii="Times New Roman" w:hAnsi="Times New Roman" w:cs="Times New Roman" w:eastAsia="Times New Roman"/>
         </w:rPr>
-        <w:t xml:space="preserve">• </w:t>
-      </w:r>
-      <w:r>
-        <w:rPr>
-          <w:rFonts w:ascii="Times New Roman" w:hAnsi="Times New Roman" w:cs="Times New Roman" w:eastAsia="Times New Roman"/>
-        </w:rPr>
-        <w:t xml:space="preserve">Aplikasi berhasil mengambil data dari API Open-Meteo secara langsung dan menampilkan field </w:t>
-      </w:r>
-      <w:r>
-        <w:rPr>
-          <w:rFonts w:ascii="Courier New" w:hAnsi="Courier New" w:cs="Courier New" w:eastAsia="Courier New"/>
-        </w:rPr>
-        <w:t xml:space="preserve">time</w:t>
-      </w:r>
-      <w:r>
-        <w:rPr>
-          <w:rFonts w:ascii="Times New Roman" w:hAnsi="Times New Roman" w:cs="Times New Roman" w:eastAsia="Times New Roman"/>
-        </w:rPr>
-        <w:t xml:space="preserve"> dan </w:t>
-      </w:r>
-      <w:r>
-        <w:rPr>
-          <w:rFonts w:ascii="Courier New" w:hAnsi="Courier New" w:cs="Courier New" w:eastAsia="Courier New"/>
-        </w:rPr>
-        <w:t xml:space="preserve">temperature_2m</w:t>
-      </w:r>
-      <w:r>
-        <w:rPr>
-          <w:rFonts w:ascii="Times New Roman" w:hAnsi="Times New Roman" w:cs="Times New Roman" w:eastAsia="Times New Roman"/>
-        </w:rPr>
-        <w:t xml:space="preserve"> dalam bentuk tabel yang mudah dibaca di layar HP.</w:t>
-      </w:r>
-    </w:p>
-    <w:p>
-      <w:pPr>
-        <w:spacing w:after="120"/>
-      </w:pPr>
-      <w:r>
-        <w:rPr>
-          <w:rFonts w:ascii="Times New Roman" w:hAnsi="Times New Roman" w:cs="Times New Roman" w:eastAsia="Times New Roman"/>
-        </w:rPr>
-        <w:t xml:space="preserve">• </w:t>
-      </w:r>
-      <w:r>
-        <w:rPr>
-          <w:rFonts w:ascii="Times New Roman" w:hAnsi="Times New Roman" w:cs="Times New Roman" w:eastAsia="Times New Roman"/>
-        </w:rPr>
-        <w:t xml:space="preserve">Seluruh 168 data (7 hari × 24 jam) bisa ditampilkan, dikelompokkan per hari dengan tombol tanggal, dan dilengkapi ringkasan min, rata-rata, dan max.</w:t>
-      </w:r>
-    </w:p>
-    <w:p>
-      <w:pPr>
-        <w:spacing w:after="120"/>
-      </w:pPr>
-      <w:r>
-        <w:rPr>
-          <w:rFonts w:ascii="Times New Roman" w:hAnsi="Times New Roman" w:cs="Times New Roman" w:eastAsia="Times New Roman"/>
-        </w:rPr>
-        <w:t xml:space="preserve">• </w:t>
-      </w:r>
-      <w:r>
-        <w:rPr>
-          <w:rFonts w:ascii="Times New Roman" w:hAnsi="Times New Roman" w:cs="Times New Roman" w:eastAsia="Times New Roman"/>
-        </w:rPr>
-        <w:t xml:space="preserve">Konsep Vue yang dipakai: </w:t>
-      </w:r>
-      <w:r>
-        <w:rPr>
-          <w:rFonts w:ascii="Courier New" w:hAnsi="Courier New" w:cs="Courier New" w:eastAsia="Courier New"/>
-        </w:rPr>
-        <w:t xml:space="preserve">ref</w:t>
-      </w:r>
-      <w:r>
-        <w:rPr>
-          <w:rFonts w:ascii="Times New Roman" w:hAnsi="Times New Roman" w:cs="Times New Roman" w:eastAsia="Times New Roman"/>
-        </w:rPr>
-        <w:t xml:space="preserve"> untuk state, </w:t>
-      </w:r>
-      <w:r>
-        <w:rPr>
-          <w:rFonts w:ascii="Courier New" w:hAnsi="Courier New" w:cs="Courier New" w:eastAsia="Courier New"/>
-        </w:rPr>
-        <w:t xml:space="preserve">fetch</w:t>
-      </w:r>
-      <w:r>
-        <w:rPr>
-          <w:rFonts w:ascii="Times New Roman" w:hAnsi="Times New Roman" w:cs="Times New Roman" w:eastAsia="Times New Roman"/>
-        </w:rPr>
-        <w:t xml:space="preserve"> + </w:t>
-      </w:r>
-      <w:r>
-        <w:rPr>
-          <w:rFonts w:ascii="Courier New" w:hAnsi="Courier New" w:cs="Courier New" w:eastAsia="Courier New"/>
-        </w:rPr>
-        <w:t xml:space="preserve">map</w:t>
-      </w:r>
-      <w:r>
-        <w:rPr>
-          <w:rFonts w:ascii="Times New Roman" w:hAnsi="Times New Roman" w:cs="Times New Roman" w:eastAsia="Times New Roman"/>
-        </w:rPr>
-        <w:t xml:space="preserve"> untuk mengolah data API, </w:t>
-      </w:r>
-      <w:r>
-        <w:rPr>
-          <w:rFonts w:ascii="Courier New" w:hAnsi="Courier New" w:cs="Courier New" w:eastAsia="Courier New"/>
-        </w:rPr>
-        <w:t xml:space="preserve">computed</w:t>
-      </w:r>
-      <w:r>
-        <w:rPr>
-          <w:rFonts w:ascii="Times New Roman" w:hAnsi="Times New Roman" w:cs="Times New Roman" w:eastAsia="Times New Roman"/>
-        </w:rPr>
-        <w:t xml:space="preserve"> untuk data turunan, </w:t>
-      </w:r>
-      <w:r>
-        <w:rPr>
-          <w:rFonts w:ascii="Courier New" w:hAnsi="Courier New" w:cs="Courier New" w:eastAsia="Courier New"/>
-        </w:rPr>
-        <w:t xml:space="preserve">v-for</w:t>
-      </w:r>
-      <w:r>
-        <w:rPr>
-          <w:rFonts w:ascii="Times New Roman" w:hAnsi="Times New Roman" w:cs="Times New Roman" w:eastAsia="Times New Roman"/>
-        </w:rPr>
-        <w:t xml:space="preserve">, </w:t>
-      </w:r>
-      <w:r>
-        <w:rPr>
-          <w:rFonts w:ascii="Courier New" w:hAnsi="Courier New" w:cs="Courier New" w:eastAsia="Courier New"/>
-        </w:rPr>
-        <w:t xml:space="preserve">v-if/v-else-if/v-else</w:t>
-      </w:r>
-      <w:r>
-        <w:rPr>
-          <w:rFonts w:ascii="Times New Roman" w:hAnsi="Times New Roman" w:cs="Times New Roman" w:eastAsia="Times New Roman"/>
-        </w:rPr>
-        <w:t xml:space="preserve">, </w:t>
-      </w:r>
-      <w:r>
-        <w:rPr>
-          <w:rFonts w:ascii="Courier New" w:hAnsi="Courier New" w:cs="Courier New" w:eastAsia="Courier New"/>
-        </w:rPr>
-        <w:t xml:space="preserve">:class</w:t>
-      </w:r>
-      <w:r>
-        <w:rPr>
-          <w:rFonts w:ascii="Times New Roman" w:hAnsi="Times New Roman" w:cs="Times New Roman" w:eastAsia="Times New Roman"/>
-        </w:rPr>
-        <w:t xml:space="preserve">, dan </w:t>
-      </w:r>
-      <w:r>
-        <w:rPr>
-          <w:rFonts w:ascii="Courier New" w:hAnsi="Courier New" w:cs="Courier New" w:eastAsia="Courier New"/>
-        </w:rPr>
-        <w:t xml:space="preserve">@click</w:t>
-      </w:r>
-      <w:r>
-        <w:rPr>
-          <w:rFonts w:ascii="Times New Roman" w:hAnsi="Times New Roman" w:cs="Times New Roman" w:eastAsia="Times New Roman"/>
-        </w:rPr>
-        <w:t xml:space="preserve"> untuk tampilan dan interaksi.</w:t>
+        <w:t>• Aplikasi Ionic + Vue berhasil mengambil data dari API Open-Meteo secara langsung dan menampilkan field time dan temperature_2m (dalam WIB) dalam bentuk list yang mudah dibaca di layar HP.</w:t>
+      </w:r>
+    </w:p>
+    <w:p>
+      <w:pPr>
+        <w:spacing w:after="120"/>
+      </w:pPr>
+      <w:r>
+        <w:rPr>
+          <w:rFonts w:ascii="Times New Roman" w:hAnsi="Times New Roman" w:cs="Times New Roman" w:eastAsia="Times New Roman"/>
+        </w:rPr>
+        <w:t>• Seluruh 168 data (7 hari × 24 jam) bisa ditampilkan, dikelompokkan per hari dengan tab ion-segment, dan dilengkapi ringkasan min, rata-rata, dan max. Satu kode yang sama berjalan di browser (ionic serve) dan di HP Android (ionic serve --external atau APK via Capacitor).</w:t>
+      </w:r>
+    </w:p>
+    <w:p>
+      <w:pPr>
+        <w:spacing w:after="120"/>
+      </w:pPr>
+      <w:r>
+        <w:rPr>
+          <w:rFonts w:ascii="Times New Roman" w:hAnsi="Times New Roman" w:cs="Times New Roman" w:eastAsia="Times New Roman"/>
+        </w:rPr>
+        <w:t>• Konsep yang dipakai: fetch + map untuk mengolah data API, computed untuk filter dan ringkasan, v-for untuk perulangan tab dan list, serta komponen Ionic (ion-segment, ion-list, ion-card, ion-badge, ion-refresher) untuk tampilan mobile.</w:t>
       </w:r>
     </w:p>
     <w:p>
@@ -7215,7 +4344,7 @@
           <w:rFonts w:ascii="Times New Roman" w:hAnsi="Times New Roman" w:cs="Times New Roman" w:eastAsia="Times New Roman"/>
           <w:color w:val="EE0000"/>
         </w:rPr>
-        <w:t xml:space="preserve">Tempel foto selfie bersama layar aplikasi cuaca yang sedang berjalan (browser mode HP atau VS Code) di sini.</w:t>
+        <w:t>Tempel foto selfie bersama layar aplikasi cuaca Ionic yang sedang berjalan (browser mode HP, HP Android, atau VS Code) di sini.</w:t>
       </w:r>
     </w:p>
     <w:p>
@@ -7354,6 +4483,17 @@
           <w:rFonts w:ascii="Times New Roman" w:hAnsi="Times New Roman" w:cs="Times New Roman" w:eastAsia="Times New Roman"/>
         </w:rPr>
         <w:t xml:space="preserve">. https://open-meteo.com/en/docs</w:t>
+      </w:r>
+    </w:p>
+    <w:p>
+      <w:pPr>
+        <w:spacing w:after="120"/>
+      </w:pPr>
+      <w:r>
+        <w:rPr>
+          <w:rFonts w:ascii="Times New Roman" w:hAnsi="Times New Roman" w:cs="Times New Roman" w:eastAsia="Times New Roman"/>
+        </w:rPr>
+        <w:t>Ionic Framework. (n.d.). Ionic Vue overview. https://ionicframework.com/docs/vue/overview</w:t>
       </w:r>
     </w:p>
     <w:p>

</xml_diff>